<commit_message>
docs: revise course report pagination, technical terms and validation results
- 修复封面评定成绩与评定人字段，清空模板示例成绩 100 与教师姓名
- 修复表 1-1 表题分页保护属性，与表格保持同一页面消除前页孤行
- 调整附录分节符与标题绑定，实现附录标题与 3x26 大表完整置于横向 A4 页面 (第 26 页)
- 修正第 6 章 Ricart-Agrawala 算法复杂度为 2(N-1) 条消息，并明确区分 Lamport 时钟与服务端权威定序
- 明确第 5 章 UUID 仅为资源标识不可替代权限核验，注明第 7 章等权 Quorum 与加权模型区别
- 收敛过细的游标与字段实现细节至概要设计层面，保留核心分布式架构权衡与课程 Chapter 1-8 理论映射
- 重新渲染精确对齐物理页码的关键页面截图，更新 validation-report.md，自动化验收测试 (23/23) 与单元测试 (6/6) 全量通过
</commit_message>
<xml_diff>
--- a/output/Distributed_Design_Report_Draft_v2.docx
+++ b/output/Distributed_Design_Report_Draft_v2.docx
@@ -1022,21 +1022,7 @@
             <w:pPr>
               <w:spacing w:before="46" w:after="46"/>
               <w:jc w:val="center"/>
-              <w:rPr>
-                <w:rFonts w:ascii="仿宋" w:eastAsia="仿宋" w:hAnsi="仿宋" w:hint="eastAsia"/>
-                <w:b/>
-                <w:color w:val="FF0000"/>
-                <w:sz w:val="24"/>
-              </w:rPr>
-            </w:pPr>
-            <w:r>
-              <w:rPr>
-                <w:rFonts w:hint="eastAsia"/>
-                <w:color w:val="FF0000"/>
-                <w:sz w:val="21"/>
-              </w:rPr>
-              <w:t>100</w:t>
-            </w:r>
+            </w:pPr>
           </w:p>
         </w:tc>
         <w:tc>
@@ -1072,33 +1058,7 @@
             <w:pPr>
               <w:spacing w:before="46" w:after="46"/>
               <w:jc w:val="center"/>
-              <w:rPr>
-                <w:rFonts w:ascii="仿宋" w:eastAsia="仿宋" w:hAnsi="仿宋" w:hint="eastAsia"/>
-                <w:b/>
-                <w:sz w:val="24"/>
-              </w:rPr>
-            </w:pPr>
-            <w:r>
-              <w:rPr>
-                <w:rFonts w:hint="eastAsia"/>
-                <w:sz w:val="21"/>
-              </w:rPr>
-              <w:t>宋</w:t>
-            </w:r>
-            <w:r>
-              <w:rPr>
-                <w:rFonts w:hint="eastAsia"/>
-                <w:sz w:val="21"/>
-              </w:rPr>
-              <w:t xml:space="preserve"> </w:t>
-            </w:r>
-            <w:r>
-              <w:rPr>
-                <w:rFonts w:hint="eastAsia"/>
-                <w:sz w:val="21"/>
-              </w:rPr>
-              <w:t>杰</w:t>
-            </w:r>
+            </w:pPr>
           </w:p>
         </w:tc>
       </w:tr>
@@ -1174,24 +1134,6 @@
               <w:spacing w:before="46" w:after="46"/>
               <w:jc w:val="center"/>
             </w:pPr>
-            <w:r>
-              <w:rPr>
-                <w:sz w:val="21"/>
-              </w:rPr>
-              <w:t>[</w:t>
-            </w:r>
-            <w:r>
-              <w:rPr>
-                <w:sz w:val="21"/>
-              </w:rPr>
-              <w:t>待教师填写</w:t>
-            </w:r>
-            <w:r>
-              <w:rPr>
-                <w:sz w:val="21"/>
-              </w:rPr>
-              <w:t>]</w:t>
-            </w:r>
           </w:p>
         </w:tc>
       </w:tr>
@@ -1729,6 +1671,8 @@
           <w:bCs w:val="0"/>
           <w:color w:val="auto"/>
           <w:kern w:val="2"/>
+          <w:sz w:val="21"/>
+          <w:szCs w:val="24"/>
           <w:lang w:eastAsia="zh-CN"/>
         </w:rPr>
         <w:id w:val="1154722329"/>
@@ -1741,8 +1685,6 @@
         <w:rPr>
           <w:rFonts w:eastAsia="宋体"/>
           <w:noProof/>
-          <w:sz w:val="21"/>
-          <w:szCs w:val="24"/>
         </w:rPr>
       </w:sdtEndPr>
       <w:sdtContent>
@@ -1794,7 +1736,7 @@
           <w:r>
             <w:fldChar w:fldCharType="separate"/>
           </w:r>
-          <w:hyperlink w:anchor="_Toc243664602" w:history="1">
+          <w:hyperlink w:anchor="_Toc243671680" w:history="1">
             <w:r>
               <w:rPr>
                 <w:rStyle w:val="ab"/>
@@ -1840,7 +1782,7 @@
                 <w:noProof/>
                 <w:webHidden/>
               </w:rPr>
-              <w:instrText>PAGEREF _Toc243664602 \h</w:instrText>
+              <w:instrText>PAGEREF _Toc243671680 \h</w:instrText>
             </w:r>
             <w:r>
               <w:rPr>
@@ -1896,7 +1838,7 @@
               <w14:ligatures w14:val="standardContextual"/>
             </w:rPr>
           </w:pPr>
-          <w:hyperlink w:anchor="_Toc243664603" w:history="1">
+          <w:hyperlink w:anchor="_Toc243671681" w:history="1">
             <w:r>
               <w:rPr>
                 <w:rStyle w:val="ab"/>
@@ -1942,7 +1884,7 @@
                 <w:noProof/>
                 <w:webHidden/>
               </w:rPr>
-              <w:instrText>PAGEREF _Toc243664603 \h</w:instrText>
+              <w:instrText>PAGEREF _Toc243671681 \h</w:instrText>
             </w:r>
             <w:r>
               <w:rPr>
@@ -1998,7 +1940,7 @@
               <w14:ligatures w14:val="standardContextual"/>
             </w:rPr>
           </w:pPr>
-          <w:hyperlink w:anchor="_Toc243664604" w:history="1">
+          <w:hyperlink w:anchor="_Toc243671682" w:history="1">
             <w:r>
               <w:rPr>
                 <w:rStyle w:val="ab"/>
@@ -2044,7 +1986,7 @@
                 <w:noProof/>
                 <w:webHidden/>
               </w:rPr>
-              <w:instrText>PAGEREF _Toc243664604 \h</w:instrText>
+              <w:instrText>PAGEREF _Toc243671682 \h</w:instrText>
             </w:r>
             <w:r>
               <w:rPr>
@@ -2100,7 +2042,7 @@
               <w14:ligatures w14:val="standardContextual"/>
             </w:rPr>
           </w:pPr>
-          <w:hyperlink w:anchor="_Toc243664605" w:history="1">
+          <w:hyperlink w:anchor="_Toc243671683" w:history="1">
             <w:r>
               <w:rPr>
                 <w:rStyle w:val="ab"/>
@@ -2146,7 +2088,7 @@
                 <w:noProof/>
                 <w:webHidden/>
               </w:rPr>
-              <w:instrText>PAGEREF _Toc243664605 \h</w:instrText>
+              <w:instrText>PAGEREF _Toc243671683 \h</w:instrText>
             </w:r>
             <w:r>
               <w:rPr>
@@ -2202,7 +2144,7 @@
               <w14:ligatures w14:val="standardContextual"/>
             </w:rPr>
           </w:pPr>
-          <w:hyperlink w:anchor="_Toc243664606" w:history="1">
+          <w:hyperlink w:anchor="_Toc243671684" w:history="1">
             <w:r>
               <w:rPr>
                 <w:rStyle w:val="ab"/>
@@ -2248,7 +2190,7 @@
                 <w:noProof/>
                 <w:webHidden/>
               </w:rPr>
-              <w:instrText>PAGEREF _Toc243664606 \h</w:instrText>
+              <w:instrText>PAGEREF _Toc243671684 \h</w:instrText>
             </w:r>
             <w:r>
               <w:rPr>
@@ -2304,7 +2246,7 @@
               <w14:ligatures w14:val="standardContextual"/>
             </w:rPr>
           </w:pPr>
-          <w:hyperlink w:anchor="_Toc243664607" w:history="1">
+          <w:hyperlink w:anchor="_Toc243671685" w:history="1">
             <w:r>
               <w:rPr>
                 <w:rStyle w:val="ab"/>
@@ -2350,7 +2292,7 @@
                 <w:noProof/>
                 <w:webHidden/>
               </w:rPr>
-              <w:instrText>PAGEREF _Toc243664607 \h</w:instrText>
+              <w:instrText>PAGEREF _Toc243671685 \h</w:instrText>
             </w:r>
             <w:r>
               <w:rPr>
@@ -2406,7 +2348,7 @@
               <w14:ligatures w14:val="standardContextual"/>
             </w:rPr>
           </w:pPr>
-          <w:hyperlink w:anchor="_Toc243664608" w:history="1">
+          <w:hyperlink w:anchor="_Toc243671686" w:history="1">
             <w:r>
               <w:rPr>
                 <w:rStyle w:val="ab"/>
@@ -2452,7 +2394,7 @@
                 <w:noProof/>
                 <w:webHidden/>
               </w:rPr>
-              <w:instrText>PAGEREF _Toc243664608 \h</w:instrText>
+              <w:instrText>PAGEREF _Toc243671686 \h</w:instrText>
             </w:r>
             <w:r>
               <w:rPr>
@@ -2508,7 +2450,7 @@
               <w14:ligatures w14:val="standardContextual"/>
             </w:rPr>
           </w:pPr>
-          <w:hyperlink w:anchor="_Toc243664609" w:history="1">
+          <w:hyperlink w:anchor="_Toc243671687" w:history="1">
             <w:r>
               <w:rPr>
                 <w:rStyle w:val="ab"/>
@@ -2554,7 +2496,7 @@
                 <w:noProof/>
                 <w:webHidden/>
               </w:rPr>
-              <w:instrText>PAGEREF _Toc243664609 \h</w:instrText>
+              <w:instrText>PAGEREF _Toc243671687 \h</w:instrText>
             </w:r>
             <w:r>
               <w:rPr>
@@ -2610,7 +2552,7 @@
               <w14:ligatures w14:val="standardContextual"/>
             </w:rPr>
           </w:pPr>
-          <w:hyperlink w:anchor="_Toc243664610" w:history="1">
+          <w:hyperlink w:anchor="_Toc243671688" w:history="1">
             <w:r>
               <w:rPr>
                 <w:rStyle w:val="ab"/>
@@ -2656,7 +2598,7 @@
                 <w:noProof/>
                 <w:webHidden/>
               </w:rPr>
-              <w:instrText>PAGEREF _Toc243664610 \h</w:instrText>
+              <w:instrText>PAGEREF _Toc243671688 \h</w:instrText>
             </w:r>
             <w:r>
               <w:rPr>
@@ -2686,7 +2628,7 @@
                 <w:noProof/>
                 <w:webHidden/>
               </w:rPr>
-              <w:t>7</w:t>
+              <w:t>8</w:t>
             </w:r>
             <w:r>
               <w:rPr>
@@ -2712,7 +2654,7 @@
               <w14:ligatures w14:val="standardContextual"/>
             </w:rPr>
           </w:pPr>
-          <w:hyperlink w:anchor="_Toc243664611" w:history="1">
+          <w:hyperlink w:anchor="_Toc243671689" w:history="1">
             <w:r>
               <w:rPr>
                 <w:rStyle w:val="ab"/>
@@ -2774,7 +2716,7 @@
                 <w:noProof/>
                 <w:webHidden/>
               </w:rPr>
-              <w:instrText>PAGEREF _Toc243664611 \h</w:instrText>
+              <w:instrText>PAGEREF _Toc243671689 \h</w:instrText>
             </w:r>
             <w:r>
               <w:rPr>
@@ -2804,7 +2746,7 @@
                 <w:noProof/>
                 <w:webHidden/>
               </w:rPr>
-              <w:t>7</w:t>
+              <w:t>8</w:t>
             </w:r>
             <w:r>
               <w:rPr>
@@ -2830,7 +2772,7 @@
               <w14:ligatures w14:val="standardContextual"/>
             </w:rPr>
           </w:pPr>
-          <w:hyperlink w:anchor="_Toc243664612" w:history="1">
+          <w:hyperlink w:anchor="_Toc243671690" w:history="1">
             <w:r>
               <w:rPr>
                 <w:rStyle w:val="ab"/>
@@ -2876,7 +2818,7 @@
                 <w:noProof/>
                 <w:webHidden/>
               </w:rPr>
-              <w:instrText>PAGEREF _Toc243664612 \h</w:instrText>
+              <w:instrText>PAGEREF _Toc243671690 \h</w:instrText>
             </w:r>
             <w:r>
               <w:rPr>
@@ -2906,7 +2848,7 @@
                 <w:noProof/>
                 <w:webHidden/>
               </w:rPr>
-              <w:t>8</w:t>
+              <w:t>9</w:t>
             </w:r>
             <w:r>
               <w:rPr>
@@ -2932,7 +2874,7 @@
               <w14:ligatures w14:val="standardContextual"/>
             </w:rPr>
           </w:pPr>
-          <w:hyperlink w:anchor="_Toc243664613" w:history="1">
+          <w:hyperlink w:anchor="_Toc243671691" w:history="1">
             <w:r>
               <w:rPr>
                 <w:rStyle w:val="ab"/>
@@ -3010,7 +2952,7 @@
                 <w:noProof/>
                 <w:webHidden/>
               </w:rPr>
-              <w:instrText>PAGEREF _Toc243664613 \h</w:instrText>
+              <w:instrText>PAGEREF _Toc243671691 \h</w:instrText>
             </w:r>
             <w:r>
               <w:rPr>
@@ -3066,7 +3008,7 @@
               <w14:ligatures w14:val="standardContextual"/>
             </w:rPr>
           </w:pPr>
-          <w:hyperlink w:anchor="_Toc243664614" w:history="1">
+          <w:hyperlink w:anchor="_Toc243671692" w:history="1">
             <w:r>
               <w:rPr>
                 <w:rStyle w:val="ab"/>
@@ -3112,7 +3054,7 @@
                 <w:noProof/>
                 <w:webHidden/>
               </w:rPr>
-              <w:instrText>PAGEREF _Toc243664614 \h</w:instrText>
+              <w:instrText>PAGEREF _Toc243671692 \h</w:instrText>
             </w:r>
             <w:r>
               <w:rPr>
@@ -3168,7 +3110,7 @@
               <w14:ligatures w14:val="standardContextual"/>
             </w:rPr>
           </w:pPr>
-          <w:hyperlink w:anchor="_Toc243664615" w:history="1">
+          <w:hyperlink w:anchor="_Toc243671693" w:history="1">
             <w:r>
               <w:rPr>
                 <w:rStyle w:val="ab"/>
@@ -3214,7 +3156,7 @@
                 <w:noProof/>
                 <w:webHidden/>
               </w:rPr>
-              <w:instrText>PAGEREF _Toc243664615 \h</w:instrText>
+              <w:instrText>PAGEREF _Toc243671693 \h</w:instrText>
             </w:r>
             <w:r>
               <w:rPr>
@@ -3270,7 +3212,7 @@
               <w14:ligatures w14:val="standardContextual"/>
             </w:rPr>
           </w:pPr>
-          <w:hyperlink w:anchor="_Toc243664616" w:history="1">
+          <w:hyperlink w:anchor="_Toc243671694" w:history="1">
             <w:r>
               <w:rPr>
                 <w:rStyle w:val="ab"/>
@@ -3316,7 +3258,7 @@
                 <w:noProof/>
                 <w:webHidden/>
               </w:rPr>
-              <w:instrText>PAGEREF _Toc243664616 \h</w:instrText>
+              <w:instrText>PAGEREF _Toc243671694 \h</w:instrText>
             </w:r>
             <w:r>
               <w:rPr>
@@ -3346,7 +3288,7 @@
                 <w:noProof/>
                 <w:webHidden/>
               </w:rPr>
-              <w:t>9</w:t>
+              <w:t>10</w:t>
             </w:r>
             <w:r>
               <w:rPr>
@@ -3372,7 +3314,7 @@
               <w14:ligatures w14:val="standardContextual"/>
             </w:rPr>
           </w:pPr>
-          <w:hyperlink w:anchor="_Toc243664617" w:history="1">
+          <w:hyperlink w:anchor="_Toc243671695" w:history="1">
             <w:r>
               <w:rPr>
                 <w:rStyle w:val="ab"/>
@@ -3418,7 +3360,7 @@
                 <w:noProof/>
                 <w:webHidden/>
               </w:rPr>
-              <w:instrText>PAGEREF _Toc243664617 \h</w:instrText>
+              <w:instrText>PAGEREF _Toc243671695 \h</w:instrText>
             </w:r>
             <w:r>
               <w:rPr>
@@ -3448,7 +3390,7 @@
                 <w:noProof/>
                 <w:webHidden/>
               </w:rPr>
-              <w:t>9</w:t>
+              <w:t>10</w:t>
             </w:r>
             <w:r>
               <w:rPr>
@@ -3474,7 +3416,7 @@
               <w14:ligatures w14:val="standardContextual"/>
             </w:rPr>
           </w:pPr>
-          <w:hyperlink w:anchor="_Toc243664618" w:history="1">
+          <w:hyperlink w:anchor="_Toc243671696" w:history="1">
             <w:r>
               <w:rPr>
                 <w:rStyle w:val="ab"/>
@@ -3520,7 +3462,7 @@
                 <w:noProof/>
                 <w:webHidden/>
               </w:rPr>
-              <w:instrText>PAGEREF _Toc243664618 \h</w:instrText>
+              <w:instrText>PAGEREF _Toc243671696 \h</w:instrText>
             </w:r>
             <w:r>
               <w:rPr>
@@ -3576,7 +3518,7 @@
               <w14:ligatures w14:val="standardContextual"/>
             </w:rPr>
           </w:pPr>
-          <w:hyperlink w:anchor="_Toc243664619" w:history="1">
+          <w:hyperlink w:anchor="_Toc243671697" w:history="1">
             <w:r>
               <w:rPr>
                 <w:rStyle w:val="ab"/>
@@ -3622,7 +3564,7 @@
                 <w:noProof/>
                 <w:webHidden/>
               </w:rPr>
-              <w:instrText>PAGEREF _Toc243664619 \h</w:instrText>
+              <w:instrText>PAGEREF _Toc243671697 \h</w:instrText>
             </w:r>
             <w:r>
               <w:rPr>
@@ -3652,7 +3594,7 @@
                 <w:noProof/>
                 <w:webHidden/>
               </w:rPr>
-              <w:t>10</w:t>
+              <w:t>11</w:t>
             </w:r>
             <w:r>
               <w:rPr>
@@ -3678,7 +3620,7 @@
               <w14:ligatures w14:val="standardContextual"/>
             </w:rPr>
           </w:pPr>
-          <w:hyperlink w:anchor="_Toc243664620" w:history="1">
+          <w:hyperlink w:anchor="_Toc243671698" w:history="1">
             <w:r>
               <w:rPr>
                 <w:rStyle w:val="ab"/>
@@ -3724,7 +3666,7 @@
                 <w:noProof/>
                 <w:webHidden/>
               </w:rPr>
-              <w:instrText>PAGEREF _Toc243664620 \h</w:instrText>
+              <w:instrText>PAGEREF _Toc243671698 \h</w:instrText>
             </w:r>
             <w:r>
               <w:rPr>
@@ -3780,7 +3722,7 @@
               <w14:ligatures w14:val="standardContextual"/>
             </w:rPr>
           </w:pPr>
-          <w:hyperlink w:anchor="_Toc243664621" w:history="1">
+          <w:hyperlink w:anchor="_Toc243671699" w:history="1">
             <w:r>
               <w:rPr>
                 <w:rStyle w:val="ab"/>
@@ -3826,7 +3768,7 @@
                 <w:noProof/>
                 <w:webHidden/>
               </w:rPr>
-              <w:instrText>PAGEREF _Toc243664621 \h</w:instrText>
+              <w:instrText>PAGEREF _Toc243671699 \h</w:instrText>
             </w:r>
             <w:r>
               <w:rPr>
@@ -3882,7 +3824,7 @@
               <w14:ligatures w14:val="standardContextual"/>
             </w:rPr>
           </w:pPr>
-          <w:hyperlink w:anchor="_Toc243664622" w:history="1">
+          <w:hyperlink w:anchor="_Toc243671700" w:history="1">
             <w:r>
               <w:rPr>
                 <w:rStyle w:val="ab"/>
@@ -3928,7 +3870,7 @@
                 <w:noProof/>
                 <w:webHidden/>
               </w:rPr>
-              <w:instrText>PAGEREF _Toc243664622 \h</w:instrText>
+              <w:instrText>PAGEREF _Toc243671700 \h</w:instrText>
             </w:r>
             <w:r>
               <w:rPr>
@@ -3984,7 +3926,7 @@
               <w14:ligatures w14:val="standardContextual"/>
             </w:rPr>
           </w:pPr>
-          <w:hyperlink w:anchor="_Toc243664623" w:history="1">
+          <w:hyperlink w:anchor="_Toc243671701" w:history="1">
             <w:r>
               <w:rPr>
                 <w:rStyle w:val="ab"/>
@@ -4046,7 +3988,7 @@
                 <w:noProof/>
                 <w:webHidden/>
               </w:rPr>
-              <w:instrText>PAGEREF _Toc243664623 \h</w:instrText>
+              <w:instrText>PAGEREF _Toc243671701 \h</w:instrText>
             </w:r>
             <w:r>
               <w:rPr>
@@ -4102,7 +4044,7 @@
               <w14:ligatures w14:val="standardContextual"/>
             </w:rPr>
           </w:pPr>
-          <w:hyperlink w:anchor="_Toc243664624" w:history="1">
+          <w:hyperlink w:anchor="_Toc243671702" w:history="1">
             <w:r>
               <w:rPr>
                 <w:rStyle w:val="ab"/>
@@ -4148,7 +4090,7 @@
                 <w:noProof/>
                 <w:webHidden/>
               </w:rPr>
-              <w:instrText>PAGEREF _Toc243664624 \h</w:instrText>
+              <w:instrText>PAGEREF _Toc243671702 \h</w:instrText>
             </w:r>
             <w:r>
               <w:rPr>
@@ -4204,7 +4146,7 @@
               <w14:ligatures w14:val="standardContextual"/>
             </w:rPr>
           </w:pPr>
-          <w:hyperlink w:anchor="_Toc243664625" w:history="1">
+          <w:hyperlink w:anchor="_Toc243671703" w:history="1">
             <w:r>
               <w:rPr>
                 <w:rStyle w:val="ab"/>
@@ -4266,7 +4208,7 @@
                 <w:noProof/>
                 <w:webHidden/>
               </w:rPr>
-              <w:instrText>PAGEREF _Toc243664625 \h</w:instrText>
+              <w:instrText>PAGEREF _Toc243671703 \h</w:instrText>
             </w:r>
             <w:r>
               <w:rPr>
@@ -4296,7 +4238,7 @@
                 <w:noProof/>
                 <w:webHidden/>
               </w:rPr>
-              <w:t>12</w:t>
+              <w:t>13</w:t>
             </w:r>
             <w:r>
               <w:rPr>
@@ -4322,7 +4264,7 @@
               <w14:ligatures w14:val="standardContextual"/>
             </w:rPr>
           </w:pPr>
-          <w:hyperlink w:anchor="_Toc243664626" w:history="1">
+          <w:hyperlink w:anchor="_Toc243671704" w:history="1">
             <w:r>
               <w:rPr>
                 <w:rStyle w:val="ab"/>
@@ -4368,7 +4310,7 @@
                 <w:noProof/>
                 <w:webHidden/>
               </w:rPr>
-              <w:instrText>PAGEREF _Toc243664626 \h</w:instrText>
+              <w:instrText>PAGEREF _Toc243671704 \h</w:instrText>
             </w:r>
             <w:r>
               <w:rPr>
@@ -4424,7 +4366,7 @@
               <w14:ligatures w14:val="standardContextual"/>
             </w:rPr>
           </w:pPr>
-          <w:hyperlink w:anchor="_Toc243664627" w:history="1">
+          <w:hyperlink w:anchor="_Toc243671705" w:history="1">
             <w:r>
               <w:rPr>
                 <w:rStyle w:val="ab"/>
@@ -4470,7 +4412,7 @@
                 <w:noProof/>
                 <w:webHidden/>
               </w:rPr>
-              <w:instrText>PAGEREF _Toc243664627 \h</w:instrText>
+              <w:instrText>PAGEREF _Toc243671705 \h</w:instrText>
             </w:r>
             <w:r>
               <w:rPr>
@@ -4526,7 +4468,7 @@
               <w14:ligatures w14:val="standardContextual"/>
             </w:rPr>
           </w:pPr>
-          <w:hyperlink w:anchor="_Toc243664628" w:history="1">
+          <w:hyperlink w:anchor="_Toc243671706" w:history="1">
             <w:r>
               <w:rPr>
                 <w:rStyle w:val="ab"/>
@@ -4572,7 +4514,7 @@
                 <w:noProof/>
                 <w:webHidden/>
               </w:rPr>
-              <w:instrText>PAGEREF _Toc243664628 \h</w:instrText>
+              <w:instrText>PAGEREF _Toc243671706 \h</w:instrText>
             </w:r>
             <w:r>
               <w:rPr>
@@ -4628,7 +4570,7 @@
               <w14:ligatures w14:val="standardContextual"/>
             </w:rPr>
           </w:pPr>
-          <w:hyperlink w:anchor="_Toc243664629" w:history="1">
+          <w:hyperlink w:anchor="_Toc243671707" w:history="1">
             <w:r>
               <w:rPr>
                 <w:rStyle w:val="ab"/>
@@ -4674,7 +4616,7 @@
                 <w:noProof/>
                 <w:webHidden/>
               </w:rPr>
-              <w:instrText>PAGEREF _Toc243664629 \h</w:instrText>
+              <w:instrText>PAGEREF _Toc243671707 \h</w:instrText>
             </w:r>
             <w:r>
               <w:rPr>
@@ -4730,7 +4672,7 @@
               <w14:ligatures w14:val="standardContextual"/>
             </w:rPr>
           </w:pPr>
-          <w:hyperlink w:anchor="_Toc243664630" w:history="1">
+          <w:hyperlink w:anchor="_Toc243671708" w:history="1">
             <w:r>
               <w:rPr>
                 <w:rStyle w:val="ab"/>
@@ -4776,7 +4718,7 @@
                 <w:noProof/>
                 <w:webHidden/>
               </w:rPr>
-              <w:instrText>PAGEREF _Toc243664630 \h</w:instrText>
+              <w:instrText>PAGEREF _Toc243671708 \h</w:instrText>
             </w:r>
             <w:r>
               <w:rPr>
@@ -4806,7 +4748,7 @@
                 <w:noProof/>
                 <w:webHidden/>
               </w:rPr>
-              <w:t>13</w:t>
+              <w:t>14</w:t>
             </w:r>
             <w:r>
               <w:rPr>
@@ -4832,7 +4774,7 @@
               <w14:ligatures w14:val="standardContextual"/>
             </w:rPr>
           </w:pPr>
-          <w:hyperlink w:anchor="_Toc243664631" w:history="1">
+          <w:hyperlink w:anchor="_Toc243671709" w:history="1">
             <w:r>
               <w:rPr>
                 <w:rStyle w:val="ab"/>
@@ -4894,7 +4836,7 @@
                 <w:noProof/>
                 <w:webHidden/>
               </w:rPr>
-              <w:instrText>PAGEREF _Toc243664631 \h</w:instrText>
+              <w:instrText>PAGEREF _Toc243671709 \h</w:instrText>
             </w:r>
             <w:r>
               <w:rPr>
@@ -4950,7 +4892,7 @@
               <w14:ligatures w14:val="standardContextual"/>
             </w:rPr>
           </w:pPr>
-          <w:hyperlink w:anchor="_Toc243664632" w:history="1">
+          <w:hyperlink w:anchor="_Toc243671710" w:history="1">
             <w:r>
               <w:rPr>
                 <w:rStyle w:val="ab"/>
@@ -4996,7 +4938,7 @@
                 <w:noProof/>
                 <w:webHidden/>
               </w:rPr>
-              <w:instrText>PAGEREF _Toc243664632 \h</w:instrText>
+              <w:instrText>PAGEREF _Toc243671710 \h</w:instrText>
             </w:r>
             <w:r>
               <w:rPr>
@@ -5026,7 +4968,7 @@
                 <w:noProof/>
                 <w:webHidden/>
               </w:rPr>
-              <w:t>14</w:t>
+              <w:t>15</w:t>
             </w:r>
             <w:r>
               <w:rPr>
@@ -5052,7 +4994,7 @@
               <w14:ligatures w14:val="standardContextual"/>
             </w:rPr>
           </w:pPr>
-          <w:hyperlink w:anchor="_Toc243664633" w:history="1">
+          <w:hyperlink w:anchor="_Toc243671711" w:history="1">
             <w:r>
               <w:rPr>
                 <w:rStyle w:val="ab"/>
@@ -5098,7 +5040,7 @@
                 <w:noProof/>
                 <w:webHidden/>
               </w:rPr>
-              <w:instrText>PAGEREF _Toc243664633 \h</w:instrText>
+              <w:instrText>PAGEREF _Toc243671711 \h</w:instrText>
             </w:r>
             <w:r>
               <w:rPr>
@@ -5128,7 +5070,7 @@
                 <w:noProof/>
                 <w:webHidden/>
               </w:rPr>
-              <w:t>14</w:t>
+              <w:t>15</w:t>
             </w:r>
             <w:r>
               <w:rPr>
@@ -5154,7 +5096,7 @@
               <w14:ligatures w14:val="standardContextual"/>
             </w:rPr>
           </w:pPr>
-          <w:hyperlink w:anchor="_Toc243664634" w:history="1">
+          <w:hyperlink w:anchor="_Toc243671712" w:history="1">
             <w:r>
               <w:rPr>
                 <w:rStyle w:val="ab"/>
@@ -5200,7 +5142,7 @@
                 <w:noProof/>
                 <w:webHidden/>
               </w:rPr>
-              <w:instrText>PAGEREF _Toc243664634 \h</w:instrText>
+              <w:instrText>PAGEREF _Toc243671712 \h</w:instrText>
             </w:r>
             <w:r>
               <w:rPr>
@@ -5256,7 +5198,7 @@
               <w14:ligatures w14:val="standardContextual"/>
             </w:rPr>
           </w:pPr>
-          <w:hyperlink w:anchor="_Toc243664635" w:history="1">
+          <w:hyperlink w:anchor="_Toc243671713" w:history="1">
             <w:r>
               <w:rPr>
                 <w:rStyle w:val="ab"/>
@@ -5302,7 +5244,7 @@
                 <w:noProof/>
                 <w:webHidden/>
               </w:rPr>
-              <w:instrText>PAGEREF _Toc243664635 \h</w:instrText>
+              <w:instrText>PAGEREF _Toc243671713 \h</w:instrText>
             </w:r>
             <w:r>
               <w:rPr>
@@ -5358,7 +5300,7 @@
               <w14:ligatures w14:val="standardContextual"/>
             </w:rPr>
           </w:pPr>
-          <w:hyperlink w:anchor="_Toc243664636" w:history="1">
+          <w:hyperlink w:anchor="_Toc243671714" w:history="1">
             <w:r>
               <w:rPr>
                 <w:rStyle w:val="ab"/>
@@ -5404,7 +5346,7 @@
                 <w:noProof/>
                 <w:webHidden/>
               </w:rPr>
-              <w:instrText>PAGEREF _Toc243664636 \h</w:instrText>
+              <w:instrText>PAGEREF _Toc243671714 \h</w:instrText>
             </w:r>
             <w:r>
               <w:rPr>
@@ -5460,7 +5402,7 @@
               <w14:ligatures w14:val="standardContextual"/>
             </w:rPr>
           </w:pPr>
-          <w:hyperlink w:anchor="_Toc243664637" w:history="1">
+          <w:hyperlink w:anchor="_Toc243671715" w:history="1">
             <w:r>
               <w:rPr>
                 <w:rStyle w:val="ab"/>
@@ -5506,7 +5448,7 @@
                 <w:noProof/>
                 <w:webHidden/>
               </w:rPr>
-              <w:instrText>PAGEREF _Toc243664637 \h</w:instrText>
+              <w:instrText>PAGEREF _Toc243671715 \h</w:instrText>
             </w:r>
             <w:r>
               <w:rPr>
@@ -5562,7 +5504,7 @@
               <w14:ligatures w14:val="standardContextual"/>
             </w:rPr>
           </w:pPr>
-          <w:hyperlink w:anchor="_Toc243664638" w:history="1">
+          <w:hyperlink w:anchor="_Toc243671716" w:history="1">
             <w:r>
               <w:rPr>
                 <w:rStyle w:val="ab"/>
@@ -5608,7 +5550,7 @@
                 <w:noProof/>
                 <w:webHidden/>
               </w:rPr>
-              <w:instrText>PAGEREF _Toc243664638 \h</w:instrText>
+              <w:instrText>PAGEREF _Toc243671716 \h</w:instrText>
             </w:r>
             <w:r>
               <w:rPr>
@@ -5638,7 +5580,7 @@
                 <w:noProof/>
                 <w:webHidden/>
               </w:rPr>
-              <w:t>17</w:t>
+              <w:t>18</w:t>
             </w:r>
             <w:r>
               <w:rPr>
@@ -5664,7 +5606,7 @@
               <w14:ligatures w14:val="standardContextual"/>
             </w:rPr>
           </w:pPr>
-          <w:hyperlink w:anchor="_Toc243664639" w:history="1">
+          <w:hyperlink w:anchor="_Toc243671717" w:history="1">
             <w:r>
               <w:rPr>
                 <w:rStyle w:val="ab"/>
@@ -5710,7 +5652,7 @@
                 <w:noProof/>
                 <w:webHidden/>
               </w:rPr>
-              <w:instrText>PAGEREF _Toc243664639 \h</w:instrText>
+              <w:instrText>PAGEREF _Toc243671717 \h</w:instrText>
             </w:r>
             <w:r>
               <w:rPr>
@@ -5740,7 +5682,7 @@
                 <w:noProof/>
                 <w:webHidden/>
               </w:rPr>
-              <w:t>17</w:t>
+              <w:t>18</w:t>
             </w:r>
             <w:r>
               <w:rPr>
@@ -5766,7 +5708,7 @@
               <w14:ligatures w14:val="standardContextual"/>
             </w:rPr>
           </w:pPr>
-          <w:hyperlink w:anchor="_Toc243664640" w:history="1">
+          <w:hyperlink w:anchor="_Toc243671718" w:history="1">
             <w:r>
               <w:rPr>
                 <w:rStyle w:val="ab"/>
@@ -5812,7 +5754,7 @@
                 <w:noProof/>
                 <w:webHidden/>
               </w:rPr>
-              <w:instrText>PAGEREF _Toc243664640 \h</w:instrText>
+              <w:instrText>PAGEREF _Toc243671718 \h</w:instrText>
             </w:r>
             <w:r>
               <w:rPr>
@@ -5842,7 +5784,7 @@
                 <w:noProof/>
                 <w:webHidden/>
               </w:rPr>
-              <w:t>17</w:t>
+              <w:t>18</w:t>
             </w:r>
             <w:r>
               <w:rPr>
@@ -5868,7 +5810,7 @@
               <w14:ligatures w14:val="standardContextual"/>
             </w:rPr>
           </w:pPr>
-          <w:hyperlink w:anchor="_Toc243664641" w:history="1">
+          <w:hyperlink w:anchor="_Toc243671719" w:history="1">
             <w:r>
               <w:rPr>
                 <w:rStyle w:val="ab"/>
@@ -5914,7 +5856,7 @@
                 <w:noProof/>
                 <w:webHidden/>
               </w:rPr>
-              <w:instrText>PAGEREF _Toc243664641 \h</w:instrText>
+              <w:instrText>PAGEREF _Toc243671719 \h</w:instrText>
             </w:r>
             <w:r>
               <w:rPr>
@@ -5944,7 +5886,7 @@
                 <w:noProof/>
                 <w:webHidden/>
               </w:rPr>
-              <w:t>17</w:t>
+              <w:t>18</w:t>
             </w:r>
             <w:r>
               <w:rPr>
@@ -5970,7 +5912,7 @@
               <w14:ligatures w14:val="standardContextual"/>
             </w:rPr>
           </w:pPr>
-          <w:hyperlink w:anchor="_Toc243664642" w:history="1">
+          <w:hyperlink w:anchor="_Toc243671720" w:history="1">
             <w:r>
               <w:rPr>
                 <w:rStyle w:val="ab"/>
@@ -6016,7 +5958,7 @@
                 <w:noProof/>
                 <w:webHidden/>
               </w:rPr>
-              <w:instrText>PAGEREF _Toc243664642 \h</w:instrText>
+              <w:instrText>PAGEREF _Toc243671720 \h</w:instrText>
             </w:r>
             <w:r>
               <w:rPr>
@@ -6046,7 +5988,7 @@
                 <w:noProof/>
                 <w:webHidden/>
               </w:rPr>
-              <w:t>18</w:t>
+              <w:t>19</w:t>
             </w:r>
             <w:r>
               <w:rPr>
@@ -6072,7 +6014,7 @@
               <w14:ligatures w14:val="standardContextual"/>
             </w:rPr>
           </w:pPr>
-          <w:hyperlink w:anchor="_Toc243664643" w:history="1">
+          <w:hyperlink w:anchor="_Toc243671721" w:history="1">
             <w:r>
               <w:rPr>
                 <w:rStyle w:val="ab"/>
@@ -6134,7 +6076,7 @@
                 <w:noProof/>
                 <w:webHidden/>
               </w:rPr>
-              <w:instrText>PAGEREF _Toc243664643 \h</w:instrText>
+              <w:instrText>PAGEREF _Toc243671721 \h</w:instrText>
             </w:r>
             <w:r>
               <w:rPr>
@@ -6164,7 +6106,7 @@
                 <w:noProof/>
                 <w:webHidden/>
               </w:rPr>
-              <w:t>19</w:t>
+              <w:t>20</w:t>
             </w:r>
             <w:r>
               <w:rPr>
@@ -6190,7 +6132,7 @@
               <w14:ligatures w14:val="standardContextual"/>
             </w:rPr>
           </w:pPr>
-          <w:hyperlink w:anchor="_Toc243664644" w:history="1">
+          <w:hyperlink w:anchor="_Toc243671722" w:history="1">
             <w:r>
               <w:rPr>
                 <w:rStyle w:val="ab"/>
@@ -6236,7 +6178,7 @@
                 <w:noProof/>
                 <w:webHidden/>
               </w:rPr>
-              <w:instrText>PAGEREF _Toc243664644 \h</w:instrText>
+              <w:instrText>PAGEREF _Toc243671722 \h</w:instrText>
             </w:r>
             <w:r>
               <w:rPr>
@@ -6266,7 +6208,7 @@
                 <w:noProof/>
                 <w:webHidden/>
               </w:rPr>
-              <w:t>19</w:t>
+              <w:t>20</w:t>
             </w:r>
             <w:r>
               <w:rPr>
@@ -6292,7 +6234,7 @@
               <w14:ligatures w14:val="standardContextual"/>
             </w:rPr>
           </w:pPr>
-          <w:hyperlink w:anchor="_Toc243664645" w:history="1">
+          <w:hyperlink w:anchor="_Toc243671723" w:history="1">
             <w:r>
               <w:rPr>
                 <w:rStyle w:val="ab"/>
@@ -6338,7 +6280,7 @@
                 <w:noProof/>
                 <w:webHidden/>
               </w:rPr>
-              <w:instrText>PAGEREF _Toc243664645 \h</w:instrText>
+              <w:instrText>PAGEREF _Toc243671723 \h</w:instrText>
             </w:r>
             <w:r>
               <w:rPr>
@@ -6368,7 +6310,7 @@
                 <w:noProof/>
                 <w:webHidden/>
               </w:rPr>
-              <w:t>19</w:t>
+              <w:t>20</w:t>
             </w:r>
             <w:r>
               <w:rPr>
@@ -6394,7 +6336,7 @@
               <w14:ligatures w14:val="standardContextual"/>
             </w:rPr>
           </w:pPr>
-          <w:hyperlink w:anchor="_Toc243664646" w:history="1">
+          <w:hyperlink w:anchor="_Toc243671724" w:history="1">
             <w:r>
               <w:rPr>
                 <w:rStyle w:val="ab"/>
@@ -6440,7 +6382,7 @@
                 <w:noProof/>
                 <w:webHidden/>
               </w:rPr>
-              <w:instrText>PAGEREF _Toc243664646 \h</w:instrText>
+              <w:instrText>PAGEREF _Toc243671724 \h</w:instrText>
             </w:r>
             <w:r>
               <w:rPr>
@@ -6470,7 +6412,7 @@
                 <w:noProof/>
                 <w:webHidden/>
               </w:rPr>
-              <w:t>19</w:t>
+              <w:t>21</w:t>
             </w:r>
             <w:r>
               <w:rPr>
@@ -6496,7 +6438,7 @@
               <w14:ligatures w14:val="standardContextual"/>
             </w:rPr>
           </w:pPr>
-          <w:hyperlink w:anchor="_Toc243664647" w:history="1">
+          <w:hyperlink w:anchor="_Toc243671725" w:history="1">
             <w:r>
               <w:rPr>
                 <w:rStyle w:val="ab"/>
@@ -6511,23 +6453,7 @@
                 <w:rFonts w:eastAsia="黑体"/>
                 <w:noProof/>
               </w:rPr>
-              <w:t>网络超时分析与基于</w:t>
-            </w:r>
-            <w:r>
-              <w:rPr>
-                <w:rStyle w:val="ab"/>
-                <w:rFonts w:eastAsia="黑体"/>
-                <w:noProof/>
-              </w:rPr>
-              <w:t xml:space="preserve"> operationId </w:t>
-            </w:r>
-            <w:r>
-              <w:rPr>
-                <w:rStyle w:val="ab"/>
-                <w:rFonts w:eastAsia="黑体"/>
-                <w:noProof/>
-              </w:rPr>
-              <w:t>的幂等重试机制</w:t>
+              <w:t>网络超时分析与基于操作唯一标识的幂等重试机制</w:t>
             </w:r>
             <w:r>
               <w:rPr>
@@ -6558,7 +6484,7 @@
                 <w:noProof/>
                 <w:webHidden/>
               </w:rPr>
-              <w:instrText>PAGEREF _Toc243664647 \h</w:instrText>
+              <w:instrText>PAGEREF _Toc243671725 \h</w:instrText>
             </w:r>
             <w:r>
               <w:rPr>
@@ -6588,7 +6514,7 @@
                 <w:noProof/>
                 <w:webHidden/>
               </w:rPr>
-              <w:t>19</w:t>
+              <w:t>21</w:t>
             </w:r>
             <w:r>
               <w:rPr>
@@ -6614,7 +6540,7 @@
               <w14:ligatures w14:val="standardContextual"/>
             </w:rPr>
           </w:pPr>
-          <w:hyperlink w:anchor="_Toc243664648" w:history="1">
+          <w:hyperlink w:anchor="_Toc243671726" w:history="1">
             <w:r>
               <w:rPr>
                 <w:rStyle w:val="ab"/>
@@ -6676,7 +6602,7 @@
                 <w:noProof/>
                 <w:webHidden/>
               </w:rPr>
-              <w:instrText>PAGEREF _Toc243664648 \h</w:instrText>
+              <w:instrText>PAGEREF _Toc243671726 \h</w:instrText>
             </w:r>
             <w:r>
               <w:rPr>
@@ -6706,7 +6632,7 @@
                 <w:noProof/>
                 <w:webHidden/>
               </w:rPr>
-              <w:t>20</w:t>
+              <w:t>21</w:t>
             </w:r>
             <w:r>
               <w:rPr>
@@ -6732,7 +6658,7 @@
               <w14:ligatures w14:val="standardContextual"/>
             </w:rPr>
           </w:pPr>
-          <w:hyperlink w:anchor="_Toc243664649" w:history="1">
+          <w:hyperlink w:anchor="_Toc243671727" w:history="1">
             <w:r>
               <w:rPr>
                 <w:rStyle w:val="ab"/>
@@ -6778,7 +6704,7 @@
                 <w:noProof/>
                 <w:webHidden/>
               </w:rPr>
-              <w:instrText>PAGEREF _Toc243664649 \h</w:instrText>
+              <w:instrText>PAGEREF _Toc243671727 \h</w:instrText>
             </w:r>
             <w:r>
               <w:rPr>
@@ -6808,7 +6734,7 @@
                 <w:noProof/>
                 <w:webHidden/>
               </w:rPr>
-              <w:t>21</w:t>
+              <w:t>22</w:t>
             </w:r>
             <w:r>
               <w:rPr>
@@ -6834,7 +6760,7 @@
               <w14:ligatures w14:val="standardContextual"/>
             </w:rPr>
           </w:pPr>
-          <w:hyperlink w:anchor="_Toc243664650" w:history="1">
+          <w:hyperlink w:anchor="_Toc243671728" w:history="1">
             <w:r>
               <w:rPr>
                 <w:rStyle w:val="ab"/>
@@ -6896,7 +6822,7 @@
                 <w:noProof/>
                 <w:webHidden/>
               </w:rPr>
-              <w:instrText>PAGEREF _Toc243664650 \h</w:instrText>
+              <w:instrText>PAGEREF _Toc243671728 \h</w:instrText>
             </w:r>
             <w:r>
               <w:rPr>
@@ -6926,7 +6852,7 @@
                 <w:noProof/>
                 <w:webHidden/>
               </w:rPr>
-              <w:t>21</w:t>
+              <w:t>22</w:t>
             </w:r>
             <w:r>
               <w:rPr>
@@ -6952,7 +6878,7 @@
               <w14:ligatures w14:val="standardContextual"/>
             </w:rPr>
           </w:pPr>
-          <w:hyperlink w:anchor="_Toc243664651" w:history="1">
+          <w:hyperlink w:anchor="_Toc243671729" w:history="1">
             <w:r>
               <w:rPr>
                 <w:rStyle w:val="ab"/>
@@ -6998,7 +6924,7 @@
                 <w:noProof/>
                 <w:webHidden/>
               </w:rPr>
-              <w:instrText>PAGEREF _Toc243664651 \h</w:instrText>
+              <w:instrText>PAGEREF _Toc243671729 \h</w:instrText>
             </w:r>
             <w:r>
               <w:rPr>
@@ -7028,7 +6954,7 @@
                 <w:noProof/>
                 <w:webHidden/>
               </w:rPr>
-              <w:t>22</w:t>
+              <w:t>23</w:t>
             </w:r>
             <w:r>
               <w:rPr>
@@ -7054,7 +6980,7 @@
               <w14:ligatures w14:val="standardContextual"/>
             </w:rPr>
           </w:pPr>
-          <w:hyperlink w:anchor="_Toc243664652" w:history="1">
+          <w:hyperlink w:anchor="_Toc243671730" w:history="1">
             <w:r>
               <w:rPr>
                 <w:rStyle w:val="ab"/>
@@ -7100,7 +7026,7 @@
                 <w:noProof/>
                 <w:webHidden/>
               </w:rPr>
-              <w:instrText>PAGEREF _Toc243664652 \h</w:instrText>
+              <w:instrText>PAGEREF _Toc243671730 \h</w:instrText>
             </w:r>
             <w:r>
               <w:rPr>
@@ -7130,7 +7056,7 @@
                 <w:noProof/>
                 <w:webHidden/>
               </w:rPr>
-              <w:t>22</w:t>
+              <w:t>23</w:t>
             </w:r>
             <w:r>
               <w:rPr>
@@ -7156,7 +7082,7 @@
               <w14:ligatures w14:val="standardContextual"/>
             </w:rPr>
           </w:pPr>
-          <w:hyperlink w:anchor="_Toc243664653" w:history="1">
+          <w:hyperlink w:anchor="_Toc243671731" w:history="1">
             <w:r>
               <w:rPr>
                 <w:rStyle w:val="ab"/>
@@ -7202,7 +7128,7 @@
                 <w:noProof/>
                 <w:webHidden/>
               </w:rPr>
-              <w:instrText>PAGEREF _Toc243664653 \h</w:instrText>
+              <w:instrText>PAGEREF _Toc243671731 \h</w:instrText>
             </w:r>
             <w:r>
               <w:rPr>
@@ -7232,7 +7158,7 @@
                 <w:noProof/>
                 <w:webHidden/>
               </w:rPr>
-              <w:t>23</w:t>
+              <w:t>24</w:t>
             </w:r>
             <w:r>
               <w:rPr>
@@ -7258,7 +7184,7 @@
               <w14:ligatures w14:val="standardContextual"/>
             </w:rPr>
           </w:pPr>
-          <w:hyperlink w:anchor="_Toc243664654" w:history="1">
+          <w:hyperlink w:anchor="_Toc243671732" w:history="1">
             <w:r>
               <w:rPr>
                 <w:rStyle w:val="ab"/>
@@ -7304,7 +7230,7 @@
                 <w:noProof/>
                 <w:webHidden/>
               </w:rPr>
-              <w:instrText>PAGEREF _Toc243664654 \h</w:instrText>
+              <w:instrText>PAGEREF _Toc243671732 \h</w:instrText>
             </w:r>
             <w:r>
               <w:rPr>
@@ -7334,7 +7260,7 @@
                 <w:noProof/>
                 <w:webHidden/>
               </w:rPr>
-              <w:t>23</w:t>
+              <w:t>24</w:t>
             </w:r>
             <w:r>
               <w:rPr>
@@ -7360,7 +7286,7 @@
               <w14:ligatures w14:val="standardContextual"/>
             </w:rPr>
           </w:pPr>
-          <w:hyperlink w:anchor="_Toc243664655" w:history="1">
+          <w:hyperlink w:anchor="_Toc243671733" w:history="1">
             <w:r>
               <w:rPr>
                 <w:rStyle w:val="ab"/>
@@ -7398,7 +7324,7 @@
                 <w:noProof/>
                 <w:webHidden/>
               </w:rPr>
-              <w:instrText>PAGEREF _Toc243664655 \h</w:instrText>
+              <w:instrText>PAGEREF _Toc243671733 \h</w:instrText>
             </w:r>
             <w:r>
               <w:rPr>
@@ -7428,7 +7354,7 @@
                 <w:noProof/>
                 <w:webHidden/>
               </w:rPr>
-              <w:t>24</w:t>
+              <w:t>25</w:t>
             </w:r>
             <w:r>
               <w:rPr>
@@ -7454,7 +7380,7 @@
               <w14:ligatures w14:val="standardContextual"/>
             </w:rPr>
           </w:pPr>
-          <w:hyperlink w:anchor="_Toc243664656" w:history="1">
+          <w:hyperlink w:anchor="_Toc243671734" w:history="1">
             <w:r>
               <w:rPr>
                 <w:rStyle w:val="ab"/>
@@ -7517,7 +7443,7 @@
                 <w:noProof/>
                 <w:webHidden/>
               </w:rPr>
-              <w:instrText>PAGEREF _Toc243664656 \h</w:instrText>
+              <w:instrText>PAGEREF _Toc243671734 \h</w:instrText>
             </w:r>
             <w:r>
               <w:rPr>
@@ -7547,7 +7473,7 @@
                 <w:noProof/>
                 <w:webHidden/>
               </w:rPr>
-              <w:t>24</w:t>
+              <w:t>26</w:t>
             </w:r>
             <w:r>
               <w:rPr>
@@ -7588,7 +7514,7 @@
         <w:spacing w:before="46" w:after="46" w:line="240" w:lineRule="auto"/>
         <w:jc w:val="left"/>
       </w:pPr>
-      <w:bookmarkStart w:id="0" w:name="_Toc243664602"/>
+      <w:bookmarkStart w:id="0" w:name="_Toc243671680"/>
       <w:r>
         <w:rPr>
           <w:rFonts w:eastAsia="黑体"/>
@@ -7612,7 +7538,7 @@
         <w:spacing w:before="46" w:after="46" w:line="240" w:lineRule="auto"/>
         <w:jc w:val="left"/>
       </w:pPr>
-      <w:bookmarkStart w:id="1" w:name="_Toc243664603"/>
+      <w:bookmarkStart w:id="1" w:name="_Toc243671681"/>
       <w:r>
         <w:rPr>
           <w:rFonts w:ascii="Times New Roman" w:eastAsia="黑体" w:hAnsi="Times New Roman" w:cs="Times New Roman"/>
@@ -7745,7 +7671,7 @@
         <w:spacing w:before="46" w:after="46" w:line="240" w:lineRule="auto"/>
         <w:jc w:val="left"/>
       </w:pPr>
-      <w:bookmarkStart w:id="2" w:name="_Toc243664604"/>
+      <w:bookmarkStart w:id="2" w:name="_Toc243671682"/>
       <w:r>
         <w:rPr>
           <w:rFonts w:ascii="Times New Roman" w:eastAsia="黑体" w:hAnsi="Times New Roman" w:cs="Times New Roman"/>
@@ -7893,7 +7819,7 @@
         <w:spacing w:before="46" w:after="46" w:line="240" w:lineRule="auto"/>
         <w:jc w:val="left"/>
       </w:pPr>
-      <w:bookmarkStart w:id="3" w:name="_Toc243664605"/>
+      <w:bookmarkStart w:id="3" w:name="_Toc243671683"/>
       <w:r>
         <w:rPr>
           <w:rFonts w:ascii="Times New Roman" w:eastAsia="黑体" w:hAnsi="Times New Roman" w:cs="Times New Roman"/>
@@ -7939,6 +7865,7 @@
     </w:p>
     <w:p>
       <w:pPr>
+        <w:keepNext/>
         <w:spacing w:before="46" w:after="46"/>
         <w:jc w:val="center"/>
       </w:pPr>
@@ -7947,6 +7874,7 @@
           <w:rFonts w:eastAsia="仿宋"/>
           <w:b/>
         </w:rPr>
+        <w:lastRenderedPageBreak/>
         <w:t>表</w:t>
       </w:r>
       <w:r>
@@ -7982,6 +7910,8 @@
       </w:tblGrid>
       <w:tr>
         <w:trPr>
+          <w:cantSplit/>
+          <w:tblHeader/>
           <w:jc w:val="center"/>
         </w:trPr>
         <w:tc>
@@ -8001,7 +7931,6 @@
                 <w:b/>
                 <w:sz w:val="19"/>
               </w:rPr>
-              <w:lastRenderedPageBreak/>
               <w:t>功能编号</w:t>
             </w:r>
           </w:p>
@@ -8072,6 +8001,7 @@
       </w:tr>
       <w:tr>
         <w:trPr>
+          <w:cantSplit/>
           <w:jc w:val="center"/>
         </w:trPr>
         <w:tc>
@@ -8145,6 +8075,7 @@
       </w:tr>
       <w:tr>
         <w:trPr>
+          <w:cantSplit/>
           <w:jc w:val="center"/>
         </w:trPr>
         <w:tc>
@@ -8218,6 +8149,7 @@
       </w:tr>
       <w:tr>
         <w:trPr>
+          <w:cantSplit/>
           <w:jc w:val="center"/>
         </w:trPr>
         <w:tc>
@@ -8291,6 +8223,7 @@
       </w:tr>
       <w:tr>
         <w:trPr>
+          <w:cantSplit/>
           <w:jc w:val="center"/>
         </w:trPr>
         <w:tc>
@@ -8364,6 +8297,7 @@
       </w:tr>
       <w:tr>
         <w:trPr>
+          <w:cantSplit/>
           <w:jc w:val="center"/>
         </w:trPr>
         <w:tc>
@@ -8437,6 +8371,7 @@
       </w:tr>
       <w:tr>
         <w:trPr>
+          <w:cantSplit/>
           <w:jc w:val="center"/>
         </w:trPr>
         <w:tc>
@@ -8510,6 +8445,7 @@
       </w:tr>
       <w:tr>
         <w:trPr>
+          <w:cantSplit/>
           <w:jc w:val="center"/>
         </w:trPr>
         <w:tc>
@@ -8593,7 +8529,7 @@
         <w:spacing w:before="46" w:after="46" w:line="240" w:lineRule="auto"/>
         <w:jc w:val="left"/>
       </w:pPr>
-      <w:bookmarkStart w:id="4" w:name="_Toc243664606"/>
+      <w:bookmarkStart w:id="4" w:name="_Toc243671684"/>
       <w:r>
         <w:rPr>
           <w:rFonts w:ascii="Times New Roman" w:eastAsia="黑体" w:hAnsi="Times New Roman" w:cs="Times New Roman"/>
@@ -8642,6 +8578,7 @@
     </w:p>
     <w:p>
       <w:pPr>
+        <w:keepNext/>
         <w:spacing w:before="46" w:after="46"/>
         <w:jc w:val="center"/>
       </w:pPr>
@@ -8685,6 +8622,8 @@
       </w:tblGrid>
       <w:tr>
         <w:trPr>
+          <w:cantSplit/>
+          <w:tblHeader/>
           <w:jc w:val="center"/>
         </w:trPr>
         <w:tc>
@@ -8788,6 +8727,7 @@
       </w:tr>
       <w:tr>
         <w:trPr>
+          <w:cantSplit/>
           <w:jc w:val="center"/>
         </w:trPr>
         <w:tc>
@@ -8897,6 +8837,7 @@
       </w:tr>
       <w:tr>
         <w:trPr>
+          <w:cantSplit/>
           <w:jc w:val="center"/>
         </w:trPr>
         <w:tc>
@@ -8994,6 +8935,7 @@
       </w:tr>
       <w:tr>
         <w:trPr>
+          <w:cantSplit/>
           <w:jc w:val="center"/>
         </w:trPr>
         <w:tc>
@@ -9079,6 +9021,7 @@
       </w:tr>
       <w:tr>
         <w:trPr>
+          <w:cantSplit/>
           <w:jc w:val="center"/>
         </w:trPr>
         <w:tc>
@@ -9200,6 +9143,7 @@
       </w:tr>
       <w:tr>
         <w:trPr>
+          <w:cantSplit/>
           <w:jc w:val="center"/>
         </w:trPr>
         <w:tc>
@@ -9215,6 +9159,7 @@
               <w:rPr>
                 <w:sz w:val="18"/>
               </w:rPr>
+              <w:lastRenderedPageBreak/>
               <w:t>网络断线恢复时间</w:t>
             </w:r>
           </w:p>
@@ -9322,7 +9267,7 @@
         <w:spacing w:before="46" w:after="46" w:line="240" w:lineRule="auto"/>
         <w:jc w:val="left"/>
       </w:pPr>
-      <w:bookmarkStart w:id="5" w:name="_Toc243664607"/>
+      <w:bookmarkStart w:id="5" w:name="_Toc243671685"/>
       <w:r>
         <w:rPr>
           <w:rFonts w:ascii="Times New Roman" w:eastAsia="黑体" w:hAnsi="Times New Roman" w:cs="Times New Roman"/>
@@ -9464,7 +9409,7 @@
         <w:spacing w:before="46" w:after="46" w:line="240" w:lineRule="auto"/>
         <w:jc w:val="left"/>
       </w:pPr>
-      <w:bookmarkStart w:id="6" w:name="_Toc243664608"/>
+      <w:bookmarkStart w:id="6" w:name="_Toc243671686"/>
       <w:r>
         <w:rPr>
           <w:rFonts w:eastAsia="黑体"/>
@@ -9487,7 +9432,7 @@
         <w:spacing w:before="46" w:after="46" w:line="240" w:lineRule="auto"/>
         <w:jc w:val="left"/>
       </w:pPr>
-      <w:bookmarkStart w:id="7" w:name="_Toc243664609"/>
+      <w:bookmarkStart w:id="7" w:name="_Toc243671687"/>
       <w:r>
         <w:rPr>
           <w:rFonts w:ascii="Times New Roman" w:eastAsia="黑体" w:hAnsi="Times New Roman" w:cs="Times New Roman"/>
@@ -9567,7 +9512,11 @@
         <w:t xml:space="preserve"> 100 </w:t>
       </w:r>
       <w:r>
-        <w:t>个活跃房间的设计假设下，不同房间的操作数据完全独立，架构应天然支持房间间的并行隔离，允许通过水平扩展服务能力满足规模需求。</w:t>
+        <w:t>个活跃房间的设计假设下，不同房间的操作数据完全独立，架构应天然支持房间间的并行隔离，允许通过水平扩展服务能力满足</w:t>
+      </w:r>
+      <w:r>
+        <w:lastRenderedPageBreak/>
+        <w:t>规模需求。</w:t>
       </w:r>
     </w:p>
     <w:p>
@@ -9576,7 +9525,7 @@
         <w:spacing w:before="46" w:after="46" w:line="240" w:lineRule="auto"/>
         <w:jc w:val="left"/>
       </w:pPr>
-      <w:bookmarkStart w:id="8" w:name="_Toc243664610"/>
+      <w:bookmarkStart w:id="8" w:name="_Toc243671688"/>
       <w:r>
         <w:rPr>
           <w:rFonts w:ascii="Times New Roman" w:eastAsia="黑体" w:hAnsi="Times New Roman" w:cs="Times New Roman"/>
@@ -9599,7 +9548,7 @@
         <w:spacing w:line="240" w:lineRule="auto"/>
         <w:jc w:val="left"/>
       </w:pPr>
-      <w:bookmarkStart w:id="9" w:name="_Toc243664611"/>
+      <w:bookmarkStart w:id="9" w:name="_Toc243671689"/>
       <w:r>
         <w:rPr>
           <w:rFonts w:eastAsia="黑体"/>
@@ -9658,15 +9607,7 @@
           <w:noProof/>
           <w:vertAlign w:val="superscript"/>
         </w:rPr>
-        <w:t xml:space="preserve">[1, </w:t>
-      </w:r>
-      <w:r>
-        <w:rPr>
-          <w:noProof/>
-          <w:vertAlign w:val="superscript"/>
-        </w:rPr>
-        <w:lastRenderedPageBreak/>
-        <w:t>7]</w:t>
+        <w:t>[1, 7]</w:t>
       </w:r>
       <w:r>
         <w:t>。系统整体划分为客户端层、接入层、应用与房间协作服务层、持久化与基础设施层四个逻辑层次。系统总体逻辑架构如图</w:t>
@@ -9680,6 +9621,7 @@
     </w:p>
     <w:p>
       <w:pPr>
+        <w:keepNext/>
         <w:spacing w:before="46" w:after="46"/>
         <w:jc w:val="center"/>
       </w:pPr>
@@ -9688,7 +9630,7 @@
           <w:noProof/>
         </w:rPr>
         <w:drawing>
-          <wp:inline distT="0" distB="0" distL="0" distR="0">
+          <wp:inline distT="0" distB="0" distL="0" distR="0" wp14:anchorId="425CFF18" wp14:editId="04B30F6B">
             <wp:extent cx="5486400" cy="3713018"/>
             <wp:effectExtent l="0" t="0" r="0" b="0"/>
             <wp:docPr id="2" name="Picture 2"/>
@@ -9856,12 +9798,13 @@
         <w:spacing w:line="240" w:lineRule="auto"/>
         <w:jc w:val="left"/>
       </w:pPr>
-      <w:bookmarkStart w:id="10" w:name="_Toc243664612"/>
+      <w:bookmarkStart w:id="10" w:name="_Toc243671690"/>
       <w:r>
         <w:rPr>
           <w:rFonts w:eastAsia="黑体"/>
           <w:sz w:val="24"/>
         </w:rPr>
+        <w:lastRenderedPageBreak/>
         <w:t xml:space="preserve">(2) </w:t>
       </w:r>
       <w:r>
@@ -9918,13 +9861,12 @@
         <w:spacing w:line="240" w:lineRule="auto"/>
         <w:jc w:val="left"/>
       </w:pPr>
-      <w:bookmarkStart w:id="11" w:name="_Toc243664613"/>
+      <w:bookmarkStart w:id="11" w:name="_Toc243671691"/>
       <w:r>
         <w:rPr>
           <w:rFonts w:eastAsia="黑体"/>
           <w:sz w:val="24"/>
         </w:rPr>
-        <w:lastRenderedPageBreak/>
         <w:t xml:space="preserve">(3) </w:t>
       </w:r>
       <w:r>
@@ -9999,6 +9941,7 @@
     </w:p>
     <w:p>
       <w:pPr>
+        <w:keepNext/>
         <w:spacing w:before="46" w:after="46"/>
         <w:jc w:val="center"/>
       </w:pPr>
@@ -10083,6 +10026,8 @@
       </w:tblGrid>
       <w:tr>
         <w:trPr>
+          <w:cantSplit/>
+          <w:tblHeader/>
           <w:jc w:val="center"/>
         </w:trPr>
         <w:tc>
@@ -10207,6 +10152,7 @@
       </w:tr>
       <w:tr>
         <w:trPr>
+          <w:cantSplit/>
           <w:jc w:val="center"/>
         </w:trPr>
         <w:tc>
@@ -10275,6 +10221,7 @@
       </w:tr>
       <w:tr>
         <w:trPr>
+          <w:cantSplit/>
           <w:jc w:val="center"/>
         </w:trPr>
         <w:tc>
@@ -10331,6 +10278,7 @@
       </w:tr>
       <w:tr>
         <w:trPr>
+          <w:cantSplit/>
           <w:jc w:val="center"/>
         </w:trPr>
         <w:tc>
@@ -10411,6 +10359,7 @@
       </w:tr>
       <w:tr>
         <w:trPr>
+          <w:cantSplit/>
           <w:jc w:val="center"/>
         </w:trPr>
         <w:tc>
@@ -10467,6 +10416,7 @@
       </w:tr>
       <w:tr>
         <w:trPr>
+          <w:cantSplit/>
           <w:jc w:val="center"/>
         </w:trPr>
         <w:tc>
@@ -10579,7 +10529,7 @@
         <w:spacing w:before="46" w:after="46" w:line="240" w:lineRule="auto"/>
         <w:jc w:val="left"/>
       </w:pPr>
-      <w:bookmarkStart w:id="12" w:name="_Toc243664614"/>
+      <w:bookmarkStart w:id="12" w:name="_Toc243671692"/>
       <w:r>
         <w:rPr>
           <w:rFonts w:eastAsia="黑体"/>
@@ -10602,7 +10552,7 @@
         <w:spacing w:before="46" w:after="46" w:line="240" w:lineRule="auto"/>
         <w:jc w:val="left"/>
       </w:pPr>
-      <w:bookmarkStart w:id="13" w:name="_Toc243664615"/>
+      <w:bookmarkStart w:id="13" w:name="_Toc243671693"/>
       <w:r>
         <w:rPr>
           <w:rFonts w:ascii="Times New Roman" w:eastAsia="黑体" w:hAnsi="Times New Roman" w:cs="Times New Roman"/>
@@ -10691,12 +10641,13 @@
         <w:spacing w:before="46" w:after="46" w:line="240" w:lineRule="auto"/>
         <w:jc w:val="left"/>
       </w:pPr>
-      <w:bookmarkStart w:id="14" w:name="_Toc243664616"/>
+      <w:bookmarkStart w:id="14" w:name="_Toc243671694"/>
       <w:r>
         <w:rPr>
           <w:rFonts w:ascii="Times New Roman" w:eastAsia="黑体" w:hAnsi="Times New Roman" w:cs="Times New Roman"/>
           <w:sz w:val="28"/>
         </w:rPr>
+        <w:lastRenderedPageBreak/>
         <w:t xml:space="preserve">3.2 </w:t>
       </w:r>
       <w:r>
@@ -10714,7 +10665,7 @@
         <w:spacing w:line="240" w:lineRule="auto"/>
         <w:jc w:val="left"/>
       </w:pPr>
-      <w:bookmarkStart w:id="15" w:name="_Toc243664617"/>
+      <w:bookmarkStart w:id="15" w:name="_Toc243671695"/>
       <w:r>
         <w:rPr>
           <w:rFonts w:eastAsia="黑体"/>
@@ -10773,6 +10724,7 @@
     </w:p>
     <w:p>
       <w:pPr>
+        <w:keepNext/>
         <w:spacing w:before="46" w:after="46"/>
         <w:jc w:val="center"/>
       </w:pPr>
@@ -10815,6 +10767,8 @@
       </w:tblGrid>
       <w:tr>
         <w:trPr>
+          <w:cantSplit/>
+          <w:tblHeader/>
           <w:jc w:val="center"/>
         </w:trPr>
         <w:tc>
@@ -10834,7 +10788,6 @@
                 <w:b/>
                 <w:sz w:val="19"/>
               </w:rPr>
-              <w:lastRenderedPageBreak/>
               <w:t>处理阶段</w:t>
             </w:r>
           </w:p>
@@ -10884,6 +10837,7 @@
       </w:tr>
       <w:tr>
         <w:trPr>
+          <w:cantSplit/>
           <w:jc w:val="center"/>
         </w:trPr>
         <w:tc>
@@ -10940,6 +10894,7 @@
       </w:tr>
       <w:tr>
         <w:trPr>
+          <w:cantSplit/>
           <w:jc w:val="center"/>
         </w:trPr>
         <w:tc>
@@ -11014,6 +10969,7 @@
       </w:tr>
       <w:tr>
         <w:trPr>
+          <w:cantSplit/>
           <w:jc w:val="center"/>
         </w:trPr>
         <w:tc>
@@ -11076,6 +11032,7 @@
       </w:tr>
       <w:tr>
         <w:trPr>
+          <w:cantSplit/>
           <w:jc w:val="center"/>
         </w:trPr>
         <w:tc>
@@ -11132,6 +11089,7 @@
       </w:tr>
       <w:tr>
         <w:trPr>
+          <w:cantSplit/>
           <w:jc w:val="center"/>
         </w:trPr>
         <w:tc>
@@ -11198,7 +11156,7 @@
         <w:spacing w:line="240" w:lineRule="auto"/>
         <w:jc w:val="left"/>
       </w:pPr>
-      <w:bookmarkStart w:id="16" w:name="_Toc243664618"/>
+      <w:bookmarkStart w:id="16" w:name="_Toc243671696"/>
       <w:r>
         <w:rPr>
           <w:rFonts w:eastAsia="黑体"/>
@@ -11238,6 +11196,7 @@
     </w:p>
     <w:p>
       <w:pPr>
+        <w:keepNext/>
         <w:spacing w:before="46" w:after="46"/>
         <w:jc w:val="center"/>
       </w:pPr>
@@ -11246,7 +11205,7 @@
           <w:noProof/>
         </w:rPr>
         <w:drawing>
-          <wp:inline distT="0" distB="0" distL="0" distR="0">
+          <wp:inline distT="0" distB="0" distL="0" distR="0" wp14:anchorId="64632B39" wp14:editId="4B7E221E">
             <wp:extent cx="5486400" cy="3380509"/>
             <wp:effectExtent l="0" t="0" r="0" b="0"/>
             <wp:docPr id="3" name="Picture 3"/>
@@ -11327,7 +11286,11 @@
         <w:t>1</w:t>
       </w:r>
       <w:r>
-        <w:t>）无状态接入层转发：客户端连接接入服务节点后，接入层仅维护连接链路，不保存业务状态，可根据房间标识将会话请求路由给负责该房间的协作服务节点；（</w:t>
+        <w:t>）无状态接入层转发：客户端连接接入服务节</w:t>
+      </w:r>
+      <w:r>
+        <w:lastRenderedPageBreak/>
+        <w:t>点后，接入层仅维护连接链路，不保存业务状态，可根据房间标识将会话请求路由给负责该房间的协作服务节点；（</w:t>
       </w:r>
       <w:r>
         <w:t>2</w:t>
@@ -11342,7 +11305,7 @@
         <w:spacing w:line="240" w:lineRule="auto"/>
         <w:jc w:val="left"/>
       </w:pPr>
-      <w:bookmarkStart w:id="17" w:name="_Toc243664619"/>
+      <w:bookmarkStart w:id="17" w:name="_Toc243671697"/>
       <w:r>
         <w:rPr>
           <w:rFonts w:eastAsia="黑体"/>
@@ -11399,7 +11362,6 @@
         <w:ind w:firstLineChars="200" w:firstLine="420"/>
       </w:pPr>
       <w:r>
-        <w:lastRenderedPageBreak/>
         <w:t xml:space="preserve">1. </w:t>
       </w:r>
       <w:r>
@@ -11454,7 +11416,7 @@
         <w:spacing w:before="46" w:after="46" w:line="240" w:lineRule="auto"/>
         <w:jc w:val="left"/>
       </w:pPr>
-      <w:bookmarkStart w:id="18" w:name="_Toc243664620"/>
+      <w:bookmarkStart w:id="18" w:name="_Toc243671698"/>
       <w:r>
         <w:rPr>
           <w:rFonts w:eastAsia="黑体"/>
@@ -11477,7 +11439,7 @@
         <w:spacing w:before="46" w:after="46" w:line="240" w:lineRule="auto"/>
         <w:jc w:val="left"/>
       </w:pPr>
-      <w:bookmarkStart w:id="19" w:name="_Toc243664621"/>
+      <w:bookmarkStart w:id="19" w:name="_Toc243671699"/>
       <w:r>
         <w:rPr>
           <w:rFonts w:ascii="Times New Roman" w:eastAsia="黑体" w:hAnsi="Times New Roman" w:cs="Times New Roman"/>
@@ -11554,7 +11516,7 @@
         <w:spacing w:before="46" w:after="46" w:line="240" w:lineRule="auto"/>
         <w:jc w:val="left"/>
       </w:pPr>
-      <w:bookmarkStart w:id="20" w:name="_Toc243664622"/>
+      <w:bookmarkStart w:id="20" w:name="_Toc243671700"/>
       <w:r>
         <w:rPr>
           <w:rFonts w:ascii="Times New Roman" w:eastAsia="黑体" w:hAnsi="Times New Roman" w:cs="Times New Roman"/>
@@ -11577,7 +11539,7 @@
         <w:spacing w:line="240" w:lineRule="auto"/>
         <w:jc w:val="left"/>
       </w:pPr>
-      <w:bookmarkStart w:id="21" w:name="_Toc243664623"/>
+      <w:bookmarkStart w:id="21" w:name="_Toc243671701"/>
       <w:r>
         <w:rPr>
           <w:rFonts w:eastAsia="黑体"/>
@@ -11674,6 +11636,7 @@
     </w:p>
     <w:p>
       <w:pPr>
+        <w:keepNext/>
         <w:spacing w:before="46" w:after="46"/>
         <w:jc w:val="center"/>
       </w:pPr>
@@ -11718,6 +11681,8 @@
       </w:tblGrid>
       <w:tr>
         <w:trPr>
+          <w:cantSplit/>
+          <w:tblHeader/>
           <w:jc w:val="center"/>
         </w:trPr>
         <w:tc>
@@ -11828,6 +11793,7 @@
       </w:tr>
       <w:tr>
         <w:trPr>
+          <w:cantSplit/>
           <w:jc w:val="center"/>
         </w:trPr>
         <w:tc>
@@ -11843,6 +11809,7 @@
               <w:rPr>
                 <w:sz w:val="18"/>
               </w:rPr>
+              <w:lastRenderedPageBreak/>
               <w:t>房间创建</w:t>
             </w:r>
             <w:r>
@@ -11948,6 +11915,7 @@
       </w:tr>
       <w:tr>
         <w:trPr>
+          <w:cantSplit/>
           <w:jc w:val="center"/>
         </w:trPr>
         <w:tc>
@@ -12068,6 +12036,7 @@
       </w:tr>
       <w:tr>
         <w:trPr>
+          <w:cantSplit/>
           <w:jc w:val="center"/>
         </w:trPr>
         <w:tc>
@@ -12188,6 +12157,7 @@
       </w:tr>
       <w:tr>
         <w:trPr>
+          <w:cantSplit/>
           <w:jc w:val="center"/>
         </w:trPr>
         <w:tc>
@@ -12203,7 +12173,6 @@
               <w:rPr>
                 <w:sz w:val="18"/>
               </w:rPr>
-              <w:lastRenderedPageBreak/>
               <w:t>增量状态广播推送</w:t>
             </w:r>
           </w:p>
@@ -12309,6 +12278,7 @@
       </w:tr>
       <w:tr>
         <w:trPr>
+          <w:cantSplit/>
           <w:jc w:val="center"/>
         </w:trPr>
         <w:tc>
@@ -12433,7 +12403,7 @@
         <w:spacing w:line="240" w:lineRule="auto"/>
         <w:jc w:val="left"/>
       </w:pPr>
-      <w:bookmarkStart w:id="22" w:name="_Toc243664624"/>
+      <w:bookmarkStart w:id="22" w:name="_Toc243671702"/>
       <w:r>
         <w:rPr>
           <w:rFonts w:eastAsia="黑体"/>
@@ -12467,6 +12437,7 @@
     </w:p>
     <w:p>
       <w:pPr>
+        <w:keepNext/>
         <w:spacing w:before="46" w:after="46"/>
         <w:jc w:val="center"/>
       </w:pPr>
@@ -12475,7 +12446,7 @@
           <w:noProof/>
         </w:rPr>
         <w:drawing>
-          <wp:inline distT="0" distB="0" distL="0" distR="0">
+          <wp:inline distT="0" distB="0" distL="0" distR="0" wp14:anchorId="40EFAEC4" wp14:editId="46107530">
             <wp:extent cx="5486400" cy="3546764"/>
             <wp:effectExtent l="0" t="0" r="0" b="0"/>
             <wp:docPr id="4" name="Picture 4"/>
@@ -12556,7 +12527,11 @@
         <w:t>1</w:t>
       </w:r>
       <w:r>
-        <w:t>）操作发起与意图提交：玩家客户端发起移动操作，提交所操作的角色标记标识、目标位置以及发起该操作时所依据的对象基准版本；（</w:t>
+        <w:t>）操作发起与意图提交：玩家客户端发起移动操作，提交所操作的角色标记标识、目标位置以及发起该操作时所依据的对象基准</w:t>
+      </w:r>
+      <w:r>
+        <w:lastRenderedPageBreak/>
+        <w:t>版本；（</w:t>
       </w:r>
       <w:r>
         <w:t>2</w:t>
@@ -12589,7 +12564,7 @@
         <w:spacing w:line="240" w:lineRule="auto"/>
         <w:jc w:val="left"/>
       </w:pPr>
-      <w:bookmarkStart w:id="23" w:name="_Toc243664625"/>
+      <w:bookmarkStart w:id="23" w:name="_Toc243671703"/>
       <w:r>
         <w:rPr>
           <w:rFonts w:eastAsia="黑体"/>
@@ -12669,11 +12644,7 @@
         <w:t>Transient Communication</w:t>
       </w:r>
       <w:r>
-        <w:t>）的特性与局限：课件指出，瞬态通信仅在通信</w:t>
-      </w:r>
-      <w:r>
-        <w:lastRenderedPageBreak/>
-        <w:t>各方均正常运行时才能完成传递；若接收方正在经历断线或网络中断，消息往往被网络介质丢弃。</w:t>
+        <w:t>）的特性与局限：课件指出，瞬态通信仅在通信各方均正常运行时才能完成传递；若接收方正在经历断线或网络中断，消息往往被网络介质丢弃。</w:t>
       </w:r>
       <w:r>
         <w:t xml:space="preserve">WebSocket </w:t>
@@ -12743,7 +12714,7 @@
         <w:spacing w:before="46" w:after="46" w:line="240" w:lineRule="auto"/>
         <w:jc w:val="left"/>
       </w:pPr>
-      <w:bookmarkStart w:id="24" w:name="_Toc243664626"/>
+      <w:bookmarkStart w:id="24" w:name="_Toc243671704"/>
       <w:r>
         <w:rPr>
           <w:rFonts w:eastAsia="黑体"/>
@@ -12766,7 +12737,7 @@
         <w:spacing w:before="46" w:after="46" w:line="240" w:lineRule="auto"/>
         <w:jc w:val="left"/>
       </w:pPr>
-      <w:bookmarkStart w:id="25" w:name="_Toc243664627"/>
+      <w:bookmarkStart w:id="25" w:name="_Toc243671705"/>
       <w:r>
         <w:rPr>
           <w:rFonts w:ascii="Times New Roman" w:eastAsia="黑体" w:hAnsi="Times New Roman" w:cs="Times New Roman"/>
@@ -12849,7 +12820,7 @@
         <w:spacing w:before="46" w:after="46" w:line="240" w:lineRule="auto"/>
         <w:jc w:val="left"/>
       </w:pPr>
-      <w:bookmarkStart w:id="26" w:name="_Toc243664628"/>
+      <w:bookmarkStart w:id="26" w:name="_Toc243671706"/>
       <w:r>
         <w:rPr>
           <w:rFonts w:ascii="Times New Roman" w:eastAsia="黑体" w:hAnsi="Times New Roman" w:cs="Times New Roman"/>
@@ -12872,7 +12843,7 @@
         <w:spacing w:line="240" w:lineRule="auto"/>
         <w:jc w:val="left"/>
       </w:pPr>
-      <w:bookmarkStart w:id="27" w:name="_Toc243664629"/>
+      <w:bookmarkStart w:id="27" w:name="_Toc243671707"/>
       <w:r>
         <w:rPr>
           <w:rFonts w:eastAsia="黑体"/>
@@ -12920,31 +12891,41 @@
         <w:t xml:space="preserve">UUID </w:t>
       </w:r>
       <w:r>
-        <w:t>具备极大的标识空间，支持在分布式节点上去中心化生成，避免了对中心自增发号器单点的强依赖。核心实体标识包括：</w:t>
+        <w:t>具备极大的标识空间，支持在分布式节点上去中心化生成，避免了对中心自增发号器单点的强依赖。核心实体标识包括用户标识（</w:t>
       </w:r>
       <w:r>
         <w:t>`userId`</w:t>
       </w:r>
       <w:r>
-        <w:t>（用户标识）、</w:t>
+        <w:t>）、房间内部标识（</w:t>
       </w:r>
       <w:r>
         <w:t>`roomId`</w:t>
       </w:r>
       <w:r>
-        <w:t>（房间唯一内部标识）、</w:t>
+        <w:t>）、标记标识（</w:t>
       </w:r>
       <w:r>
         <w:t>`tokenId`</w:t>
       </w:r>
       <w:r>
-        <w:t>（角色标记标识）与</w:t>
-      </w:r>
-      <w:r>
-        <w:t xml:space="preserve"> `mapId`</w:t>
-      </w:r>
-      <w:r>
-        <w:t>（预置地图资源标识）。</w:t>
+        <w:t>）</w:t>
+      </w:r>
+      <w:r>
+        <w:lastRenderedPageBreak/>
+        <w:t>与地图资源标识（</w:t>
+      </w:r>
+      <w:r>
+        <w:t>`mapId`</w:t>
+      </w:r>
+      <w:r>
+        <w:t>）。需要特别明确的是：</w:t>
+      </w:r>
+      <w:r>
+        <w:t xml:space="preserve">UUIDv4 </w:t>
+      </w:r>
+      <w:r>
+        <w:t>仅用于全局实体的内部引用与寻址，其随机性绝不代表安全授权机制；知晓或获取某个实体标识绝不等于获得操作权限，随机标识符不能替代服务端严格的会话身份认证与角色权限核验。</w:t>
       </w:r>
     </w:p>
     <w:p>
@@ -12953,13 +12934,13 @@
         <w:ind w:firstLineChars="200" w:firstLine="420"/>
       </w:pPr>
       <w:r>
-        <w:t>此外，系统引入</w:t>
-      </w:r>
-      <w:r>
-        <w:t xml:space="preserve"> `operationId`</w:t>
-      </w:r>
-      <w:r>
-        <w:t>（操作唯一标识），由客户端在构造写操作时生成并附带，用于服务端识别重复请求并实现幂等去重。</w:t>
+        <w:t>此外，系统引入操作意图标识（</w:t>
+      </w:r>
+      <w:r>
+        <w:t>`operationId`</w:t>
+      </w:r>
+      <w:r>
+        <w:t>），由客户端在构造写操作时生成并附带，用于服务端在网络超时重试时识别重复请求并辅助实现幂等性。</w:t>
       </w:r>
     </w:p>
     <w:p>
@@ -12968,7 +12949,7 @@
         <w:spacing w:line="240" w:lineRule="auto"/>
         <w:jc w:val="left"/>
       </w:pPr>
-      <w:bookmarkStart w:id="28" w:name="_Toc243664630"/>
+      <w:bookmarkStart w:id="28" w:name="_Toc243671708"/>
       <w:r>
         <w:rPr>
           <w:rFonts w:eastAsia="黑体"/>
@@ -13039,25 +13020,7 @@
         <w:t>2</w:t>
       </w:r>
       <w:r>
-        <w:t>）房间服务定位与路由：系统在路由缓存中维护</w:t>
-      </w:r>
-      <w:r>
-        <w:t xml:space="preserve"> `roomId -&gt; </w:t>
-      </w:r>
-      <w:r>
-        <w:t>负责实例</w:t>
-      </w:r>
-      <w:r>
-        <w:t>/</w:t>
-      </w:r>
-      <w:r>
-        <w:t>通道</w:t>
-      </w:r>
-      <w:r>
-        <w:t xml:space="preserve">` </w:t>
-      </w:r>
-      <w:r>
-        <w:t>的映射关系。客户端发起实时协同连接时，接入层依据该路由映射将请求定向至负责该房间的协作服务节点。系统核心命名规则如表</w:t>
+        <w:t>）房间服务定位与路由：系统在路由缓存中维护房间标识至负责服务实例的映射关系。客户端发起实时协同连接时，接入层依据该路由映射将请求定向至负责该房间的协作服务节点。系统核心命名规则如表</w:t>
       </w:r>
       <w:r>
         <w:t xml:space="preserve"> 5-1 </w:t>
@@ -13068,6 +13031,7 @@
     </w:p>
     <w:p>
       <w:pPr>
+        <w:keepNext/>
         <w:spacing w:before="46" w:after="46"/>
         <w:jc w:val="center"/>
       </w:pPr>
@@ -13112,6 +13076,8 @@
       </w:tblGrid>
       <w:tr>
         <w:trPr>
+          <w:cantSplit/>
+          <w:tblHeader/>
           <w:jc w:val="center"/>
         </w:trPr>
         <w:tc>
@@ -13131,7 +13097,6 @@
                 <w:b/>
                 <w:sz w:val="19"/>
               </w:rPr>
-              <w:lastRenderedPageBreak/>
               <w:t>命名对象分类</w:t>
             </w:r>
           </w:p>
@@ -13223,6 +13188,7 @@
       </w:tr>
       <w:tr>
         <w:trPr>
+          <w:cantSplit/>
           <w:jc w:val="center"/>
         </w:trPr>
         <w:tc>
@@ -13330,25 +13296,14 @@
               <w:rPr>
                 <w:sz w:val="18"/>
               </w:rPr>
-              <w:t>去中心化生成，具备位置无关性，防止</w:t>
-            </w:r>
-            <w:r>
-              <w:rPr>
-                <w:sz w:val="18"/>
-              </w:rPr>
-              <w:t xml:space="preserve"> ID </w:t>
-            </w:r>
-            <w:r>
-              <w:rPr>
-                <w:sz w:val="18"/>
-              </w:rPr>
-              <w:t>预测枚举</w:t>
+              <w:t>去中心化生成，具备位置无关性；仅为标识，不能替代服务端权限核验</w:t>
             </w:r>
           </w:p>
         </w:tc>
       </w:tr>
       <w:tr>
         <w:trPr>
+          <w:cantSplit/>
           <w:jc w:val="center"/>
         </w:trPr>
         <w:tc>
@@ -13451,6 +13406,7 @@
       </w:tr>
       <w:tr>
         <w:trPr>
+          <w:cantSplit/>
           <w:jc w:val="center"/>
         </w:trPr>
         <w:tc>
@@ -13553,6 +13509,7 @@
       </w:tr>
       <w:tr>
         <w:trPr>
+          <w:cantSplit/>
           <w:jc w:val="center"/>
         </w:trPr>
         <w:tc>
@@ -13667,6 +13624,7 @@
       </w:tr>
       <w:tr>
         <w:trPr>
+          <w:cantSplit/>
           <w:jc w:val="center"/>
         </w:trPr>
         <w:tc>
@@ -13791,7 +13749,7 @@
         <w:spacing w:line="240" w:lineRule="auto"/>
         <w:jc w:val="left"/>
       </w:pPr>
-      <w:bookmarkStart w:id="29" w:name="_Toc243664631"/>
+      <w:bookmarkStart w:id="29" w:name="_Toc243671709"/>
       <w:r>
         <w:rPr>
           <w:rFonts w:eastAsia="黑体"/>
@@ -13971,6 +13929,7 @@
         <w:ind w:firstLineChars="200" w:firstLine="420"/>
       </w:pPr>
       <w:r>
+        <w:lastRenderedPageBreak/>
         <w:t>方案分析：</w:t>
       </w:r>
       <w:r>
@@ -14010,7 +13969,7 @@
         <w:spacing w:before="46" w:after="46" w:line="240" w:lineRule="auto"/>
         <w:jc w:val="left"/>
       </w:pPr>
-      <w:bookmarkStart w:id="30" w:name="_Toc243664632"/>
+      <w:bookmarkStart w:id="30" w:name="_Toc243671710"/>
       <w:r>
         <w:rPr>
           <w:rFonts w:eastAsia="黑体"/>
@@ -14033,7 +13992,7 @@
         <w:spacing w:before="46" w:after="46" w:line="240" w:lineRule="auto"/>
         <w:jc w:val="left"/>
       </w:pPr>
-      <w:bookmarkStart w:id="31" w:name="_Toc243664633"/>
+      <w:bookmarkStart w:id="31" w:name="_Toc243671711"/>
       <w:r>
         <w:rPr>
           <w:rFonts w:ascii="Times New Roman" w:eastAsia="黑体" w:hAnsi="Times New Roman" w:cs="Times New Roman"/>
@@ -14071,11 +14030,7 @@
         <w:t>1</w:t>
       </w:r>
       <w:r>
-        <w:t>）空间标记并发修改的防静默覆盖需求：两名玩家可能在近似相同的微小时间窗口</w:t>
-      </w:r>
-      <w:r>
-        <w:lastRenderedPageBreak/>
-        <w:t>内试图移动同一个角色标记。系统不能允许后到达的网络请求无条件覆盖先达请求，必须提供可解释的冲突检测与状态仲裁机制。</w:t>
+        <w:t>）空间标记并发修改的防静默覆盖需求：两名玩家可能在近似相同的微小时间窗口内试图移动同一个角色标记。系统不能允许后到达的网络请求无条件覆盖先达请求，必须提供可解释的冲突检测与状态仲裁机制。</w:t>
       </w:r>
     </w:p>
     <w:p>
@@ -14114,7 +14069,7 @@
         <w:spacing w:before="46" w:after="46" w:line="240" w:lineRule="auto"/>
         <w:jc w:val="left"/>
       </w:pPr>
-      <w:bookmarkStart w:id="32" w:name="_Toc243664634"/>
+      <w:bookmarkStart w:id="32" w:name="_Toc243671712"/>
       <w:r>
         <w:rPr>
           <w:rFonts w:ascii="Times New Roman" w:eastAsia="黑体" w:hAnsi="Times New Roman" w:cs="Times New Roman"/>
@@ -14137,7 +14092,7 @@
         <w:spacing w:line="240" w:lineRule="auto"/>
         <w:jc w:val="left"/>
       </w:pPr>
-      <w:bookmarkStart w:id="33" w:name="_Toc243664635"/>
+      <w:bookmarkStart w:id="33" w:name="_Toc243671713"/>
       <w:r>
         <w:rPr>
           <w:rFonts w:eastAsia="黑体"/>
@@ -14214,6 +14169,7 @@
     </w:p>
     <w:p>
       <w:pPr>
+        <w:keepNext/>
         <w:spacing w:before="46" w:after="46"/>
         <w:jc w:val="center"/>
       </w:pPr>
@@ -14221,8 +14177,9 @@
         <w:rPr>
           <w:noProof/>
         </w:rPr>
+        <w:lastRenderedPageBreak/>
         <w:drawing>
-          <wp:inline distT="0" distB="0" distL="0" distR="0">
+          <wp:inline distT="0" distB="0" distL="0" distR="0" wp14:anchorId="006C8011" wp14:editId="5D79C68B">
             <wp:extent cx="5486400" cy="3560323"/>
             <wp:effectExtent l="0" t="0" r="0" b="0"/>
             <wp:docPr id="5" name="Picture 5"/>
@@ -14303,182 +14260,31 @@
         <w:t>1</w:t>
       </w:r>
       <w:r>
-        <w:t>）并发请求到达与排队：假定标记</w:t>
-      </w:r>
-      <w:r>
-        <w:t xml:space="preserve"> T </w:t>
-      </w:r>
-      <w:r>
-        <w:t>当前状态为版本</w:t>
-      </w:r>
-      <w:r>
-        <w:t xml:space="preserve"> 10</w:t>
-      </w:r>
-      <w:r>
-        <w:t>。玩家</w:t>
-      </w:r>
-      <w:r>
-        <w:t xml:space="preserve"> A </w:t>
-      </w:r>
-      <w:r>
-        <w:t>发送移动请求，携带</w:t>
-      </w:r>
-      <w:r>
-        <w:t xml:space="preserve"> `base_version=10, pos=X`</w:t>
-      </w:r>
-      <w:r>
-        <w:t>；玩家</w:t>
-      </w:r>
-      <w:r>
-        <w:t xml:space="preserve"> B </w:t>
-      </w:r>
-      <w:r>
-        <w:t>近似同时发送移动请求，携带</w:t>
-      </w:r>
-      <w:r>
-        <w:t xml:space="preserve"> `base_version=10, pos=Y`</w:t>
-      </w:r>
-      <w:r>
-        <w:t>。两个请求到达服务端后，由负责该房间的协作服务按接收顺序依次排队处理，假定请求</w:t>
-      </w:r>
-      <w:r>
-        <w:t xml:space="preserve"> A </w:t>
-      </w:r>
-      <w:r>
-        <w:t>先进入处理流程；（</w:t>
+        <w:t>）排队与意图核验：当多名玩家几乎同时请求移动同一标记时，客户端提交的操作请求携带发起操作时所依据的基准版本号（</w:t>
+      </w:r>
+      <w:r>
+        <w:t>`base_version`</w:t>
+      </w:r>
+      <w:r>
+        <w:t>）。请求到达服务端后，由负责该房间的协作服务按接收顺序依次排队处理；（</w:t>
       </w:r>
       <w:r>
         <w:t>2</w:t>
       </w:r>
       <w:r>
-        <w:t>）先到请求成功提交：服务端读取标记</w:t>
-      </w:r>
-      <w:r>
-        <w:t xml:space="preserve"> T </w:t>
-      </w:r>
-      <w:r>
-        <w:t>当前版本为</w:t>
-      </w:r>
-      <w:r>
-        <w:t xml:space="preserve"> 10</w:t>
-      </w:r>
-      <w:r>
-        <w:t>，与请求</w:t>
-      </w:r>
-      <w:r>
-        <w:t xml:space="preserve"> A </w:t>
-      </w:r>
-      <w:r>
-        <w:t>的</w:t>
-      </w:r>
-      <w:r>
-        <w:t xml:space="preserve"> `base_version=10` </w:t>
-      </w:r>
-      <w:r>
-        <w:t>匹配。服务端更新其坐标为</w:t>
-      </w:r>
-      <w:r>
-        <w:t xml:space="preserve"> X</w:t>
-      </w:r>
-      <w:r>
-        <w:t>，将版本递增为</w:t>
-      </w:r>
-      <w:r>
-        <w:t xml:space="preserve"> 11</w:t>
-      </w:r>
-      <w:r>
-        <w:t>，保存确认状态并为该事件分配递增序号，向房间广播更新；（</w:t>
+        <w:t>）先到请求成功提交：首个被处理的请求，其基准版本号与标记对象的当前权威版本相匹配。服务端接受该操作，更新坐标并递增对象版本号，生成房间内单调递增的事件序号，向全房间广播更新；（</w:t>
       </w:r>
       <w:r>
         <w:t>3</w:t>
       </w:r>
       <w:r>
-        <w:t>）后到请求冲突拦截：随后处理请求</w:t>
-      </w:r>
-      <w:r>
-        <w:t xml:space="preserve"> B</w:t>
-      </w:r>
-      <w:r>
-        <w:t>。此时标记</w:t>
-      </w:r>
-      <w:r>
-        <w:t xml:space="preserve"> T </w:t>
-      </w:r>
-      <w:r>
-        <w:t>的当前版本已变为</w:t>
-      </w:r>
-      <w:r>
-        <w:t xml:space="preserve"> 11</w:t>
-      </w:r>
-      <w:r>
-        <w:t>，与请求</w:t>
-      </w:r>
-      <w:r>
-        <w:t xml:space="preserve"> B </w:t>
-      </w:r>
-      <w:r>
-        <w:t>携带的</w:t>
-      </w:r>
-      <w:r>
-        <w:t xml:space="preserve"> `base_version=10` </w:t>
-      </w:r>
-      <w:r>
-        <w:t>不一致。服务端判定请求</w:t>
-      </w:r>
-      <w:r>
-        <w:t xml:space="preserve"> B </w:t>
-      </w:r>
-      <w:r>
-        <w:t>基于已过期的旧视图发起，拒绝该次写入修改；（</w:t>
+        <w:t>）并发冲突检测与拦截：后续到达的操作由于其携带的基准版本已落后于当前已递增的权威版本，被服务端判定为基于过期视图发起的陈旧意图，服务端直接拦截并拒绝该次写入修改；（</w:t>
       </w:r>
       <w:r>
         <w:t>4</w:t>
       </w:r>
       <w:r>
-        <w:t>）客户端状态平滑恢复：服务端向玩家</w:t>
-      </w:r>
-      <w:r>
-        <w:t xml:space="preserve"> B </w:t>
-      </w:r>
-      <w:r>
-        <w:t>返回冲突提示及标记</w:t>
-      </w:r>
-      <w:r>
-        <w:t xml:space="preserve"> T </w:t>
-      </w:r>
-      <w:r>
-        <w:t>当前的最新状态（坐标</w:t>
-      </w:r>
-      <w:r>
-        <w:t xml:space="preserve"> X</w:t>
-      </w:r>
-      <w:r>
-        <w:t>，版本</w:t>
-      </w:r>
-      <w:r>
-        <w:t xml:space="preserve"> 11</w:t>
-      </w:r>
-      <w:r>
-        <w:t>）。玩家</w:t>
-      </w:r>
-      <w:r>
-        <w:t xml:space="preserve"> B </w:t>
-      </w:r>
-      <w:r>
-        <w:t>客户端收到冲突响应后，撤销本地预先拖动的半透明视觉预览，将标记平滑拉回至位置</w:t>
-      </w:r>
-      <w:r>
-        <w:t xml:space="preserve"> X </w:t>
-      </w:r>
-      <w:r>
-        <w:t>并提示刷新。该机制有效防止了旧操作对新</w:t>
-      </w:r>
-      <w:r>
-        <w:t>状</w:t>
-      </w:r>
-      <w:r>
-        <w:lastRenderedPageBreak/>
-        <w:t>态的静默覆盖，保障了状态流转的有序性。</w:t>
+        <w:t>）客户端状态平滑恢复：服务端向冲突方返回拒绝提示及该标记当前的最新权威状态。客户端收到响应后撤销本地预先拖拽的半透明视觉预览，平滑将标记重置回权威位置并更新本地版本显示。该机制有效防止了旧操作对新状态的静默覆盖，保障了状态流转的因果正确性。</w:t>
       </w:r>
     </w:p>
     <w:p>
@@ -14487,7 +14293,7 @@
         <w:spacing w:line="240" w:lineRule="auto"/>
         <w:jc w:val="left"/>
       </w:pPr>
-      <w:bookmarkStart w:id="34" w:name="_Toc243664636"/>
+      <w:bookmarkStart w:id="34" w:name="_Toc243671714"/>
       <w:r>
         <w:rPr>
           <w:rFonts w:eastAsia="黑体"/>
@@ -14519,7 +14325,7 @@
         <w:spacing w:line="240" w:lineRule="auto"/>
         <w:jc w:val="left"/>
       </w:pPr>
-      <w:bookmarkStart w:id="35" w:name="_Toc243664637"/>
+      <w:bookmarkStart w:id="35" w:name="_Toc243671715"/>
       <w:r>
         <w:rPr>
           <w:rFonts w:eastAsia="黑体"/>
@@ -14578,6 +14384,7 @@
     </w:p>
     <w:p>
       <w:pPr>
+        <w:keepNext/>
         <w:spacing w:before="46" w:after="46"/>
         <w:jc w:val="center"/>
       </w:pPr>
@@ -14621,6 +14428,8 @@
       </w:tblGrid>
       <w:tr>
         <w:trPr>
+          <w:cantSplit/>
+          <w:tblHeader/>
           <w:jc w:val="center"/>
         </w:trPr>
         <w:tc>
@@ -14724,6 +14533,7 @@
       </w:tr>
       <w:tr>
         <w:trPr>
+          <w:cantSplit/>
           <w:jc w:val="center"/>
         </w:trPr>
         <w:tc>
@@ -14739,6 +14549,7 @@
               <w:rPr>
                 <w:sz w:val="18"/>
               </w:rPr>
+              <w:lastRenderedPageBreak/>
               <w:t>物理时钟同步</w:t>
             </w:r>
             <w:r>
@@ -14803,6 +14614,7 @@
       </w:tr>
       <w:tr>
         <w:trPr>
+          <w:cantSplit/>
           <w:jc w:val="center"/>
         </w:trPr>
         <w:tc>
@@ -14826,6 +14638,12 @@
               </w:rPr>
               <w:t>逻辑时钟</w:t>
             </w:r>
+            <w:r>
+              <w:rPr>
+                <w:sz w:val="18"/>
+              </w:rPr>
+              <w:t xml:space="preserve"> [3]</w:t>
+            </w:r>
           </w:p>
         </w:tc>
         <w:tc>
@@ -14864,7 +14682,7 @@
               <w:rPr>
                 <w:sz w:val="18"/>
               </w:rPr>
-              <w:t>课件核心理论。能描述因果序，但无法区分完全并发事件</w:t>
+              <w:t>课件经典理论模型，用于解释分布式因果依赖与偏序概念</w:t>
             </w:r>
           </w:p>
         </w:tc>
@@ -14881,13 +14699,14 @@
               <w:rPr>
                 <w:sz w:val="18"/>
               </w:rPr>
-              <w:t>引入其递增计数器思想推导房间事件序号，便于描述事件先后</w:t>
+              <w:t>与本系统定序机制明确区分：系统采用服务端分配单调事件序号实现房间内全序，理论模型用于阐释因果依赖</w:t>
             </w:r>
           </w:p>
         </w:tc>
       </w:tr>
       <w:tr>
         <w:trPr>
+          <w:cantSplit/>
           <w:jc w:val="center"/>
         </w:trPr>
         <w:tc>
@@ -14897,7 +14716,7 @@
           <w:p>
             <w:pPr>
               <w:spacing w:before="46" w:after="46"/>
-              <w:jc w:val="center"/>
+              <w:jc w:val="left"/>
             </w:pPr>
             <w:r>
               <w:rPr>
@@ -14909,7 +14728,7 @@
               <w:rPr>
                 <w:sz w:val="18"/>
               </w:rPr>
-              <w:t xml:space="preserve"> (Vector Clock)</w:t>
+              <w:t xml:space="preserve"> (Vector Clock) [6]</w:t>
             </w:r>
           </w:p>
         </w:tc>
@@ -14967,6 +14786,7 @@
       </w:tr>
       <w:tr>
         <w:trPr>
+          <w:cantSplit/>
           <w:jc w:val="center"/>
         </w:trPr>
         <w:tc>
@@ -15033,13 +14853,14 @@
               <w:rPr>
                 <w:sz w:val="18"/>
               </w:rPr>
-              <w:t>【核心方案】：以清晰的工程思路实现房间内的操作定序</w:t>
+              <w:t>【核心方案】：以清晰的工程思路实现房间内的操作全序定序</w:t>
             </w:r>
           </w:p>
         </w:tc>
       </w:tr>
       <w:tr>
         <w:trPr>
+          <w:cantSplit/>
           <w:jc w:val="center"/>
         </w:trPr>
         <w:tc>
@@ -15101,7 +14922,31 @@
               <w:rPr>
                 <w:sz w:val="18"/>
               </w:rPr>
-              <w:t>进入临界区需</w:t>
+              <w:t>进入临界区需发送</w:t>
+            </w:r>
+            <w:r>
+              <w:rPr>
+                <w:sz w:val="18"/>
+              </w:rPr>
+              <w:t xml:space="preserve"> N-1 </w:t>
+            </w:r>
+            <w:r>
+              <w:rPr>
+                <w:sz w:val="18"/>
+              </w:rPr>
+              <w:t>个请求并接收</w:t>
+            </w:r>
+            <w:r>
+              <w:rPr>
+                <w:sz w:val="18"/>
+              </w:rPr>
+              <w:t xml:space="preserve"> N-1 </w:t>
+            </w:r>
+            <w:r>
+              <w:rPr>
+                <w:sz w:val="18"/>
+              </w:rPr>
+              <w:t>个回复，共</w:t>
             </w:r>
             <w:r>
               <w:rPr>
@@ -15113,7 +14958,7 @@
               <w:rPr>
                 <w:sz w:val="18"/>
               </w:rPr>
-              <w:t>次消息往返，节点失联极易造成阻塞</w:t>
+              <w:t>条消息；任一节点失联均易造成阻塞</w:t>
             </w:r>
           </w:p>
         </w:tc>
@@ -15130,13 +14975,14 @@
               <w:rPr>
                 <w:sz w:val="18"/>
               </w:rPr>
-              <w:t>仅作课件学术对比，在存在中心服务器的体系下开销过大，不采用</w:t>
+              <w:t>仅作课件学术对比，在存在中心服务器的体系下消息开销过大，不采用</w:t>
             </w:r>
           </w:p>
         </w:tc>
       </w:tr>
       <w:tr>
         <w:trPr>
+          <w:cantSplit/>
           <w:jc w:val="center"/>
         </w:trPr>
         <w:tc>
@@ -15238,7 +15084,7 @@
         <w:ind w:firstLineChars="200" w:firstLine="420"/>
       </w:pPr>
       <w:r>
-        <w:t>深入理论剖析：课件详细证明了</w:t>
+        <w:t>深入理论剖析与概念澄清：课件详细证明了</w:t>
       </w:r>
       <w:r>
         <w:t xml:space="preserve"> Lamport </w:t>
@@ -15295,54 +15141,73 @@
         <w:t xml:space="preserve"> </w:t>
       </w:r>
       <w:r>
-        <w:t>在解决缺乏物理时钟因果定序方面的经典地位。然而，分布式算法的选择必须与系统整体架构相适应。在去中心化的</w:t>
-      </w:r>
-      <w:r>
-        <w:t xml:space="preserve"> P2P </w:t>
-      </w:r>
-      <w:r>
-        <w:t>系统中，向量时钟</w:t>
-      </w:r>
-      <w:r>
-        <w:t xml:space="preserve"> </w:t>
-      </w:r>
-      <w:r>
-        <w:rPr>
-          <w:noProof/>
-          <w:vertAlign w:val="superscript"/>
-        </w:rPr>
-        <w:t>[6]</w:t>
-      </w:r>
-      <w:r>
-        <w:t xml:space="preserve"> </w:t>
-      </w:r>
-      <w:r>
-        <w:t>与无冲突复制数据类型（</w:t>
-      </w:r>
-      <w:r>
-        <w:t>CRDT</w:t>
-      </w:r>
-      <w:r>
-        <w:t>）</w:t>
-      </w:r>
-      <w:r>
-        <w:rPr>
-          <w:noProof/>
-          <w:vertAlign w:val="superscript"/>
-        </w:rPr>
-        <w:t>[13]</w:t>
-      </w:r>
-      <w:r>
-        <w:t xml:space="preserve"> </w:t>
-      </w:r>
-      <w:r>
-        <w:t>是捕获与消解副本并发冲突的经典手段；但在本系统选定的</w:t>
+        <w:t>在解决缺乏物理时钟因果定序方面的经典地位。在此需要明确区分分布式理论模型与本系统的工程实现机制：</w:t>
+      </w:r>
+    </w:p>
+    <w:p>
+      <w:pPr>
+        <w:spacing w:before="46" w:after="46"/>
+        <w:ind w:firstLineChars="200" w:firstLine="420"/>
+      </w:pPr>
+      <w:r>
+        <w:t>第一，明确区分</w:t>
+      </w:r>
+      <w:r>
+        <w:t xml:space="preserve"> Lamport </w:t>
+      </w:r>
+      <w:r>
+        <w:t>逻辑时钟与服务端递增事件序号：</w:t>
+      </w:r>
+      <w:r>
+        <w:t xml:space="preserve">Lamport </w:t>
+      </w:r>
+      <w:r>
+        <w:t>逻辑时钟是分布式理论中用于在缺乏全局物理时钟条件下解释事件因果顺序（</w:t>
+      </w:r>
+      <w:r>
+        <w:t>Happens-Before</w:t>
+      </w:r>
+      <w:r>
+        <w:t>）与推导偏序关系的经典理论模型；而本设计在单房间内实际采用的排序方式，是由单房间权威协作服务在串行仲裁路径上统一分配的权威自增事件序号。前者在理论层面解释了因果依赖，后者则是工程上依靠集中权威仲裁为房间内所有操作提供明确全序的实现手段，二者机制不同，不可混同。</w:t>
+      </w:r>
+    </w:p>
+    <w:p>
+      <w:pPr>
+        <w:spacing w:before="46" w:after="46"/>
+        <w:ind w:firstLineChars="200" w:firstLine="420"/>
+      </w:pPr>
+      <w:r>
+        <w:t>第二，互斥算法的架构适用性权衡：</w:t>
+      </w:r>
+      <w:r>
+        <w:t xml:space="preserve">Ricart-Agrawala </w:t>
+      </w:r>
+      <w:r>
+        <w:t>算法适用于无中心的对等网络，但每次进入临界区需全网组播</w:t>
+      </w:r>
+      <w:r>
+        <w:t xml:space="preserve"> N-1 </w:t>
+      </w:r>
+      <w:r>
+        <w:t>个请求并等待</w:t>
+      </w:r>
+      <w:r>
+        <w:t xml:space="preserve"> N-1 </w:t>
+      </w:r>
+      <w:r>
+        <w:t>个回复，消息总数为</w:t>
+      </w:r>
+      <w:r>
+        <w:t xml:space="preserve"> 2(N-1) </w:t>
+      </w:r>
+      <w:r>
+        <w:t>条，且对节点故障极度敏感；而在本系统选定的分层</w:t>
       </w:r>
       <w:r>
         <w:t xml:space="preserve"> C/S </w:t>
       </w:r>
       <w:r>
-        <w:t>分层架构下，服务端房间协调服务充当了逻辑仲裁点。通过协调服务排队结合乐观版本号，能够以较小的协调开销完成冲突处理。应当指出，单房间串行化处理牺牲了一定程度的单房间多操作并行能力，但对于通常不超过</w:t>
+        <w:t>架构下，服务端房间协调服务充当了天然的逻辑仲裁点，通过请求排队结合乐观版本校验即可低开销化解并发写冲突，无需在客户端之间运行开销巨大的分布式互斥协议。应当指出，单房间串行化处理牺牲了一定程度的单房间多操作并行能力，但对于通常不超过</w:t>
       </w:r>
       <w:r>
         <w:t xml:space="preserve"> 8 </w:t>
@@ -15357,7 +15222,7 @@
         <w:spacing w:before="46" w:after="46" w:line="240" w:lineRule="auto"/>
         <w:jc w:val="left"/>
       </w:pPr>
-      <w:bookmarkStart w:id="36" w:name="_Toc243664638"/>
+      <w:bookmarkStart w:id="36" w:name="_Toc243671716"/>
       <w:r>
         <w:rPr>
           <w:rFonts w:eastAsia="黑体"/>
@@ -15381,7 +15246,7 @@
         <w:spacing w:before="46" w:after="46" w:line="240" w:lineRule="auto"/>
         <w:jc w:val="left"/>
       </w:pPr>
-      <w:bookmarkStart w:id="37" w:name="_Toc243664639"/>
+      <w:bookmarkStart w:id="37" w:name="_Toc243671717"/>
       <w:r>
         <w:rPr>
           <w:rFonts w:ascii="Times New Roman" w:eastAsia="黑体" w:hAnsi="Times New Roman" w:cs="Times New Roman"/>
@@ -15464,7 +15329,7 @@
         <w:spacing w:before="46" w:after="46" w:line="240" w:lineRule="auto"/>
         <w:jc w:val="left"/>
       </w:pPr>
-      <w:bookmarkStart w:id="38" w:name="_Toc243664640"/>
+      <w:bookmarkStart w:id="38" w:name="_Toc243671718"/>
       <w:r>
         <w:rPr>
           <w:rFonts w:ascii="Times New Roman" w:eastAsia="黑体" w:hAnsi="Times New Roman" w:cs="Times New Roman"/>
@@ -15487,7 +15352,7 @@
         <w:spacing w:line="240" w:lineRule="auto"/>
         <w:jc w:val="left"/>
       </w:pPr>
-      <w:bookmarkStart w:id="39" w:name="_Toc243664641"/>
+      <w:bookmarkStart w:id="39" w:name="_Toc243671719"/>
       <w:r>
         <w:rPr>
           <w:rFonts w:eastAsia="黑体"/>
@@ -15558,6 +15423,7 @@
     </w:p>
     <w:p>
       <w:pPr>
+        <w:keepNext/>
         <w:spacing w:before="46" w:after="46"/>
         <w:jc w:val="center"/>
       </w:pPr>
@@ -15602,6 +15468,8 @@
       </w:tblGrid>
       <w:tr>
         <w:trPr>
+          <w:cantSplit/>
+          <w:tblHeader/>
           <w:jc w:val="center"/>
         </w:trPr>
         <w:tc>
@@ -15726,6 +15594,7 @@
       </w:tr>
       <w:tr>
         <w:trPr>
+          <w:cantSplit/>
           <w:jc w:val="center"/>
         </w:trPr>
         <w:tc>
@@ -15822,6 +15691,7 @@
       </w:tr>
       <w:tr>
         <w:trPr>
+          <w:cantSplit/>
           <w:jc w:val="center"/>
         </w:trPr>
         <w:tc>
@@ -15918,6 +15788,7 @@
       </w:tr>
       <w:tr>
         <w:trPr>
+          <w:cantSplit/>
           <w:jc w:val="center"/>
         </w:trPr>
         <w:tc>
@@ -16014,6 +15885,7 @@
       </w:tr>
       <w:tr>
         <w:trPr>
+          <w:cantSplit/>
           <w:jc w:val="center"/>
         </w:trPr>
         <w:tc>
@@ -16252,7 +16124,7 @@
         <w:spacing w:line="240" w:lineRule="auto"/>
         <w:jc w:val="left"/>
       </w:pPr>
-      <w:bookmarkStart w:id="40" w:name="_Toc243664642"/>
+      <w:bookmarkStart w:id="40" w:name="_Toc243671720"/>
       <w:r>
         <w:rPr>
           <w:rFonts w:eastAsia="黑体"/>
@@ -16298,6 +16170,7 @@
     </w:p>
     <w:p>
       <w:pPr>
+        <w:keepNext/>
         <w:spacing w:before="46" w:after="46"/>
         <w:jc w:val="center"/>
       </w:pPr>
@@ -16306,7 +16179,7 @@
           <w:noProof/>
         </w:rPr>
         <w:drawing>
-          <wp:inline distT="0" distB="0" distL="0" distR="0">
+          <wp:inline distT="0" distB="0" distL="0" distR="0" wp14:anchorId="23C2AF72" wp14:editId="7ED16B65">
             <wp:extent cx="5486400" cy="3380509"/>
             <wp:effectExtent l="0" t="0" r="0" b="0"/>
             <wp:docPr id="6" name="Picture 6"/>
@@ -16418,7 +16291,7 @@
         <w:spacing w:line="240" w:lineRule="auto"/>
         <w:jc w:val="left"/>
       </w:pPr>
-      <w:bookmarkStart w:id="41" w:name="_Toc243664643"/>
+      <w:bookmarkStart w:id="41" w:name="_Toc243671721"/>
       <w:r>
         <w:rPr>
           <w:rFonts w:eastAsia="黑体"/>
@@ -16522,7 +16395,7 @@
         <w:t xml:space="preserve"> Quorum </w:t>
       </w:r>
       <w:r>
-        <w:t>投票机制对比：课件推导了</w:t>
+        <w:t>投票机制对比：课件详细推导了</w:t>
       </w:r>
       <w:r>
         <w:t xml:space="preserve"> Gifford </w:t>
@@ -16547,13 +16420,7 @@
         <w:t>[1, 4]</w:t>
       </w:r>
       <w:r>
-        <w:t>：配置</w:t>
-      </w:r>
-      <w:r>
-        <w:t xml:space="preserve"> N </w:t>
-      </w:r>
-      <w:r>
-        <w:t>个副本，满足读写法定人数约束</w:t>
+        <w:t>。需要特别指出的是，文献与教学中常见的法定人数约束条件</w:t>
       </w:r>
       <w:r>
         <w:t xml:space="preserve"> $R + W &gt; N$ </w:t>
@@ -16565,7 +16432,43 @@
         <w:t xml:space="preserve"> $W &gt; N/2$</w:t>
       </w:r>
       <w:r>
-        <w:t>。</w:t>
+        <w:t>，属于所有副本赋予相同权重（等权投票，即每个副本计</w:t>
+      </w:r>
+      <w:r>
+        <w:t xml:space="preserve"> 1 </w:t>
+      </w:r>
+      <w:r>
+        <w:t>票）时的特化简化条件；而在一般的加权投票模型（</w:t>
+      </w:r>
+      <w:r>
+        <w:t>Weighted Voting</w:t>
+      </w:r>
+      <w:r>
+        <w:t>）中，各个节点可依据性能或网络可靠性分配不同票数权重</w:t>
+      </w:r>
+      <w:r>
+        <w:t xml:space="preserve"> $v_i$</w:t>
+      </w:r>
+      <w:r>
+        <w:t>，法定人数要求读票数总和与写票数总和严格大于总票数</w:t>
+      </w:r>
+      <w:r>
+        <w:t xml:space="preserve"> $V$</w:t>
+      </w:r>
+      <w:r>
+        <w:t>（即</w:t>
+      </w:r>
+      <w:r>
+        <w:t xml:space="preserve"> $R + W &gt; V$</w:t>
+      </w:r>
+      <w:r>
+        <w:t>），且写票数严格大于总票数的一半（</w:t>
+      </w:r>
+      <w:r>
+        <w:t>$W &gt; V/2$</w:t>
+      </w:r>
+      <w:r>
+        <w:t>）。</w:t>
       </w:r>
       <w:r>
         <w:t xml:space="preserve">Quorum </w:t>
@@ -16604,7 +16507,7 @@
         <w:spacing w:before="46" w:after="46" w:line="240" w:lineRule="auto"/>
         <w:jc w:val="left"/>
       </w:pPr>
-      <w:bookmarkStart w:id="42" w:name="_Toc243664644"/>
+      <w:bookmarkStart w:id="42" w:name="_Toc243671722"/>
       <w:r>
         <w:rPr>
           <w:rFonts w:eastAsia="黑体"/>
@@ -16627,7 +16530,7 @@
         <w:spacing w:before="46" w:after="46" w:line="240" w:lineRule="auto"/>
         <w:jc w:val="left"/>
       </w:pPr>
-      <w:bookmarkStart w:id="43" w:name="_Toc243664645"/>
+      <w:bookmarkStart w:id="43" w:name="_Toc243671723"/>
       <w:r>
         <w:rPr>
           <w:rFonts w:ascii="Times New Roman" w:eastAsia="黑体" w:hAnsi="Times New Roman" w:cs="Times New Roman"/>
@@ -16734,12 +16637,13 @@
         <w:spacing w:before="46" w:after="46" w:line="240" w:lineRule="auto"/>
         <w:jc w:val="left"/>
       </w:pPr>
-      <w:bookmarkStart w:id="44" w:name="_Toc243664646"/>
+      <w:bookmarkStart w:id="44" w:name="_Toc243671724"/>
       <w:r>
         <w:rPr>
           <w:rFonts w:ascii="Times New Roman" w:eastAsia="黑体" w:hAnsi="Times New Roman" w:cs="Times New Roman"/>
           <w:sz w:val="28"/>
         </w:rPr>
+        <w:lastRenderedPageBreak/>
         <w:t xml:space="preserve">8.2 </w:t>
       </w:r>
       <w:r>
@@ -16757,7 +16661,7 @@
         <w:spacing w:line="240" w:lineRule="auto"/>
         <w:jc w:val="left"/>
       </w:pPr>
-      <w:bookmarkStart w:id="45" w:name="_Toc243664647"/>
+      <w:bookmarkStart w:id="45" w:name="_Toc243671725"/>
       <w:r>
         <w:rPr>
           <w:rFonts w:eastAsia="黑体"/>
@@ -16770,21 +16674,7 @@
           <w:rFonts w:eastAsia="黑体"/>
           <w:sz w:val="24"/>
         </w:rPr>
-        <w:t>网络超时分析与基于</w:t>
-      </w:r>
-      <w:r>
-        <w:rPr>
-          <w:rFonts w:eastAsia="黑体"/>
-          <w:sz w:val="24"/>
-        </w:rPr>
-        <w:t xml:space="preserve"> operationId </w:t>
-      </w:r>
-      <w:r>
-        <w:rPr>
-          <w:rFonts w:eastAsia="黑体"/>
-          <w:sz w:val="24"/>
-        </w:rPr>
-        <w:t>的幂等重试机制</w:t>
+        <w:t>网络超时分析与基于操作唯一标识的幂等重试机制</w:t>
       </w:r>
       <w:bookmarkEnd w:id="45"/>
     </w:p>
@@ -16819,11 +16709,7 @@
         <w:t>[1, 2]</w:t>
       </w:r>
       <w:r>
-        <w:t>。当客户端</w:t>
-      </w:r>
-      <w:r>
-        <w:lastRenderedPageBreak/>
-        <w:t>发起掷骰请求且未在预期时间内收到确认响应时，实际物理网络中可能存在三种不同情况：</w:t>
+        <w:t>。当客户端发起掷骰请求且未在预期时间内收到确认响应时，实际物理网络中可能存在三种不同情况：</w:t>
       </w:r>
       <w:r>
         <w:t xml:space="preserve">① </w:t>
@@ -16850,49 +16736,13 @@
         <w:ind w:firstLineChars="200" w:firstLine="420"/>
       </w:pPr>
       <w:r>
-        <w:t>针对上述网络不确定性，系统设计了基于</w:t>
-      </w:r>
-      <w:r>
-        <w:t xml:space="preserve"> operationId </w:t>
-      </w:r>
-      <w:r>
-        <w:t>的幂等重试机制：客户端在构造写操作请求时附加全局唯一标识符</w:t>
-      </w:r>
-      <w:r>
-        <w:t xml:space="preserve"> operationId</w:t>
-      </w:r>
-      <w:r>
-        <w:t>（如</w:t>
-      </w:r>
-      <w:r>
-        <w:t xml:space="preserve"> UUIDv4</w:t>
-      </w:r>
-      <w:r>
-        <w:t>）；服务端在持久化存储中，将业务状态变更与该</w:t>
-      </w:r>
-      <w:r>
-        <w:t xml:space="preserve"> operationId </w:t>
-      </w:r>
-      <w:r>
-        <w:t>在同一个本地事务边界内原子提交。当客户端因超时发起重试时，强制复用相同的</w:t>
-      </w:r>
-      <w:r>
-        <w:t xml:space="preserve"> operationId</w:t>
-      </w:r>
-      <w:r>
-        <w:t>。服务端收到重试请求后，优先检索幂等记录：若命中已提交记录，则直接返回原事务执行结果，避免重复执行掷骰或数据变更；若检测到相同</w:t>
-      </w:r>
-      <w:r>
-        <w:t xml:space="preserve"> operationId </w:t>
-      </w:r>
-      <w:r>
-        <w:t>正在被并发事务处理，则提示客户端稍后重试。该机制以服务端原子事务与幂等记录为支撑，保证了网络超时重试时的操作安全性。其生效前提在于：客户端必须生成并维护全局唯一的</w:t>
-      </w:r>
-      <w:r>
-        <w:t xml:space="preserve"> operationId</w:t>
-      </w:r>
-      <w:r>
-        <w:t>，服务端必须在同一个原子事务中持久化操作输出，且幂等记录在时效期内不被提前清理。</w:t>
+        <w:t>针对上述网络不确定性，系统设计了基于唯一标识符（</w:t>
+      </w:r>
+      <w:r>
+        <w:t>`operationId`</w:t>
+      </w:r>
+      <w:r>
+        <w:t>）的幂等重试机制：客户端在构造写操作请求时附加全局唯一标识符；服务端在持久化存储中，将业务状态变更与该操作标识在同一个本地事务边界内原子提交。当客户端因超时发起重试时，强制复用相同的操作标识。服务端收到重试请求后，优先检索幂等记录：若命中已提交记录，则直接返回原事务执行结果，避免重复执行掷骰或数据变更；若检测到相同标识正在被并发事务处理，则提示客户端稍后重试。该机制以服务端原子事务与幂等记录为支撑，保证了网络超时重试时的操作安全性。其生效前提在于：客户端必须生成并维护全局唯一的操作标识，服务端在原子事务中保证操作与结果记录的持久性。</w:t>
       </w:r>
     </w:p>
     <w:p>
@@ -16901,7 +16751,7 @@
         <w:spacing w:line="240" w:lineRule="auto"/>
         <w:jc w:val="left"/>
       </w:pPr>
-      <w:bookmarkStart w:id="46" w:name="_Toc243664648"/>
+      <w:bookmarkStart w:id="46" w:name="_Toc243671726"/>
       <w:r>
         <w:rPr>
           <w:rFonts w:eastAsia="黑体"/>
@@ -16949,6 +16799,7 @@
     </w:p>
     <w:p>
       <w:pPr>
+        <w:keepNext/>
         <w:spacing w:before="46" w:after="46"/>
         <w:jc w:val="center"/>
       </w:pPr>
@@ -16957,7 +16808,7 @@
           <w:noProof/>
         </w:rPr>
         <w:drawing>
-          <wp:inline distT="0" distB="0" distL="0" distR="0">
+          <wp:inline distT="0" distB="0" distL="0" distR="0" wp14:anchorId="431210BB" wp14:editId="2718A655">
             <wp:extent cx="5486400" cy="3450210"/>
             <wp:effectExtent l="0" t="0" r="0" b="0"/>
             <wp:docPr id="7" name="Picture 7"/>
@@ -17038,37 +16889,13 @@
         <w:t>1</w:t>
       </w:r>
       <w:r>
-        <w:t>）重连发起与准入鉴权：客户端检测到底层网络连接断开后，启动指数退避重连。重新建连后发送重连信令，携带身份凭证、</w:t>
-      </w:r>
-      <w:r>
-        <w:t xml:space="preserve">`roomId` </w:t>
-      </w:r>
-      <w:r>
-        <w:t>以及本端最后成功处理的事件序号</w:t>
-      </w:r>
-      <w:r>
-        <w:t xml:space="preserve"> `last_seq`</w:t>
-      </w:r>
-      <w:r>
-        <w:t>；服务端首先重新验证该用户的房间准入与权限（防止断网期间被移出房间）；（</w:t>
+        <w:t>）重连发起与准入重新核验：客户端检测到底层网络连接断开后，启动指数退避重连。重新建连后发送重连信令，携带身份凭证、房间标识以及本端最后成功处理的事件序号；服务端首先重新验证该用户的房间准入与权限（防止断网期间被移出房间）；（</w:t>
       </w:r>
       <w:r>
         <w:t>2</w:t>
       </w:r>
       <w:r>
-        <w:t>）落后步数计算与决策分流：服务端提取当前房间最新权威事件序号</w:t>
-      </w:r>
-      <w:r>
-        <w:t xml:space="preserve"> `current_seq`</w:t>
-      </w:r>
-      <w:r>
-        <w:t>，计算落后步数</w:t>
-      </w:r>
-      <w:r>
-        <w:t xml:space="preserve"> Delta = current_seq - last_seq</w:t>
-      </w:r>
-      <w:r>
-        <w:t>：</w:t>
+        <w:t>）差分恢复决策分流：服务端对比房间最新权威事件序号与客户端上报序号：</w:t>
       </w:r>
       <w:r>
         <w:t xml:space="preserve">① </w:t>
@@ -17080,29 +16907,17 @@
         <w:t>Delta Sync</w:t>
       </w:r>
       <w:r>
-        <w:t>，轻度落后）：若</w:t>
-      </w:r>
-      <w:r>
-        <w:t xml:space="preserve"> Delta </w:t>
-      </w:r>
-      <w:r>
-        <w:t>处于服务端保留的历史事件窗口内，服务端直接从增量事件记录中检索区间</w:t>
-      </w:r>
-      <w:r>
-        <w:t xml:space="preserve"> `(last_seq, current_seq]` </w:t>
-      </w:r>
-      <w:r>
-        <w:t>的有序事件列表，经当前战争迷雾视野权限过滤后，打包推回给客户端按序回放补齐画面，网络传输开销较低；</w:t>
+        <w:t>，轻度落后）：若落后步数处于服务</w:t>
+      </w:r>
+      <w:r>
+        <w:lastRenderedPageBreak/>
+        <w:t>端保留的历史事件窗口内，服务端直接检索落后区间的有序增量事件列表，经当前战争迷雾视野权限过滤后，打包推回给客户端按序回放补齐画面，网络传输开销较低；</w:t>
       </w:r>
       <w:r>
         <w:t xml:space="preserve">② </w:t>
       </w:r>
       <w:r>
-        <w:t>全量快照</w:t>
-      </w:r>
-      <w:r>
-        <w:lastRenderedPageBreak/>
-        <w:t>重置路径（</w:t>
+        <w:t>全量快照重置路径（</w:t>
       </w:r>
       <w:r>
         <w:t>Snapshot Reset</w:t>
@@ -17120,10 +16935,7 @@
         <w:t>Distributed Snapshot</w:t>
       </w:r>
       <w:r>
-        <w:t>）状态截</w:t>
-      </w:r>
-      <w:r>
-        <w:t>面理论</w:t>
+        <w:t>）状态截面理论</w:t>
       </w:r>
       <w:r>
         <w:t xml:space="preserve"> </w:t>
@@ -17165,6 +16977,7 @@
     </w:p>
     <w:p>
       <w:pPr>
+        <w:keepNext/>
         <w:spacing w:before="46" w:after="46"/>
         <w:jc w:val="center"/>
       </w:pPr>
@@ -17208,6 +17021,8 @@
       </w:tblGrid>
       <w:tr>
         <w:trPr>
+          <w:cantSplit/>
+          <w:tblHeader/>
           <w:jc w:val="center"/>
         </w:trPr>
         <w:tc>
@@ -17297,6 +17112,7 @@
       </w:tr>
       <w:tr>
         <w:trPr>
+          <w:cantSplit/>
           <w:jc w:val="center"/>
         </w:trPr>
         <w:tc>
@@ -17388,6 +17204,7 @@
       </w:tr>
       <w:tr>
         <w:trPr>
+          <w:cantSplit/>
           <w:jc w:val="center"/>
         </w:trPr>
         <w:tc>
@@ -17491,6 +17308,7 @@
       </w:tr>
       <w:tr>
         <w:trPr>
+          <w:cantSplit/>
           <w:jc w:val="center"/>
         </w:trPr>
         <w:tc>
@@ -17582,6 +17400,7 @@
       </w:tr>
       <w:tr>
         <w:trPr>
+          <w:cantSplit/>
           <w:jc w:val="center"/>
         </w:trPr>
         <w:tc>
@@ -17685,6 +17504,7 @@
       </w:tr>
       <w:tr>
         <w:trPr>
+          <w:cantSplit/>
           <w:jc w:val="center"/>
         </w:trPr>
         <w:tc>
@@ -17798,7 +17618,7 @@
         <w:spacing w:line="240" w:lineRule="auto"/>
         <w:jc w:val="left"/>
       </w:pPr>
-      <w:bookmarkStart w:id="47" w:name="_Toc243664649"/>
+      <w:bookmarkStart w:id="47" w:name="_Toc243671727"/>
       <w:r>
         <w:rPr>
           <w:rFonts w:eastAsia="黑体"/>
@@ -17891,7 +17711,7 @@
         <w:spacing w:line="240" w:lineRule="auto"/>
         <w:jc w:val="left"/>
       </w:pPr>
-      <w:bookmarkStart w:id="48" w:name="_Toc243664650"/>
+      <w:bookmarkStart w:id="48" w:name="_Toc243671728"/>
       <w:r>
         <w:rPr>
           <w:rFonts w:eastAsia="黑体"/>
@@ -17940,7 +17760,11 @@
         <w:t>Fault Tolerance</w:t>
       </w:r>
       <w:r>
-        <w:t>）关于容错理论与分布式提交协议的权威论述</w:t>
+        <w:t>）关于容错理论与分布式提交协议的权威</w:t>
+      </w:r>
+      <w:r>
+        <w:lastRenderedPageBreak/>
+        <w:t>论述</w:t>
       </w:r>
       <w:r>
         <w:t xml:space="preserve"> </w:t>
@@ -17977,11 +17801,7 @@
         <w:t>Crash-Stop</w:t>
       </w:r>
       <w:r>
-        <w:t>）、</w:t>
-      </w:r>
-      <w:r>
-        <w:lastRenderedPageBreak/>
-        <w:t>崩溃恢复故障（</w:t>
+        <w:t>）、崩溃恢复故障（</w:t>
       </w:r>
       <w:r>
         <w:t>Crash-Recovery</w:t>
@@ -18246,7 +18066,7 @@
         <w:spacing w:before="46" w:after="46" w:line="240" w:lineRule="auto"/>
         <w:jc w:val="left"/>
       </w:pPr>
-      <w:bookmarkStart w:id="49" w:name="_Toc243664651"/>
+      <w:bookmarkStart w:id="49" w:name="_Toc243671729"/>
       <w:r>
         <w:rPr>
           <w:rFonts w:eastAsia="黑体"/>
@@ -18269,7 +18089,7 @@
         <w:spacing w:before="46" w:after="46" w:line="240" w:lineRule="auto"/>
         <w:jc w:val="left"/>
       </w:pPr>
-      <w:bookmarkStart w:id="50" w:name="_Toc243664652"/>
+      <w:bookmarkStart w:id="50" w:name="_Toc243671730"/>
       <w:r>
         <w:rPr>
           <w:rFonts w:ascii="Times New Roman" w:eastAsia="黑体" w:hAnsi="Times New Roman" w:cs="Times New Roman"/>
@@ -18340,6 +18160,7 @@
     </w:p>
     <w:p>
       <w:pPr>
+        <w:keepNext/>
         <w:spacing w:before="46" w:after="46"/>
         <w:jc w:val="center"/>
       </w:pPr>
@@ -18390,13 +18211,15 @@
         <w:tblLook w:val="04A0" w:firstRow="1" w:lastRow="0" w:firstColumn="1" w:lastColumn="0" w:noHBand="0" w:noVBand="1"/>
       </w:tblPr>
       <w:tblGrid>
-        <w:gridCol w:w="1770"/>
-        <w:gridCol w:w="2042"/>
-        <w:gridCol w:w="2485"/>
-        <w:gridCol w:w="2225"/>
+        <w:gridCol w:w="1763"/>
+        <w:gridCol w:w="2024"/>
+        <w:gridCol w:w="2413"/>
+        <w:gridCol w:w="2322"/>
       </w:tblGrid>
       <w:tr>
         <w:trPr>
+          <w:cantSplit/>
+          <w:tblHeader/>
           <w:jc w:val="center"/>
         </w:trPr>
         <w:tc>
@@ -18486,6 +18309,7 @@
       </w:tr>
       <w:tr>
         <w:trPr>
+          <w:cantSplit/>
           <w:jc w:val="center"/>
         </w:trPr>
         <w:tc>
@@ -18571,6 +18395,7 @@
       </w:tr>
       <w:tr>
         <w:trPr>
+          <w:cantSplit/>
           <w:jc w:val="center"/>
         </w:trPr>
         <w:tc>
@@ -18586,6 +18411,7 @@
               <w:rPr>
                 <w:sz w:val="18"/>
               </w:rPr>
+              <w:lastRenderedPageBreak/>
               <w:t>Chapter 2 Architectures</w:t>
             </w:r>
           </w:p>
@@ -18656,14 +18482,7 @@
               <w:rPr>
                 <w:sz w:val="18"/>
               </w:rPr>
-              <w:t>服务器架构；按房间分配权威协作；事件驱动</w:t>
-            </w:r>
-            <w:r>
-              <w:rPr>
-                <w:sz w:val="18"/>
-              </w:rPr>
-              <w:lastRenderedPageBreak/>
-              <w:t>异步通知</w:t>
+              <w:t>服务器架构；按房间分配权威协作；事件驱动异步通知</w:t>
             </w:r>
           </w:p>
         </w:tc>
@@ -18680,7 +18499,6 @@
               <w:rPr>
                 <w:sz w:val="18"/>
               </w:rPr>
-              <w:lastRenderedPageBreak/>
               <w:t>分析并排除全</w:t>
             </w:r>
             <w:r>
@@ -18693,20 +18511,14 @@
               <w:rPr>
                 <w:sz w:val="18"/>
               </w:rPr>
-              <w:t>架构（基于防作弊与迷雾要</w:t>
-            </w:r>
-            <w:r>
-              <w:rPr>
-                <w:sz w:val="18"/>
-              </w:rPr>
-              <w:lastRenderedPageBreak/>
-              <w:t>求）</w:t>
+              <w:t>架构（基于防作弊与迷雾要求）</w:t>
             </w:r>
           </w:p>
         </w:tc>
       </w:tr>
       <w:tr>
         <w:trPr>
+          <w:cantSplit/>
           <w:jc w:val="center"/>
         </w:trPr>
         <w:tc>
@@ -18722,7 +18534,6 @@
               <w:rPr>
                 <w:sz w:val="18"/>
               </w:rPr>
-              <w:lastRenderedPageBreak/>
               <w:t>Chapter 3 Processes</w:t>
             </w:r>
           </w:p>
@@ -18781,6 +18592,7 @@
       </w:tr>
       <w:tr>
         <w:trPr>
+          <w:cantSplit/>
           <w:jc w:val="center"/>
         </w:trPr>
         <w:tc>
@@ -18878,6 +18690,7 @@
       </w:tr>
       <w:tr>
         <w:trPr>
+          <w:cantSplit/>
           <w:jc w:val="center"/>
         </w:trPr>
         <w:tc>
@@ -18939,7 +18752,7 @@
               <w:rPr>
                 <w:sz w:val="18"/>
               </w:rPr>
-              <w:t>实体全局唯一；邀请短码哈希；全局路由目录服务</w:t>
+              <w:t>实体全局唯一（非安全授权）；邀请短码哈希；路由目录</w:t>
             </w:r>
           </w:p>
         </w:tc>
@@ -18956,31 +18769,32 @@
               <w:rPr>
                 <w:sz w:val="18"/>
               </w:rPr>
-              <w:t>论证当前百级房间规模下自建</w:t>
-            </w:r>
-            <w:r>
-              <w:rPr>
-                <w:sz w:val="18"/>
-              </w:rPr>
-              <w:t xml:space="preserve"> Chord </w:t>
-            </w:r>
-            <w:r>
-              <w:rPr>
-                <w:sz w:val="18"/>
-              </w:rPr>
-              <w:t>成本过高，排除</w:t>
-            </w:r>
-            <w:r>
-              <w:rPr>
-                <w:sz w:val="18"/>
-              </w:rPr>
-              <w:t xml:space="preserve"> DHT</w:t>
+              <w:t>强调随机</w:t>
+            </w:r>
+            <w:r>
+              <w:rPr>
+                <w:sz w:val="18"/>
+              </w:rPr>
+              <w:t xml:space="preserve"> ID </w:t>
+            </w:r>
+            <w:r>
+              <w:rPr>
+                <w:sz w:val="18"/>
+              </w:rPr>
+              <w:t>不能替代权限验证；百级规模排除自建</w:t>
+            </w:r>
+            <w:r>
+              <w:rPr>
+                <w:sz w:val="18"/>
+              </w:rPr>
+              <w:t xml:space="preserve"> Chord</w:t>
             </w:r>
           </w:p>
         </w:tc>
       </w:tr>
       <w:tr>
         <w:trPr>
+          <w:cantSplit/>
           <w:jc w:val="center"/>
         </w:trPr>
         <w:tc>
@@ -19025,7 +18839,7 @@
               <w:rPr>
                 <w:sz w:val="18"/>
               </w:rPr>
-              <w:t>时钟、互斥算法</w:t>
+              <w:t>时钟与权威定序区分、互斥算法</w:t>
             </w:r>
           </w:p>
         </w:tc>
@@ -19042,7 +18856,7 @@
               <w:rPr>
                 <w:sz w:val="18"/>
               </w:rPr>
-              <w:t>单房间权威串行排队</w:t>
+              <w:t>单房间权威单调事件序号定序</w:t>
             </w:r>
             <w:r>
               <w:rPr>
@@ -19054,7 +18868,19 @@
               <w:rPr>
                 <w:sz w:val="18"/>
               </w:rPr>
-              <w:t>标记乐观版本控制；投骰因果序</w:t>
+              <w:t>乐观版本校验；</w:t>
+            </w:r>
+            <w:r>
+              <w:rPr>
+                <w:sz w:val="18"/>
+              </w:rPr>
+              <w:t xml:space="preserve">Lamport </w:t>
+            </w:r>
+            <w:r>
+              <w:rPr>
+                <w:sz w:val="18"/>
+              </w:rPr>
+              <w:t>时钟阐释因果序</w:t>
             </w:r>
           </w:p>
         </w:tc>
@@ -19071,13 +18897,26 @@
               <w:rPr>
                 <w:sz w:val="18"/>
               </w:rPr>
-              <w:t>避免依赖物理时钟绝对同步；排除消息开销巨大的分布式互斥</w:t>
+              <w:t>明确区分理论因果序与服务端权威序号；说明</w:t>
+            </w:r>
+            <w:r>
+              <w:rPr>
+                <w:sz w:val="18"/>
+              </w:rPr>
+              <w:t xml:space="preserve"> Ricart-Agrawala 2(N-1) </w:t>
+            </w:r>
+            <w:r>
+              <w:rPr>
+                <w:sz w:val="18"/>
+              </w:rPr>
+              <w:t>消息开销过大并排除</w:t>
             </w:r>
           </w:p>
         </w:tc>
       </w:tr>
       <w:tr>
         <w:trPr>
+          <w:cantSplit/>
           <w:jc w:val="center"/>
         </w:trPr>
         <w:tc>
@@ -19110,13 +18949,13 @@
               <w:rPr>
                 <w:sz w:val="18"/>
               </w:rPr>
-              <w:t>顺序一致性、客户中心读自身写与乐观预览边界、主备与</w:t>
-            </w:r>
-            <w:r>
-              <w:rPr>
-                <w:sz w:val="18"/>
-              </w:rPr>
-              <w:t>Quorum</w:t>
+              <w:t>顺序一致性、读自身写与乐观预览区分、主备复制与</w:t>
+            </w:r>
+            <w:r>
+              <w:rPr>
+                <w:sz w:val="18"/>
+              </w:rPr>
+              <w:t xml:space="preserve"> Quorum</w:t>
             </w:r>
           </w:p>
         </w:tc>
@@ -19133,7 +18972,7 @@
               <w:rPr>
                 <w:sz w:val="18"/>
               </w:rPr>
-              <w:t>核心数据顺序一致；已提交写保障读自身写；前端推测预览解耦；战争迷雾零信任投影</w:t>
+              <w:t>核心数据顺序一致；已提交写保障读自身写；前端推测预览解耦；迷雾零信任投影</w:t>
             </w:r>
           </w:p>
         </w:tc>
@@ -19150,25 +18989,26 @@
               <w:rPr>
                 <w:sz w:val="18"/>
               </w:rPr>
-              <w:t>采用成熟主备异步复制候选；指明</w:t>
-            </w:r>
-            <w:r>
-              <w:rPr>
-                <w:sz w:val="18"/>
-              </w:rPr>
-              <w:t xml:space="preserve"> Quorum </w:t>
-            </w:r>
-            <w:r>
-              <w:rPr>
-                <w:sz w:val="18"/>
-              </w:rPr>
-              <w:t>适用边界</w:t>
+              <w:t>采用成熟主备异步复制候选；指明等权</w:t>
+            </w:r>
+            <w:r>
+              <w:rPr>
+                <w:sz w:val="18"/>
+              </w:rPr>
+              <w:t xml:space="preserve"> Quorum (R+W&gt;N, W&gt;N/2) </w:t>
+            </w:r>
+            <w:r>
+              <w:rPr>
+                <w:sz w:val="18"/>
+              </w:rPr>
+              <w:t>与加权模型的区别及适用边界</w:t>
             </w:r>
           </w:p>
         </w:tc>
       </w:tr>
       <w:tr>
         <w:trPr>
+          <w:cantSplit/>
           <w:jc w:val="center"/>
         </w:trPr>
         <w:tc>
@@ -19236,13 +19076,7 @@
               <w:rPr>
                 <w:sz w:val="18"/>
               </w:rPr>
-              <w:t xml:space="preserve">operationId </w:t>
-            </w:r>
-            <w:r>
-              <w:rPr>
-                <w:sz w:val="18"/>
-              </w:rPr>
-              <w:t>幂等记录；差分状态恢复流程；租约防脑裂讨论</w:t>
+              <w:t>唯一操作标识幂等记录；差分状态恢复流程；租约防脑裂讨论</w:t>
             </w:r>
           </w:p>
         </w:tc>
@@ -19282,7 +19116,7 @@
         <w:spacing w:before="46" w:after="46" w:line="240" w:lineRule="auto"/>
         <w:jc w:val="left"/>
       </w:pPr>
-      <w:bookmarkStart w:id="51" w:name="_Toc243664653"/>
+      <w:bookmarkStart w:id="51" w:name="_Toc243671731"/>
       <w:r>
         <w:rPr>
           <w:rFonts w:ascii="Times New Roman" w:eastAsia="黑体" w:hAnsi="Times New Roman" w:cs="Times New Roman"/>
@@ -19399,7 +19233,7 @@
         <w:spacing w:before="46" w:after="46" w:line="240" w:lineRule="auto"/>
         <w:jc w:val="left"/>
       </w:pPr>
-      <w:bookmarkStart w:id="52" w:name="_Toc243664654"/>
+      <w:bookmarkStart w:id="52" w:name="_Toc243671732"/>
       <w:r>
         <w:rPr>
           <w:rFonts w:ascii="Times New Roman" w:eastAsia="黑体" w:hAnsi="Times New Roman" w:cs="Times New Roman"/>
@@ -19428,7 +19262,11 @@
         <w:t>1</w:t>
       </w:r>
       <w:r>
-        <w:t>）性能指标属于未经测试的设计假设与目标：单房间最多</w:t>
+        <w:t>）</w:t>
+      </w:r>
+      <w:r>
+        <w:lastRenderedPageBreak/>
+        <w:t>性能指标属于未经测试的设计假设与目标：单房间最多</w:t>
       </w:r>
       <w:r>
         <w:t xml:space="preserve"> 8 </w:t>
@@ -19482,11 +19320,7 @@
         <w:t>2</w:t>
       </w:r>
       <w:r>
-        <w:t>）异步复制下的数据丢失风险：若持久化存储采用主备异步流复制机制，在主节点发生突发硬件掉电或严重故障时，尚未复制到备</w:t>
-      </w:r>
-      <w:r>
-        <w:lastRenderedPageBreak/>
-        <w:t>用节点的数据存在丢失风险，系统不承诺绝对的</w:t>
+        <w:t>）异步复制下的数据丢失风险：若持久化存储采用主备异步流复制机制，在主节点发生突发硬件掉电或严重故障时，尚未复制到备用节点的数据存在丢失风险，系统不承诺绝对的</w:t>
       </w:r>
       <w:r>
         <w:t>‘</w:t>
@@ -19516,10 +19350,7 @@
         <w:t>4</w:t>
       </w:r>
       <w:r>
-        <w:t>）单房间权威排队与系统水平扩展的权衡：单房间由单一权威节点协调简化了并发控制，但若未来出现超大规模房间或极高频标记更新，该单点可能成为局部吞吐瓶颈，需在后续详细设计中进一步评估水平切分策略。上述局限性</w:t>
-      </w:r>
-      <w:r>
-        <w:t>为系统后续的工程原型实现、性能基准测试与详细架构设计提供了明确的方向。</w:t>
+        <w:t>）单房间权威排队与系统水平扩展的权衡：单房间由单一权威节点协调简化了并发控制，但若未来出现超大规模房间或极高频标记更新，该单点可能成为局部吞吐瓶颈，需在后续详细设计中进一步评估水平切分策略。上述局限性为系统后续的工程原型实现、性能基准测试与详细架构设计提供了明确的方向。</w:t>
       </w:r>
     </w:p>
     <w:p>
@@ -19528,7 +19359,7 @@
         <w:spacing w:before="46" w:after="46" w:line="240" w:lineRule="auto"/>
         <w:jc w:val="left"/>
       </w:pPr>
-      <w:bookmarkStart w:id="53" w:name="_Toc243664655"/>
+      <w:bookmarkStart w:id="53" w:name="_Toc243671733"/>
       <w:r>
         <w:rPr>
           <w:rFonts w:eastAsia="黑体"/>
@@ -19768,57 +19599,6 @@
         </w:rPr>
         <w:t>[15] BIRMAN K P, JOSEPH T A. Reliable communication in the presence of failures [J]. ACM Transactions on Computer Systems, 1987, 5(1): 47-76.</w:t>
       </w:r>
-    </w:p>
-    <w:p>
-      <w:pPr>
-        <w:pStyle w:val="1"/>
-        <w:spacing w:before="46" w:after="46"/>
-        <w:rPr>
-          <w:rFonts w:eastAsia="仿宋"/>
-          <w:color w:val="FF0000"/>
-          <w:sz w:val="28"/>
-          <w:szCs w:val="28"/>
-        </w:rPr>
-      </w:pPr>
-      <w:bookmarkStart w:id="54" w:name="_Toc243664656"/>
-      <w:r>
-        <w:rPr>
-          <w:rFonts w:eastAsia="仿宋" w:hint="eastAsia"/>
-          <w:color w:val="FF0000"/>
-          <w:sz w:val="28"/>
-          <w:szCs w:val="28"/>
-        </w:rPr>
-        <w:t>附录</w:t>
-      </w:r>
-      <w:r>
-        <w:rPr>
-          <w:rFonts w:eastAsia="仿宋" w:hint="eastAsia"/>
-          <w:color w:val="FF0000"/>
-          <w:sz w:val="28"/>
-          <w:szCs w:val="28"/>
-        </w:rPr>
-        <w:t xml:space="preserve"> (</w:t>
-      </w:r>
-      <w:r>
-        <w:rPr>
-          <w:rFonts w:ascii="宋体" w:hAnsi="宋体" w:cs="宋体" w:hint="eastAsia"/>
-          <w:color w:val="FF0000"/>
-          <w:kern w:val="0"/>
-          <w:sz w:val="21"/>
-          <w:szCs w:val="21"/>
-        </w:rPr>
-        <w:t>得分栏勿填</w:t>
-      </w:r>
-      <w:r>
-        <w:rPr>
-          <w:rFonts w:eastAsia="仿宋" w:hint="eastAsia"/>
-          <w:color w:val="FF0000"/>
-          <w:sz w:val="28"/>
-          <w:szCs w:val="28"/>
-        </w:rPr>
-        <w:t>)</w:t>
-      </w:r>
-      <w:bookmarkEnd w:id="54"/>
     </w:p>
     <w:p>
       <w:pPr>
@@ -19837,6 +19617,58 @@
           <w:docGrid w:type="lines" w:linePitch="312"/>
         </w:sectPr>
       </w:pPr>
+    </w:p>
+    <w:p>
+      <w:pPr>
+        <w:pStyle w:val="1"/>
+        <w:spacing w:before="46" w:after="46"/>
+        <w:rPr>
+          <w:rFonts w:eastAsia="仿宋"/>
+          <w:color w:val="FF0000"/>
+          <w:sz w:val="28"/>
+          <w:szCs w:val="28"/>
+        </w:rPr>
+      </w:pPr>
+      <w:bookmarkStart w:id="54" w:name="_Toc243671734"/>
+      <w:r>
+        <w:rPr>
+          <w:rFonts w:eastAsia="仿宋" w:hint="eastAsia"/>
+          <w:color w:val="FF0000"/>
+          <w:sz w:val="28"/>
+          <w:szCs w:val="28"/>
+        </w:rPr>
+        <w:lastRenderedPageBreak/>
+        <w:t>附录</w:t>
+      </w:r>
+      <w:r>
+        <w:rPr>
+          <w:rFonts w:eastAsia="仿宋" w:hint="eastAsia"/>
+          <w:color w:val="FF0000"/>
+          <w:sz w:val="28"/>
+          <w:szCs w:val="28"/>
+        </w:rPr>
+        <w:t xml:space="preserve"> (</w:t>
+      </w:r>
+      <w:r>
+        <w:rPr>
+          <w:rFonts w:ascii="宋体" w:hAnsi="宋体" w:cs="宋体" w:hint="eastAsia"/>
+          <w:color w:val="FF0000"/>
+          <w:kern w:val="0"/>
+          <w:sz w:val="21"/>
+          <w:szCs w:val="21"/>
+        </w:rPr>
+        <w:t>得分栏勿填</w:t>
+      </w:r>
+      <w:r>
+        <w:rPr>
+          <w:rFonts w:eastAsia="仿宋" w:hint="eastAsia"/>
+          <w:color w:val="FF0000"/>
+          <w:sz w:val="28"/>
+          <w:szCs w:val="28"/>
+        </w:rPr>
+        <w:t>)</w:t>
+      </w:r>
+      <w:bookmarkEnd w:id="54"/>
     </w:p>
     <w:tbl>
       <w:tblPr>
@@ -19911,7 +19743,6 @@
                 <w:sz w:val="15"/>
                 <w:szCs w:val="21"/>
               </w:rPr>
-              <w:lastRenderedPageBreak/>
               <w:t>组名</w:t>
             </w:r>
           </w:p>

</xml_diff>

<commit_message>
docs: fix table 6-1 pagination, cover spacing and technical consistency
</commit_message>
<xml_diff>
--- a/output/Distributed_Design_Report_Draft_v2.docx
+++ b/output/Distributed_Design_Report_Draft_v2.docx
@@ -210,14 +210,15 @@
         <w:tblLook w:val="04A0" w:firstRow="1" w:lastRow="0" w:firstColumn="1" w:lastColumn="0" w:noHBand="0" w:noVBand="1"/>
       </w:tblPr>
       <w:tblGrid>
-        <w:gridCol w:w="2130"/>
-        <w:gridCol w:w="2130"/>
-        <w:gridCol w:w="2131"/>
-        <w:gridCol w:w="2131"/>
+        <w:gridCol w:w="2121"/>
+        <w:gridCol w:w="2117"/>
+        <w:gridCol w:w="2118"/>
+        <w:gridCol w:w="2118"/>
       </w:tblGrid>
       <w:tr>
         <w:trPr>
-          <w:trHeight w:hRule="exact" w:val="567"/>
+          <w:cantSplit/>
+          <w:trHeight w:val="640"/>
         </w:trPr>
         <w:tc>
           <w:tcPr>
@@ -306,6 +307,12 @@
         <w:tc>
           <w:tcPr>
             <w:tcW w:w="2131" w:type="dxa"/>
+            <w:tcMar>
+              <w:top w:w="80" w:type="dxa"/>
+              <w:left w:w="60" w:type="dxa"/>
+              <w:bottom w:w="80" w:type="dxa"/>
+              <w:right w:w="60" w:type="dxa"/>
+            </w:tcMar>
             <w:vAlign w:val="center"/>
           </w:tcPr>
           <w:p>
@@ -330,6 +337,7 @@
       </w:tr>
       <w:tr>
         <w:trPr>
+          <w:cantSplit/>
           <w:trHeight w:hRule="exact" w:val="567"/>
         </w:trPr>
         <w:tc>
@@ -457,6 +465,7 @@
       </w:tr>
       <w:tr>
         <w:trPr>
+          <w:cantSplit/>
           <w:trHeight w:hRule="exact" w:val="567"/>
         </w:trPr>
         <w:tc>
@@ -597,6 +606,7 @@
       </w:tr>
       <w:tr>
         <w:trPr>
+          <w:cantSplit/>
           <w:trHeight w:hRule="exact" w:val="567"/>
         </w:trPr>
         <w:tc>
@@ -737,6 +747,7 @@
       </w:tr>
       <w:tr>
         <w:trPr>
+          <w:cantSplit/>
           <w:trHeight w:hRule="exact" w:val="567"/>
         </w:trPr>
         <w:tc>
@@ -877,6 +888,7 @@
       </w:tr>
       <w:tr>
         <w:trPr>
+          <w:cantSplit/>
           <w:trHeight w:val="2025"/>
         </w:trPr>
         <w:tc>
@@ -985,6 +997,7 @@
       </w:tr>
       <w:tr>
         <w:trPr>
+          <w:cantSplit/>
           <w:trHeight w:hRule="exact" w:val="567"/>
         </w:trPr>
         <w:tc>
@@ -1064,6 +1077,7 @@
       </w:tr>
       <w:tr>
         <w:trPr>
+          <w:cantSplit/>
           <w:trHeight w:hRule="exact" w:val="567"/>
         </w:trPr>
         <w:tc>
@@ -1179,6 +1193,9 @@
         <w:gridCol w:w="1043"/>
       </w:tblGrid>
       <w:tr>
+        <w:trPr>
+          <w:cantSplit/>
+        </w:trPr>
         <w:tc>
           <w:tcPr>
             <w:tcW w:w="7479" w:type="dxa"/>
@@ -1253,6 +1270,9 @@
         </w:tc>
       </w:tr>
       <w:tr>
+        <w:trPr>
+          <w:cantSplit/>
+        </w:trPr>
         <w:tc>
           <w:tcPr>
             <w:tcW w:w="7479" w:type="dxa"/>
@@ -1339,6 +1359,9 @@
         </w:tc>
       </w:tr>
       <w:tr>
+        <w:trPr>
+          <w:cantSplit/>
+        </w:trPr>
         <w:tc>
           <w:tcPr>
             <w:tcW w:w="7479" w:type="dxa"/>
@@ -1419,6 +1442,9 @@
         </w:tc>
       </w:tr>
       <w:tr>
+        <w:trPr>
+          <w:cantSplit/>
+        </w:trPr>
         <w:tc>
           <w:tcPr>
             <w:tcW w:w="7479" w:type="dxa"/>
@@ -1485,6 +1511,9 @@
         </w:tc>
       </w:tr>
       <w:tr>
+        <w:trPr>
+          <w:cantSplit/>
+        </w:trPr>
         <w:tc>
           <w:tcPr>
             <w:tcW w:w="7479" w:type="dxa"/>
@@ -1551,6 +1580,9 @@
         </w:tc>
       </w:tr>
       <w:tr>
+        <w:trPr>
+          <w:cantSplit/>
+        </w:trPr>
         <w:tc>
           <w:tcPr>
             <w:tcW w:w="7479" w:type="dxa"/>
@@ -1631,6 +1663,9 @@
         </w:tc>
       </w:tr>
       <w:tr>
+        <w:trPr>
+          <w:cantSplit/>
+        </w:trPr>
         <w:tc>
           <w:tcPr>
             <w:tcW w:w="8522" w:type="dxa"/>
@@ -1671,8 +1706,6 @@
           <w:bCs w:val="0"/>
           <w:color w:val="auto"/>
           <w:kern w:val="2"/>
-          <w:sz w:val="21"/>
-          <w:szCs w:val="24"/>
           <w:lang w:eastAsia="zh-CN"/>
         </w:rPr>
         <w:id w:val="1154722329"/>
@@ -1685,6 +1718,8 @@
         <w:rPr>
           <w:rFonts w:eastAsia="宋体"/>
           <w:noProof/>
+          <w:sz w:val="21"/>
+          <w:szCs w:val="24"/>
         </w:rPr>
       </w:sdtEndPr>
       <w:sdtContent>
@@ -1736,7 +1771,7 @@
           <w:r>
             <w:fldChar w:fldCharType="separate"/>
           </w:r>
-          <w:hyperlink w:anchor="_Toc243671680" w:history="1">
+          <w:hyperlink w:anchor="_Toc243673169" w:history="1">
             <w:r>
               <w:rPr>
                 <w:rStyle w:val="ab"/>
@@ -1782,7 +1817,7 @@
                 <w:noProof/>
                 <w:webHidden/>
               </w:rPr>
-              <w:instrText>PAGEREF _Toc243671680 \h</w:instrText>
+              <w:instrText>PAGEREF _Toc243673169 \h</w:instrText>
             </w:r>
             <w:r>
               <w:rPr>
@@ -1838,7 +1873,7 @@
               <w14:ligatures w14:val="standardContextual"/>
             </w:rPr>
           </w:pPr>
-          <w:hyperlink w:anchor="_Toc243671681" w:history="1">
+          <w:hyperlink w:anchor="_Toc243673170" w:history="1">
             <w:r>
               <w:rPr>
                 <w:rStyle w:val="ab"/>
@@ -1884,7 +1919,7 @@
                 <w:noProof/>
                 <w:webHidden/>
               </w:rPr>
-              <w:instrText>PAGEREF _Toc243671681 \h</w:instrText>
+              <w:instrText>PAGEREF _Toc243673170 \h</w:instrText>
             </w:r>
             <w:r>
               <w:rPr>
@@ -1940,7 +1975,7 @@
               <w14:ligatures w14:val="standardContextual"/>
             </w:rPr>
           </w:pPr>
-          <w:hyperlink w:anchor="_Toc243671682" w:history="1">
+          <w:hyperlink w:anchor="_Toc243673171" w:history="1">
             <w:r>
               <w:rPr>
                 <w:rStyle w:val="ab"/>
@@ -1986,7 +2021,7 @@
                 <w:noProof/>
                 <w:webHidden/>
               </w:rPr>
-              <w:instrText>PAGEREF _Toc243671682 \h</w:instrText>
+              <w:instrText>PAGEREF _Toc243673171 \h</w:instrText>
             </w:r>
             <w:r>
               <w:rPr>
@@ -2042,7 +2077,7 @@
               <w14:ligatures w14:val="standardContextual"/>
             </w:rPr>
           </w:pPr>
-          <w:hyperlink w:anchor="_Toc243671683" w:history="1">
+          <w:hyperlink w:anchor="_Toc243673172" w:history="1">
             <w:r>
               <w:rPr>
                 <w:rStyle w:val="ab"/>
@@ -2088,7 +2123,7 @@
                 <w:noProof/>
                 <w:webHidden/>
               </w:rPr>
-              <w:instrText>PAGEREF _Toc243671683 \h</w:instrText>
+              <w:instrText>PAGEREF _Toc243673172 \h</w:instrText>
             </w:r>
             <w:r>
               <w:rPr>
@@ -2144,7 +2179,7 @@
               <w14:ligatures w14:val="standardContextual"/>
             </w:rPr>
           </w:pPr>
-          <w:hyperlink w:anchor="_Toc243671684" w:history="1">
+          <w:hyperlink w:anchor="_Toc243673173" w:history="1">
             <w:r>
               <w:rPr>
                 <w:rStyle w:val="ab"/>
@@ -2190,7 +2225,7 @@
                 <w:noProof/>
                 <w:webHidden/>
               </w:rPr>
-              <w:instrText>PAGEREF _Toc243671684 \h</w:instrText>
+              <w:instrText>PAGEREF _Toc243673173 \h</w:instrText>
             </w:r>
             <w:r>
               <w:rPr>
@@ -2246,7 +2281,7 @@
               <w14:ligatures w14:val="standardContextual"/>
             </w:rPr>
           </w:pPr>
-          <w:hyperlink w:anchor="_Toc243671685" w:history="1">
+          <w:hyperlink w:anchor="_Toc243673174" w:history="1">
             <w:r>
               <w:rPr>
                 <w:rStyle w:val="ab"/>
@@ -2292,7 +2327,7 @@
                 <w:noProof/>
                 <w:webHidden/>
               </w:rPr>
-              <w:instrText>PAGEREF _Toc243671685 \h</w:instrText>
+              <w:instrText>PAGEREF _Toc243673174 \h</w:instrText>
             </w:r>
             <w:r>
               <w:rPr>
@@ -2348,7 +2383,7 @@
               <w14:ligatures w14:val="standardContextual"/>
             </w:rPr>
           </w:pPr>
-          <w:hyperlink w:anchor="_Toc243671686" w:history="1">
+          <w:hyperlink w:anchor="_Toc243673175" w:history="1">
             <w:r>
               <w:rPr>
                 <w:rStyle w:val="ab"/>
@@ -2394,7 +2429,7 @@
                 <w:noProof/>
                 <w:webHidden/>
               </w:rPr>
-              <w:instrText>PAGEREF _Toc243671686 \h</w:instrText>
+              <w:instrText>PAGEREF _Toc243673175 \h</w:instrText>
             </w:r>
             <w:r>
               <w:rPr>
@@ -2450,7 +2485,7 @@
               <w14:ligatures w14:val="standardContextual"/>
             </w:rPr>
           </w:pPr>
-          <w:hyperlink w:anchor="_Toc243671687" w:history="1">
+          <w:hyperlink w:anchor="_Toc243673176" w:history="1">
             <w:r>
               <w:rPr>
                 <w:rStyle w:val="ab"/>
@@ -2496,7 +2531,7 @@
                 <w:noProof/>
                 <w:webHidden/>
               </w:rPr>
-              <w:instrText>PAGEREF _Toc243671687 \h</w:instrText>
+              <w:instrText>PAGEREF _Toc243673176 \h</w:instrText>
             </w:r>
             <w:r>
               <w:rPr>
@@ -2552,7 +2587,7 @@
               <w14:ligatures w14:val="standardContextual"/>
             </w:rPr>
           </w:pPr>
-          <w:hyperlink w:anchor="_Toc243671688" w:history="1">
+          <w:hyperlink w:anchor="_Toc243673177" w:history="1">
             <w:r>
               <w:rPr>
                 <w:rStyle w:val="ab"/>
@@ -2598,7 +2633,7 @@
                 <w:noProof/>
                 <w:webHidden/>
               </w:rPr>
-              <w:instrText>PAGEREF _Toc243671688 \h</w:instrText>
+              <w:instrText>PAGEREF _Toc243673177 \h</w:instrText>
             </w:r>
             <w:r>
               <w:rPr>
@@ -2654,7 +2689,7 @@
               <w14:ligatures w14:val="standardContextual"/>
             </w:rPr>
           </w:pPr>
-          <w:hyperlink w:anchor="_Toc243671689" w:history="1">
+          <w:hyperlink w:anchor="_Toc243673178" w:history="1">
             <w:r>
               <w:rPr>
                 <w:rStyle w:val="ab"/>
@@ -2716,7 +2751,7 @@
                 <w:noProof/>
                 <w:webHidden/>
               </w:rPr>
-              <w:instrText>PAGEREF _Toc243671689 \h</w:instrText>
+              <w:instrText>PAGEREF _Toc243673178 \h</w:instrText>
             </w:r>
             <w:r>
               <w:rPr>
@@ -2772,7 +2807,7 @@
               <w14:ligatures w14:val="standardContextual"/>
             </w:rPr>
           </w:pPr>
-          <w:hyperlink w:anchor="_Toc243671690" w:history="1">
+          <w:hyperlink w:anchor="_Toc243673179" w:history="1">
             <w:r>
               <w:rPr>
                 <w:rStyle w:val="ab"/>
@@ -2818,7 +2853,7 @@
                 <w:noProof/>
                 <w:webHidden/>
               </w:rPr>
-              <w:instrText>PAGEREF _Toc243671690 \h</w:instrText>
+              <w:instrText>PAGEREF _Toc243673179 \h</w:instrText>
             </w:r>
             <w:r>
               <w:rPr>
@@ -2874,7 +2909,7 @@
               <w14:ligatures w14:val="standardContextual"/>
             </w:rPr>
           </w:pPr>
-          <w:hyperlink w:anchor="_Toc243671691" w:history="1">
+          <w:hyperlink w:anchor="_Toc243673180" w:history="1">
             <w:r>
               <w:rPr>
                 <w:rStyle w:val="ab"/>
@@ -2952,7 +2987,7 @@
                 <w:noProof/>
                 <w:webHidden/>
               </w:rPr>
-              <w:instrText>PAGEREF _Toc243671691 \h</w:instrText>
+              <w:instrText>PAGEREF _Toc243673180 \h</w:instrText>
             </w:r>
             <w:r>
               <w:rPr>
@@ -3008,7 +3043,7 @@
               <w14:ligatures w14:val="standardContextual"/>
             </w:rPr>
           </w:pPr>
-          <w:hyperlink w:anchor="_Toc243671692" w:history="1">
+          <w:hyperlink w:anchor="_Toc243673181" w:history="1">
             <w:r>
               <w:rPr>
                 <w:rStyle w:val="ab"/>
@@ -3054,7 +3089,7 @@
                 <w:noProof/>
                 <w:webHidden/>
               </w:rPr>
-              <w:instrText>PAGEREF _Toc243671692 \h</w:instrText>
+              <w:instrText>PAGEREF _Toc243673181 \h</w:instrText>
             </w:r>
             <w:r>
               <w:rPr>
@@ -3110,7 +3145,7 @@
               <w14:ligatures w14:val="standardContextual"/>
             </w:rPr>
           </w:pPr>
-          <w:hyperlink w:anchor="_Toc243671693" w:history="1">
+          <w:hyperlink w:anchor="_Toc243673182" w:history="1">
             <w:r>
               <w:rPr>
                 <w:rStyle w:val="ab"/>
@@ -3156,7 +3191,7 @@
                 <w:noProof/>
                 <w:webHidden/>
               </w:rPr>
-              <w:instrText>PAGEREF _Toc243671693 \h</w:instrText>
+              <w:instrText>PAGEREF _Toc243673182 \h</w:instrText>
             </w:r>
             <w:r>
               <w:rPr>
@@ -3212,7 +3247,7 @@
               <w14:ligatures w14:val="standardContextual"/>
             </w:rPr>
           </w:pPr>
-          <w:hyperlink w:anchor="_Toc243671694" w:history="1">
+          <w:hyperlink w:anchor="_Toc243673183" w:history="1">
             <w:r>
               <w:rPr>
                 <w:rStyle w:val="ab"/>
@@ -3258,7 +3293,7 @@
                 <w:noProof/>
                 <w:webHidden/>
               </w:rPr>
-              <w:instrText>PAGEREF _Toc243671694 \h</w:instrText>
+              <w:instrText>PAGEREF _Toc243673183 \h</w:instrText>
             </w:r>
             <w:r>
               <w:rPr>
@@ -3314,7 +3349,7 @@
               <w14:ligatures w14:val="standardContextual"/>
             </w:rPr>
           </w:pPr>
-          <w:hyperlink w:anchor="_Toc243671695" w:history="1">
+          <w:hyperlink w:anchor="_Toc243673184" w:history="1">
             <w:r>
               <w:rPr>
                 <w:rStyle w:val="ab"/>
@@ -3360,7 +3395,7 @@
                 <w:noProof/>
                 <w:webHidden/>
               </w:rPr>
-              <w:instrText>PAGEREF _Toc243671695 \h</w:instrText>
+              <w:instrText>PAGEREF _Toc243673184 \h</w:instrText>
             </w:r>
             <w:r>
               <w:rPr>
@@ -3416,7 +3451,7 @@
               <w14:ligatures w14:val="standardContextual"/>
             </w:rPr>
           </w:pPr>
-          <w:hyperlink w:anchor="_Toc243671696" w:history="1">
+          <w:hyperlink w:anchor="_Toc243673185" w:history="1">
             <w:r>
               <w:rPr>
                 <w:rStyle w:val="ab"/>
@@ -3462,7 +3497,7 @@
                 <w:noProof/>
                 <w:webHidden/>
               </w:rPr>
-              <w:instrText>PAGEREF _Toc243671696 \h</w:instrText>
+              <w:instrText>PAGEREF _Toc243673185 \h</w:instrText>
             </w:r>
             <w:r>
               <w:rPr>
@@ -3518,7 +3553,7 @@
               <w14:ligatures w14:val="standardContextual"/>
             </w:rPr>
           </w:pPr>
-          <w:hyperlink w:anchor="_Toc243671697" w:history="1">
+          <w:hyperlink w:anchor="_Toc243673186" w:history="1">
             <w:r>
               <w:rPr>
                 <w:rStyle w:val="ab"/>
@@ -3564,7 +3599,7 @@
                 <w:noProof/>
                 <w:webHidden/>
               </w:rPr>
-              <w:instrText>PAGEREF _Toc243671697 \h</w:instrText>
+              <w:instrText>PAGEREF _Toc243673186 \h</w:instrText>
             </w:r>
             <w:r>
               <w:rPr>
@@ -3620,7 +3655,7 @@
               <w14:ligatures w14:val="standardContextual"/>
             </w:rPr>
           </w:pPr>
-          <w:hyperlink w:anchor="_Toc243671698" w:history="1">
+          <w:hyperlink w:anchor="_Toc243673187" w:history="1">
             <w:r>
               <w:rPr>
                 <w:rStyle w:val="ab"/>
@@ -3666,7 +3701,7 @@
                 <w:noProof/>
                 <w:webHidden/>
               </w:rPr>
-              <w:instrText>PAGEREF _Toc243671698 \h</w:instrText>
+              <w:instrText>PAGEREF _Toc243673187 \h</w:instrText>
             </w:r>
             <w:r>
               <w:rPr>
@@ -3722,7 +3757,7 @@
               <w14:ligatures w14:val="standardContextual"/>
             </w:rPr>
           </w:pPr>
-          <w:hyperlink w:anchor="_Toc243671699" w:history="1">
+          <w:hyperlink w:anchor="_Toc243673188" w:history="1">
             <w:r>
               <w:rPr>
                 <w:rStyle w:val="ab"/>
@@ -3768,7 +3803,7 @@
                 <w:noProof/>
                 <w:webHidden/>
               </w:rPr>
-              <w:instrText>PAGEREF _Toc243671699 \h</w:instrText>
+              <w:instrText>PAGEREF _Toc243673188 \h</w:instrText>
             </w:r>
             <w:r>
               <w:rPr>
@@ -3824,7 +3859,7 @@
               <w14:ligatures w14:val="standardContextual"/>
             </w:rPr>
           </w:pPr>
-          <w:hyperlink w:anchor="_Toc243671700" w:history="1">
+          <w:hyperlink w:anchor="_Toc243673189" w:history="1">
             <w:r>
               <w:rPr>
                 <w:rStyle w:val="ab"/>
@@ -3870,7 +3905,7 @@
                 <w:noProof/>
                 <w:webHidden/>
               </w:rPr>
-              <w:instrText>PAGEREF _Toc243671700 \h</w:instrText>
+              <w:instrText>PAGEREF _Toc243673189 \h</w:instrText>
             </w:r>
             <w:r>
               <w:rPr>
@@ -3926,7 +3961,7 @@
               <w14:ligatures w14:val="standardContextual"/>
             </w:rPr>
           </w:pPr>
-          <w:hyperlink w:anchor="_Toc243671701" w:history="1">
+          <w:hyperlink w:anchor="_Toc243673190" w:history="1">
             <w:r>
               <w:rPr>
                 <w:rStyle w:val="ab"/>
@@ -3988,7 +4023,7 @@
                 <w:noProof/>
                 <w:webHidden/>
               </w:rPr>
-              <w:instrText>PAGEREF _Toc243671701 \h</w:instrText>
+              <w:instrText>PAGEREF _Toc243673190 \h</w:instrText>
             </w:r>
             <w:r>
               <w:rPr>
@@ -4044,7 +4079,7 @@
               <w14:ligatures w14:val="standardContextual"/>
             </w:rPr>
           </w:pPr>
-          <w:hyperlink w:anchor="_Toc243671702" w:history="1">
+          <w:hyperlink w:anchor="_Toc243673191" w:history="1">
             <w:r>
               <w:rPr>
                 <w:rStyle w:val="ab"/>
@@ -4090,7 +4125,7 @@
                 <w:noProof/>
                 <w:webHidden/>
               </w:rPr>
-              <w:instrText>PAGEREF _Toc243671702 \h</w:instrText>
+              <w:instrText>PAGEREF _Toc243673191 \h</w:instrText>
             </w:r>
             <w:r>
               <w:rPr>
@@ -4146,7 +4181,7 @@
               <w14:ligatures w14:val="standardContextual"/>
             </w:rPr>
           </w:pPr>
-          <w:hyperlink w:anchor="_Toc243671703" w:history="1">
+          <w:hyperlink w:anchor="_Toc243673192" w:history="1">
             <w:r>
               <w:rPr>
                 <w:rStyle w:val="ab"/>
@@ -4208,7 +4243,7 @@
                 <w:noProof/>
                 <w:webHidden/>
               </w:rPr>
-              <w:instrText>PAGEREF _Toc243671703 \h</w:instrText>
+              <w:instrText>PAGEREF _Toc243673192 \h</w:instrText>
             </w:r>
             <w:r>
               <w:rPr>
@@ -4264,7 +4299,7 @@
               <w14:ligatures w14:val="standardContextual"/>
             </w:rPr>
           </w:pPr>
-          <w:hyperlink w:anchor="_Toc243671704" w:history="1">
+          <w:hyperlink w:anchor="_Toc243673193" w:history="1">
             <w:r>
               <w:rPr>
                 <w:rStyle w:val="ab"/>
@@ -4310,7 +4345,7 @@
                 <w:noProof/>
                 <w:webHidden/>
               </w:rPr>
-              <w:instrText>PAGEREF _Toc243671704 \h</w:instrText>
+              <w:instrText>PAGEREF _Toc243673193 \h</w:instrText>
             </w:r>
             <w:r>
               <w:rPr>
@@ -4366,7 +4401,7 @@
               <w14:ligatures w14:val="standardContextual"/>
             </w:rPr>
           </w:pPr>
-          <w:hyperlink w:anchor="_Toc243671705" w:history="1">
+          <w:hyperlink w:anchor="_Toc243673194" w:history="1">
             <w:r>
               <w:rPr>
                 <w:rStyle w:val="ab"/>
@@ -4412,7 +4447,7 @@
                 <w:noProof/>
                 <w:webHidden/>
               </w:rPr>
-              <w:instrText>PAGEREF _Toc243671705 \h</w:instrText>
+              <w:instrText>PAGEREF _Toc243673194 \h</w:instrText>
             </w:r>
             <w:r>
               <w:rPr>
@@ -4468,7 +4503,7 @@
               <w14:ligatures w14:val="standardContextual"/>
             </w:rPr>
           </w:pPr>
-          <w:hyperlink w:anchor="_Toc243671706" w:history="1">
+          <w:hyperlink w:anchor="_Toc243673195" w:history="1">
             <w:r>
               <w:rPr>
                 <w:rStyle w:val="ab"/>
@@ -4514,7 +4549,7 @@
                 <w:noProof/>
                 <w:webHidden/>
               </w:rPr>
-              <w:instrText>PAGEREF _Toc243671706 \h</w:instrText>
+              <w:instrText>PAGEREF _Toc243673195 \h</w:instrText>
             </w:r>
             <w:r>
               <w:rPr>
@@ -4570,7 +4605,7 @@
               <w14:ligatures w14:val="standardContextual"/>
             </w:rPr>
           </w:pPr>
-          <w:hyperlink w:anchor="_Toc243671707" w:history="1">
+          <w:hyperlink w:anchor="_Toc243673196" w:history="1">
             <w:r>
               <w:rPr>
                 <w:rStyle w:val="ab"/>
@@ -4616,7 +4651,7 @@
                 <w:noProof/>
                 <w:webHidden/>
               </w:rPr>
-              <w:instrText>PAGEREF _Toc243671707 \h</w:instrText>
+              <w:instrText>PAGEREF _Toc243673196 \h</w:instrText>
             </w:r>
             <w:r>
               <w:rPr>
@@ -4672,7 +4707,7 @@
               <w14:ligatures w14:val="standardContextual"/>
             </w:rPr>
           </w:pPr>
-          <w:hyperlink w:anchor="_Toc243671708" w:history="1">
+          <w:hyperlink w:anchor="_Toc243673197" w:history="1">
             <w:r>
               <w:rPr>
                 <w:rStyle w:val="ab"/>
@@ -4718,7 +4753,7 @@
                 <w:noProof/>
                 <w:webHidden/>
               </w:rPr>
-              <w:instrText>PAGEREF _Toc243671708 \h</w:instrText>
+              <w:instrText>PAGEREF _Toc243673197 \h</w:instrText>
             </w:r>
             <w:r>
               <w:rPr>
@@ -4774,7 +4809,7 @@
               <w14:ligatures w14:val="standardContextual"/>
             </w:rPr>
           </w:pPr>
-          <w:hyperlink w:anchor="_Toc243671709" w:history="1">
+          <w:hyperlink w:anchor="_Toc243673198" w:history="1">
             <w:r>
               <w:rPr>
                 <w:rStyle w:val="ab"/>
@@ -4836,7 +4871,7 @@
                 <w:noProof/>
                 <w:webHidden/>
               </w:rPr>
-              <w:instrText>PAGEREF _Toc243671709 \h</w:instrText>
+              <w:instrText>PAGEREF _Toc243673198 \h</w:instrText>
             </w:r>
             <w:r>
               <w:rPr>
@@ -4892,7 +4927,7 @@
               <w14:ligatures w14:val="standardContextual"/>
             </w:rPr>
           </w:pPr>
-          <w:hyperlink w:anchor="_Toc243671710" w:history="1">
+          <w:hyperlink w:anchor="_Toc243673199" w:history="1">
             <w:r>
               <w:rPr>
                 <w:rStyle w:val="ab"/>
@@ -4938,7 +4973,7 @@
                 <w:noProof/>
                 <w:webHidden/>
               </w:rPr>
-              <w:instrText>PAGEREF _Toc243671710 \h</w:instrText>
+              <w:instrText>PAGEREF _Toc243673199 \h</w:instrText>
             </w:r>
             <w:r>
               <w:rPr>
@@ -4994,7 +5029,7 @@
               <w14:ligatures w14:val="standardContextual"/>
             </w:rPr>
           </w:pPr>
-          <w:hyperlink w:anchor="_Toc243671711" w:history="1">
+          <w:hyperlink w:anchor="_Toc243673200" w:history="1">
             <w:r>
               <w:rPr>
                 <w:rStyle w:val="ab"/>
@@ -5040,7 +5075,7 @@
                 <w:noProof/>
                 <w:webHidden/>
               </w:rPr>
-              <w:instrText>PAGEREF _Toc243671711 \h</w:instrText>
+              <w:instrText>PAGEREF _Toc243673200 \h</w:instrText>
             </w:r>
             <w:r>
               <w:rPr>
@@ -5096,7 +5131,7 @@
               <w14:ligatures w14:val="standardContextual"/>
             </w:rPr>
           </w:pPr>
-          <w:hyperlink w:anchor="_Toc243671712" w:history="1">
+          <w:hyperlink w:anchor="_Toc243673201" w:history="1">
             <w:r>
               <w:rPr>
                 <w:rStyle w:val="ab"/>
@@ -5142,7 +5177,7 @@
                 <w:noProof/>
                 <w:webHidden/>
               </w:rPr>
-              <w:instrText>PAGEREF _Toc243671712 \h</w:instrText>
+              <w:instrText>PAGEREF _Toc243673201 \h</w:instrText>
             </w:r>
             <w:r>
               <w:rPr>
@@ -5198,7 +5233,7 @@
               <w14:ligatures w14:val="standardContextual"/>
             </w:rPr>
           </w:pPr>
-          <w:hyperlink w:anchor="_Toc243671713" w:history="1">
+          <w:hyperlink w:anchor="_Toc243673202" w:history="1">
             <w:r>
               <w:rPr>
                 <w:rStyle w:val="ab"/>
@@ -5244,7 +5279,7 @@
                 <w:noProof/>
                 <w:webHidden/>
               </w:rPr>
-              <w:instrText>PAGEREF _Toc243671713 \h</w:instrText>
+              <w:instrText>PAGEREF _Toc243673202 \h</w:instrText>
             </w:r>
             <w:r>
               <w:rPr>
@@ -5300,7 +5335,7 @@
               <w14:ligatures w14:val="standardContextual"/>
             </w:rPr>
           </w:pPr>
-          <w:hyperlink w:anchor="_Toc243671714" w:history="1">
+          <w:hyperlink w:anchor="_Toc243673203" w:history="1">
             <w:r>
               <w:rPr>
                 <w:rStyle w:val="ab"/>
@@ -5346,7 +5381,7 @@
                 <w:noProof/>
                 <w:webHidden/>
               </w:rPr>
-              <w:instrText>PAGEREF _Toc243671714 \h</w:instrText>
+              <w:instrText>PAGEREF _Toc243673203 \h</w:instrText>
             </w:r>
             <w:r>
               <w:rPr>
@@ -5402,7 +5437,7 @@
               <w14:ligatures w14:val="standardContextual"/>
             </w:rPr>
           </w:pPr>
-          <w:hyperlink w:anchor="_Toc243671715" w:history="1">
+          <w:hyperlink w:anchor="_Toc243673204" w:history="1">
             <w:r>
               <w:rPr>
                 <w:rStyle w:val="ab"/>
@@ -5448,7 +5483,7 @@
                 <w:noProof/>
                 <w:webHidden/>
               </w:rPr>
-              <w:instrText>PAGEREF _Toc243671715 \h</w:instrText>
+              <w:instrText>PAGEREF _Toc243673204 \h</w:instrText>
             </w:r>
             <w:r>
               <w:rPr>
@@ -5504,7 +5539,7 @@
               <w14:ligatures w14:val="standardContextual"/>
             </w:rPr>
           </w:pPr>
-          <w:hyperlink w:anchor="_Toc243671716" w:history="1">
+          <w:hyperlink w:anchor="_Toc243673205" w:history="1">
             <w:r>
               <w:rPr>
                 <w:rStyle w:val="ab"/>
@@ -5550,7 +5585,7 @@
                 <w:noProof/>
                 <w:webHidden/>
               </w:rPr>
-              <w:instrText>PAGEREF _Toc243671716 \h</w:instrText>
+              <w:instrText>PAGEREF _Toc243673205 \h</w:instrText>
             </w:r>
             <w:r>
               <w:rPr>
@@ -5606,7 +5641,7 @@
               <w14:ligatures w14:val="standardContextual"/>
             </w:rPr>
           </w:pPr>
-          <w:hyperlink w:anchor="_Toc243671717" w:history="1">
+          <w:hyperlink w:anchor="_Toc243673206" w:history="1">
             <w:r>
               <w:rPr>
                 <w:rStyle w:val="ab"/>
@@ -5652,7 +5687,7 @@
                 <w:noProof/>
                 <w:webHidden/>
               </w:rPr>
-              <w:instrText>PAGEREF _Toc243671717 \h</w:instrText>
+              <w:instrText>PAGEREF _Toc243673206 \h</w:instrText>
             </w:r>
             <w:r>
               <w:rPr>
@@ -5708,7 +5743,7 @@
               <w14:ligatures w14:val="standardContextual"/>
             </w:rPr>
           </w:pPr>
-          <w:hyperlink w:anchor="_Toc243671718" w:history="1">
+          <w:hyperlink w:anchor="_Toc243673207" w:history="1">
             <w:r>
               <w:rPr>
                 <w:rStyle w:val="ab"/>
@@ -5754,7 +5789,7 @@
                 <w:noProof/>
                 <w:webHidden/>
               </w:rPr>
-              <w:instrText>PAGEREF _Toc243671718 \h</w:instrText>
+              <w:instrText>PAGEREF _Toc243673207 \h</w:instrText>
             </w:r>
             <w:r>
               <w:rPr>
@@ -5810,7 +5845,7 @@
               <w14:ligatures w14:val="standardContextual"/>
             </w:rPr>
           </w:pPr>
-          <w:hyperlink w:anchor="_Toc243671719" w:history="1">
+          <w:hyperlink w:anchor="_Toc243673208" w:history="1">
             <w:r>
               <w:rPr>
                 <w:rStyle w:val="ab"/>
@@ -5856,7 +5891,7 @@
                 <w:noProof/>
                 <w:webHidden/>
               </w:rPr>
-              <w:instrText>PAGEREF _Toc243671719 \h</w:instrText>
+              <w:instrText>PAGEREF _Toc243673208 \h</w:instrText>
             </w:r>
             <w:r>
               <w:rPr>
@@ -5912,7 +5947,7 @@
               <w14:ligatures w14:val="standardContextual"/>
             </w:rPr>
           </w:pPr>
-          <w:hyperlink w:anchor="_Toc243671720" w:history="1">
+          <w:hyperlink w:anchor="_Toc243673209" w:history="1">
             <w:r>
               <w:rPr>
                 <w:rStyle w:val="ab"/>
@@ -5958,7 +5993,7 @@
                 <w:noProof/>
                 <w:webHidden/>
               </w:rPr>
-              <w:instrText>PAGEREF _Toc243671720 \h</w:instrText>
+              <w:instrText>PAGEREF _Toc243673209 \h</w:instrText>
             </w:r>
             <w:r>
               <w:rPr>
@@ -6014,7 +6049,7 @@
               <w14:ligatures w14:val="standardContextual"/>
             </w:rPr>
           </w:pPr>
-          <w:hyperlink w:anchor="_Toc243671721" w:history="1">
+          <w:hyperlink w:anchor="_Toc243673210" w:history="1">
             <w:r>
               <w:rPr>
                 <w:rStyle w:val="ab"/>
@@ -6076,7 +6111,7 @@
                 <w:noProof/>
                 <w:webHidden/>
               </w:rPr>
-              <w:instrText>PAGEREF _Toc243671721 \h</w:instrText>
+              <w:instrText>PAGEREF _Toc243673210 \h</w:instrText>
             </w:r>
             <w:r>
               <w:rPr>
@@ -6132,7 +6167,7 @@
               <w14:ligatures w14:val="standardContextual"/>
             </w:rPr>
           </w:pPr>
-          <w:hyperlink w:anchor="_Toc243671722" w:history="1">
+          <w:hyperlink w:anchor="_Toc243673211" w:history="1">
             <w:r>
               <w:rPr>
                 <w:rStyle w:val="ab"/>
@@ -6178,7 +6213,7 @@
                 <w:noProof/>
                 <w:webHidden/>
               </w:rPr>
-              <w:instrText>PAGEREF _Toc243671722 \h</w:instrText>
+              <w:instrText>PAGEREF _Toc243673211 \h</w:instrText>
             </w:r>
             <w:r>
               <w:rPr>
@@ -6208,7 +6243,7 @@
                 <w:noProof/>
                 <w:webHidden/>
               </w:rPr>
-              <w:t>20</w:t>
+              <w:t>21</w:t>
             </w:r>
             <w:r>
               <w:rPr>
@@ -6234,7 +6269,7 @@
               <w14:ligatures w14:val="standardContextual"/>
             </w:rPr>
           </w:pPr>
-          <w:hyperlink w:anchor="_Toc243671723" w:history="1">
+          <w:hyperlink w:anchor="_Toc243673212" w:history="1">
             <w:r>
               <w:rPr>
                 <w:rStyle w:val="ab"/>
@@ -6280,7 +6315,7 @@
                 <w:noProof/>
                 <w:webHidden/>
               </w:rPr>
-              <w:instrText>PAGEREF _Toc243671723 \h</w:instrText>
+              <w:instrText>PAGEREF _Toc243673212 \h</w:instrText>
             </w:r>
             <w:r>
               <w:rPr>
@@ -6310,7 +6345,7 @@
                 <w:noProof/>
                 <w:webHidden/>
               </w:rPr>
-              <w:t>20</w:t>
+              <w:t>21</w:t>
             </w:r>
             <w:r>
               <w:rPr>
@@ -6336,7 +6371,7 @@
               <w14:ligatures w14:val="standardContextual"/>
             </w:rPr>
           </w:pPr>
-          <w:hyperlink w:anchor="_Toc243671724" w:history="1">
+          <w:hyperlink w:anchor="_Toc243673213" w:history="1">
             <w:r>
               <w:rPr>
                 <w:rStyle w:val="ab"/>
@@ -6382,7 +6417,7 @@
                 <w:noProof/>
                 <w:webHidden/>
               </w:rPr>
-              <w:instrText>PAGEREF _Toc243671724 \h</w:instrText>
+              <w:instrText>PAGEREF _Toc243673213 \h</w:instrText>
             </w:r>
             <w:r>
               <w:rPr>
@@ -6438,7 +6473,7 @@
               <w14:ligatures w14:val="standardContextual"/>
             </w:rPr>
           </w:pPr>
-          <w:hyperlink w:anchor="_Toc243671725" w:history="1">
+          <w:hyperlink w:anchor="_Toc243673214" w:history="1">
             <w:r>
               <w:rPr>
                 <w:rStyle w:val="ab"/>
@@ -6484,7 +6519,7 @@
                 <w:noProof/>
                 <w:webHidden/>
               </w:rPr>
-              <w:instrText>PAGEREF _Toc243671725 \h</w:instrText>
+              <w:instrText>PAGEREF _Toc243673214 \h</w:instrText>
             </w:r>
             <w:r>
               <w:rPr>
@@ -6540,7 +6575,7 @@
               <w14:ligatures w14:val="standardContextual"/>
             </w:rPr>
           </w:pPr>
-          <w:hyperlink w:anchor="_Toc243671726" w:history="1">
+          <w:hyperlink w:anchor="_Toc243673215" w:history="1">
             <w:r>
               <w:rPr>
                 <w:rStyle w:val="ab"/>
@@ -6602,7 +6637,7 @@
                 <w:noProof/>
                 <w:webHidden/>
               </w:rPr>
-              <w:instrText>PAGEREF _Toc243671726 \h</w:instrText>
+              <w:instrText>PAGEREF _Toc243673215 \h</w:instrText>
             </w:r>
             <w:r>
               <w:rPr>
@@ -6658,7 +6693,7 @@
               <w14:ligatures w14:val="standardContextual"/>
             </w:rPr>
           </w:pPr>
-          <w:hyperlink w:anchor="_Toc243671727" w:history="1">
+          <w:hyperlink w:anchor="_Toc243673216" w:history="1">
             <w:r>
               <w:rPr>
                 <w:rStyle w:val="ab"/>
@@ -6704,7 +6739,7 @@
                 <w:noProof/>
                 <w:webHidden/>
               </w:rPr>
-              <w:instrText>PAGEREF _Toc243671727 \h</w:instrText>
+              <w:instrText>PAGEREF _Toc243673216 \h</w:instrText>
             </w:r>
             <w:r>
               <w:rPr>
@@ -6734,7 +6769,7 @@
                 <w:noProof/>
                 <w:webHidden/>
               </w:rPr>
-              <w:t>22</w:t>
+              <w:t>23</w:t>
             </w:r>
             <w:r>
               <w:rPr>
@@ -6760,7 +6795,7 @@
               <w14:ligatures w14:val="standardContextual"/>
             </w:rPr>
           </w:pPr>
-          <w:hyperlink w:anchor="_Toc243671728" w:history="1">
+          <w:hyperlink w:anchor="_Toc243673217" w:history="1">
             <w:r>
               <w:rPr>
                 <w:rStyle w:val="ab"/>
@@ -6822,7 +6857,7 @@
                 <w:noProof/>
                 <w:webHidden/>
               </w:rPr>
-              <w:instrText>PAGEREF _Toc243671728 \h</w:instrText>
+              <w:instrText>PAGEREF _Toc243673217 \h</w:instrText>
             </w:r>
             <w:r>
               <w:rPr>
@@ -6852,7 +6887,7 @@
                 <w:noProof/>
                 <w:webHidden/>
               </w:rPr>
-              <w:t>22</w:t>
+              <w:t>23</w:t>
             </w:r>
             <w:r>
               <w:rPr>
@@ -6878,7 +6913,7 @@
               <w14:ligatures w14:val="standardContextual"/>
             </w:rPr>
           </w:pPr>
-          <w:hyperlink w:anchor="_Toc243671729" w:history="1">
+          <w:hyperlink w:anchor="_Toc243673218" w:history="1">
             <w:r>
               <w:rPr>
                 <w:rStyle w:val="ab"/>
@@ -6924,7 +6959,7 @@
                 <w:noProof/>
                 <w:webHidden/>
               </w:rPr>
-              <w:instrText>PAGEREF _Toc243671729 \h</w:instrText>
+              <w:instrText>PAGEREF _Toc243673218 \h</w:instrText>
             </w:r>
             <w:r>
               <w:rPr>
@@ -6954,7 +6989,7 @@
                 <w:noProof/>
                 <w:webHidden/>
               </w:rPr>
-              <w:t>23</w:t>
+              <w:t>24</w:t>
             </w:r>
             <w:r>
               <w:rPr>
@@ -6980,7 +7015,7 @@
               <w14:ligatures w14:val="standardContextual"/>
             </w:rPr>
           </w:pPr>
-          <w:hyperlink w:anchor="_Toc243671730" w:history="1">
+          <w:hyperlink w:anchor="_Toc243673219" w:history="1">
             <w:r>
               <w:rPr>
                 <w:rStyle w:val="ab"/>
@@ -7026,7 +7061,7 @@
                 <w:noProof/>
                 <w:webHidden/>
               </w:rPr>
-              <w:instrText>PAGEREF _Toc243671730 \h</w:instrText>
+              <w:instrText>PAGEREF _Toc243673219 \h</w:instrText>
             </w:r>
             <w:r>
               <w:rPr>
@@ -7056,7 +7091,7 @@
                 <w:noProof/>
                 <w:webHidden/>
               </w:rPr>
-              <w:t>23</w:t>
+              <w:t>24</w:t>
             </w:r>
             <w:r>
               <w:rPr>
@@ -7082,7 +7117,7 @@
               <w14:ligatures w14:val="standardContextual"/>
             </w:rPr>
           </w:pPr>
-          <w:hyperlink w:anchor="_Toc243671731" w:history="1">
+          <w:hyperlink w:anchor="_Toc243673220" w:history="1">
             <w:r>
               <w:rPr>
                 <w:rStyle w:val="ab"/>
@@ -7128,7 +7163,7 @@
                 <w:noProof/>
                 <w:webHidden/>
               </w:rPr>
-              <w:instrText>PAGEREF _Toc243671731 \h</w:instrText>
+              <w:instrText>PAGEREF _Toc243673220 \h</w:instrText>
             </w:r>
             <w:r>
               <w:rPr>
@@ -7158,7 +7193,7 @@
                 <w:noProof/>
                 <w:webHidden/>
               </w:rPr>
-              <w:t>24</w:t>
+              <w:t>25</w:t>
             </w:r>
             <w:r>
               <w:rPr>
@@ -7184,7 +7219,7 @@
               <w14:ligatures w14:val="standardContextual"/>
             </w:rPr>
           </w:pPr>
-          <w:hyperlink w:anchor="_Toc243671732" w:history="1">
+          <w:hyperlink w:anchor="_Toc243673221" w:history="1">
             <w:r>
               <w:rPr>
                 <w:rStyle w:val="ab"/>
@@ -7230,7 +7265,7 @@
                 <w:noProof/>
                 <w:webHidden/>
               </w:rPr>
-              <w:instrText>PAGEREF _Toc243671732 \h</w:instrText>
+              <w:instrText>PAGEREF _Toc243673221 \h</w:instrText>
             </w:r>
             <w:r>
               <w:rPr>
@@ -7260,7 +7295,7 @@
                 <w:noProof/>
                 <w:webHidden/>
               </w:rPr>
-              <w:t>24</w:t>
+              <w:t>25</w:t>
             </w:r>
             <w:r>
               <w:rPr>
@@ -7286,7 +7321,7 @@
               <w14:ligatures w14:val="standardContextual"/>
             </w:rPr>
           </w:pPr>
-          <w:hyperlink w:anchor="_Toc243671733" w:history="1">
+          <w:hyperlink w:anchor="_Toc243673222" w:history="1">
             <w:r>
               <w:rPr>
                 <w:rStyle w:val="ab"/>
@@ -7324,7 +7359,7 @@
                 <w:noProof/>
                 <w:webHidden/>
               </w:rPr>
-              <w:instrText>PAGEREF _Toc243671733 \h</w:instrText>
+              <w:instrText>PAGEREF _Toc243673222 \h</w:instrText>
             </w:r>
             <w:r>
               <w:rPr>
@@ -7354,7 +7389,7 @@
                 <w:noProof/>
                 <w:webHidden/>
               </w:rPr>
-              <w:t>25</w:t>
+              <w:t>26</w:t>
             </w:r>
             <w:r>
               <w:rPr>
@@ -7380,7 +7415,7 @@
               <w14:ligatures w14:val="standardContextual"/>
             </w:rPr>
           </w:pPr>
-          <w:hyperlink w:anchor="_Toc243671734" w:history="1">
+          <w:hyperlink w:anchor="_Toc243673223" w:history="1">
             <w:r>
               <w:rPr>
                 <w:rStyle w:val="ab"/>
@@ -7443,7 +7478,7 @@
                 <w:noProof/>
                 <w:webHidden/>
               </w:rPr>
-              <w:instrText>PAGEREF _Toc243671734 \h</w:instrText>
+              <w:instrText>PAGEREF _Toc243673223 \h</w:instrText>
             </w:r>
             <w:r>
               <w:rPr>
@@ -7473,7 +7508,7 @@
                 <w:noProof/>
                 <w:webHidden/>
               </w:rPr>
-              <w:t>26</w:t>
+              <w:t>27</w:t>
             </w:r>
             <w:r>
               <w:rPr>
@@ -7514,7 +7549,7 @@
         <w:spacing w:before="46" w:after="46" w:line="240" w:lineRule="auto"/>
         <w:jc w:val="left"/>
       </w:pPr>
-      <w:bookmarkStart w:id="0" w:name="_Toc243671680"/>
+      <w:bookmarkStart w:id="0" w:name="_Toc243673169"/>
       <w:r>
         <w:rPr>
           <w:rFonts w:eastAsia="黑体"/>
@@ -7538,7 +7573,7 @@
         <w:spacing w:before="46" w:after="46" w:line="240" w:lineRule="auto"/>
         <w:jc w:val="left"/>
       </w:pPr>
-      <w:bookmarkStart w:id="1" w:name="_Toc243671681"/>
+      <w:bookmarkStart w:id="1" w:name="_Toc243673170"/>
       <w:r>
         <w:rPr>
           <w:rFonts w:ascii="Times New Roman" w:eastAsia="黑体" w:hAnsi="Times New Roman" w:cs="Times New Roman"/>
@@ -7671,7 +7706,7 @@
         <w:spacing w:before="46" w:after="46" w:line="240" w:lineRule="auto"/>
         <w:jc w:val="left"/>
       </w:pPr>
-      <w:bookmarkStart w:id="2" w:name="_Toc243671682"/>
+      <w:bookmarkStart w:id="2" w:name="_Toc243673171"/>
       <w:r>
         <w:rPr>
           <w:rFonts w:ascii="Times New Roman" w:eastAsia="黑体" w:hAnsi="Times New Roman" w:cs="Times New Roman"/>
@@ -7819,7 +7854,7 @@
         <w:spacing w:before="46" w:after="46" w:line="240" w:lineRule="auto"/>
         <w:jc w:val="left"/>
       </w:pPr>
-      <w:bookmarkStart w:id="3" w:name="_Toc243671683"/>
+      <w:bookmarkStart w:id="3" w:name="_Toc243673172"/>
       <w:r>
         <w:rPr>
           <w:rFonts w:ascii="Times New Roman" w:eastAsia="黑体" w:hAnsi="Times New Roman" w:cs="Times New Roman"/>
@@ -7923,6 +7958,7 @@
           </w:tcPr>
           <w:p>
             <w:pPr>
+              <w:keepNext/>
               <w:spacing w:before="46" w:after="46"/>
               <w:jc w:val="center"/>
             </w:pPr>
@@ -7944,6 +7980,7 @@
           </w:tcPr>
           <w:p>
             <w:pPr>
+              <w:keepNext/>
               <w:spacing w:before="46" w:after="46"/>
               <w:jc w:val="center"/>
             </w:pPr>
@@ -7965,6 +8002,7 @@
           </w:tcPr>
           <w:p>
             <w:pPr>
+              <w:keepNext/>
               <w:spacing w:before="46" w:after="46"/>
               <w:jc w:val="center"/>
             </w:pPr>
@@ -7986,6 +8024,7 @@
           </w:tcPr>
           <w:p>
             <w:pPr>
+              <w:keepNext/>
               <w:spacing w:before="46" w:after="46"/>
               <w:jc w:val="center"/>
             </w:pPr>
@@ -8529,7 +8568,7 @@
         <w:spacing w:before="46" w:after="46" w:line="240" w:lineRule="auto"/>
         <w:jc w:val="left"/>
       </w:pPr>
-      <w:bookmarkStart w:id="4" w:name="_Toc243671684"/>
+      <w:bookmarkStart w:id="4" w:name="_Toc243673173"/>
       <w:r>
         <w:rPr>
           <w:rFonts w:ascii="Times New Roman" w:eastAsia="黑体" w:hAnsi="Times New Roman" w:cs="Times New Roman"/>
@@ -8635,6 +8674,7 @@
           </w:tcPr>
           <w:p>
             <w:pPr>
+              <w:keepNext/>
               <w:spacing w:before="46" w:after="46"/>
               <w:jc w:val="center"/>
             </w:pPr>
@@ -8656,6 +8696,7 @@
           </w:tcPr>
           <w:p>
             <w:pPr>
+              <w:keepNext/>
               <w:spacing w:before="46" w:after="46"/>
               <w:jc w:val="center"/>
             </w:pPr>
@@ -8691,6 +8732,7 @@
           </w:tcPr>
           <w:p>
             <w:pPr>
+              <w:keepNext/>
               <w:spacing w:before="46" w:after="46"/>
               <w:jc w:val="center"/>
             </w:pPr>
@@ -8712,6 +8754,7 @@
           </w:tcPr>
           <w:p>
             <w:pPr>
+              <w:keepNext/>
               <w:spacing w:before="46" w:after="46"/>
               <w:jc w:val="center"/>
             </w:pPr>
@@ -9267,7 +9310,7 @@
         <w:spacing w:before="46" w:after="46" w:line="240" w:lineRule="auto"/>
         <w:jc w:val="left"/>
       </w:pPr>
-      <w:bookmarkStart w:id="5" w:name="_Toc243671685"/>
+      <w:bookmarkStart w:id="5" w:name="_Toc243673174"/>
       <w:r>
         <w:rPr>
           <w:rFonts w:ascii="Times New Roman" w:eastAsia="黑体" w:hAnsi="Times New Roman" w:cs="Times New Roman"/>
@@ -9409,7 +9452,7 @@
         <w:spacing w:before="46" w:after="46" w:line="240" w:lineRule="auto"/>
         <w:jc w:val="left"/>
       </w:pPr>
-      <w:bookmarkStart w:id="6" w:name="_Toc243671686"/>
+      <w:bookmarkStart w:id="6" w:name="_Toc243673175"/>
       <w:r>
         <w:rPr>
           <w:rFonts w:eastAsia="黑体"/>
@@ -9432,7 +9475,7 @@
         <w:spacing w:before="46" w:after="46" w:line="240" w:lineRule="auto"/>
         <w:jc w:val="left"/>
       </w:pPr>
-      <w:bookmarkStart w:id="7" w:name="_Toc243671687"/>
+      <w:bookmarkStart w:id="7" w:name="_Toc243673176"/>
       <w:r>
         <w:rPr>
           <w:rFonts w:ascii="Times New Roman" w:eastAsia="黑体" w:hAnsi="Times New Roman" w:cs="Times New Roman"/>
@@ -9525,7 +9568,7 @@
         <w:spacing w:before="46" w:after="46" w:line="240" w:lineRule="auto"/>
         <w:jc w:val="left"/>
       </w:pPr>
-      <w:bookmarkStart w:id="8" w:name="_Toc243671688"/>
+      <w:bookmarkStart w:id="8" w:name="_Toc243673177"/>
       <w:r>
         <w:rPr>
           <w:rFonts w:ascii="Times New Roman" w:eastAsia="黑体" w:hAnsi="Times New Roman" w:cs="Times New Roman"/>
@@ -9548,7 +9591,7 @@
         <w:spacing w:line="240" w:lineRule="auto"/>
         <w:jc w:val="left"/>
       </w:pPr>
-      <w:bookmarkStart w:id="9" w:name="_Toc243671689"/>
+      <w:bookmarkStart w:id="9" w:name="_Toc243673178"/>
       <w:r>
         <w:rPr>
           <w:rFonts w:eastAsia="黑体"/>
@@ -9630,7 +9673,7 @@
           <w:noProof/>
         </w:rPr>
         <w:drawing>
-          <wp:inline distT="0" distB="0" distL="0" distR="0" wp14:anchorId="425CFF18" wp14:editId="04B30F6B">
+          <wp:inline distT="0" distB="0" distL="0" distR="0" wp14:anchorId="7FAAAAE4" wp14:editId="516AE6BC">
             <wp:extent cx="5486400" cy="3713018"/>
             <wp:effectExtent l="0" t="0" r="0" b="0"/>
             <wp:docPr id="2" name="Picture 2"/>
@@ -9798,7 +9841,7 @@
         <w:spacing w:line="240" w:lineRule="auto"/>
         <w:jc w:val="left"/>
       </w:pPr>
-      <w:bookmarkStart w:id="10" w:name="_Toc243671690"/>
+      <w:bookmarkStart w:id="10" w:name="_Toc243673179"/>
       <w:r>
         <w:rPr>
           <w:rFonts w:eastAsia="黑体"/>
@@ -9861,7 +9904,7 @@
         <w:spacing w:line="240" w:lineRule="auto"/>
         <w:jc w:val="left"/>
       </w:pPr>
-      <w:bookmarkStart w:id="11" w:name="_Toc243671691"/>
+      <w:bookmarkStart w:id="11" w:name="_Toc243673180"/>
       <w:r>
         <w:rPr>
           <w:rFonts w:eastAsia="黑体"/>
@@ -10039,6 +10082,7 @@
           </w:tcPr>
           <w:p>
             <w:pPr>
+              <w:keepNext/>
               <w:spacing w:before="46" w:after="46"/>
               <w:jc w:val="center"/>
             </w:pPr>
@@ -10060,6 +10104,7 @@
           </w:tcPr>
           <w:p>
             <w:pPr>
+              <w:keepNext/>
               <w:spacing w:before="46" w:after="46"/>
               <w:jc w:val="center"/>
             </w:pPr>
@@ -10116,6 +10161,7 @@
           </w:tcPr>
           <w:p>
             <w:pPr>
+              <w:keepNext/>
               <w:spacing w:before="46" w:after="46"/>
               <w:jc w:val="center"/>
             </w:pPr>
@@ -10529,7 +10575,7 @@
         <w:spacing w:before="46" w:after="46" w:line="240" w:lineRule="auto"/>
         <w:jc w:val="left"/>
       </w:pPr>
-      <w:bookmarkStart w:id="12" w:name="_Toc243671692"/>
+      <w:bookmarkStart w:id="12" w:name="_Toc243673181"/>
       <w:r>
         <w:rPr>
           <w:rFonts w:eastAsia="黑体"/>
@@ -10552,7 +10598,7 @@
         <w:spacing w:before="46" w:after="46" w:line="240" w:lineRule="auto"/>
         <w:jc w:val="left"/>
       </w:pPr>
-      <w:bookmarkStart w:id="13" w:name="_Toc243671693"/>
+      <w:bookmarkStart w:id="13" w:name="_Toc243673182"/>
       <w:r>
         <w:rPr>
           <w:rFonts w:ascii="Times New Roman" w:eastAsia="黑体" w:hAnsi="Times New Roman" w:cs="Times New Roman"/>
@@ -10641,7 +10687,7 @@
         <w:spacing w:before="46" w:after="46" w:line="240" w:lineRule="auto"/>
         <w:jc w:val="left"/>
       </w:pPr>
-      <w:bookmarkStart w:id="14" w:name="_Toc243671694"/>
+      <w:bookmarkStart w:id="14" w:name="_Toc243673183"/>
       <w:r>
         <w:rPr>
           <w:rFonts w:ascii="Times New Roman" w:eastAsia="黑体" w:hAnsi="Times New Roman" w:cs="Times New Roman"/>
@@ -10665,7 +10711,7 @@
         <w:spacing w:line="240" w:lineRule="auto"/>
         <w:jc w:val="left"/>
       </w:pPr>
-      <w:bookmarkStart w:id="15" w:name="_Toc243671695"/>
+      <w:bookmarkStart w:id="15" w:name="_Toc243673184"/>
       <w:r>
         <w:rPr>
           <w:rFonts w:eastAsia="黑体"/>
@@ -10780,6 +10826,7 @@
           </w:tcPr>
           <w:p>
             <w:pPr>
+              <w:keepNext/>
               <w:spacing w:before="46" w:after="46"/>
               <w:jc w:val="center"/>
             </w:pPr>
@@ -10801,6 +10848,7 @@
           </w:tcPr>
           <w:p>
             <w:pPr>
+              <w:keepNext/>
               <w:spacing w:before="46" w:after="46"/>
               <w:jc w:val="center"/>
             </w:pPr>
@@ -10822,6 +10870,7 @@
           </w:tcPr>
           <w:p>
             <w:pPr>
+              <w:keepNext/>
               <w:spacing w:before="46" w:after="46"/>
               <w:jc w:val="center"/>
             </w:pPr>
@@ -11156,7 +11205,7 @@
         <w:spacing w:line="240" w:lineRule="auto"/>
         <w:jc w:val="left"/>
       </w:pPr>
-      <w:bookmarkStart w:id="16" w:name="_Toc243671696"/>
+      <w:bookmarkStart w:id="16" w:name="_Toc243673185"/>
       <w:r>
         <w:rPr>
           <w:rFonts w:eastAsia="黑体"/>
@@ -11205,7 +11254,7 @@
           <w:noProof/>
         </w:rPr>
         <w:drawing>
-          <wp:inline distT="0" distB="0" distL="0" distR="0" wp14:anchorId="64632B39" wp14:editId="4B7E221E">
+          <wp:inline distT="0" distB="0" distL="0" distR="0" wp14:anchorId="0D22A885" wp14:editId="05A7B137">
             <wp:extent cx="5486400" cy="3380509"/>
             <wp:effectExtent l="0" t="0" r="0" b="0"/>
             <wp:docPr id="3" name="Picture 3"/>
@@ -11305,7 +11354,7 @@
         <w:spacing w:line="240" w:lineRule="auto"/>
         <w:jc w:val="left"/>
       </w:pPr>
-      <w:bookmarkStart w:id="17" w:name="_Toc243671697"/>
+      <w:bookmarkStart w:id="17" w:name="_Toc243673186"/>
       <w:r>
         <w:rPr>
           <w:rFonts w:eastAsia="黑体"/>
@@ -11416,7 +11465,7 @@
         <w:spacing w:before="46" w:after="46" w:line="240" w:lineRule="auto"/>
         <w:jc w:val="left"/>
       </w:pPr>
-      <w:bookmarkStart w:id="18" w:name="_Toc243671698"/>
+      <w:bookmarkStart w:id="18" w:name="_Toc243673187"/>
       <w:r>
         <w:rPr>
           <w:rFonts w:eastAsia="黑体"/>
@@ -11439,7 +11488,7 @@
         <w:spacing w:before="46" w:after="46" w:line="240" w:lineRule="auto"/>
         <w:jc w:val="left"/>
       </w:pPr>
-      <w:bookmarkStart w:id="19" w:name="_Toc243671699"/>
+      <w:bookmarkStart w:id="19" w:name="_Toc243673188"/>
       <w:r>
         <w:rPr>
           <w:rFonts w:ascii="Times New Roman" w:eastAsia="黑体" w:hAnsi="Times New Roman" w:cs="Times New Roman"/>
@@ -11516,7 +11565,7 @@
         <w:spacing w:before="46" w:after="46" w:line="240" w:lineRule="auto"/>
         <w:jc w:val="left"/>
       </w:pPr>
-      <w:bookmarkStart w:id="20" w:name="_Toc243671700"/>
+      <w:bookmarkStart w:id="20" w:name="_Toc243673189"/>
       <w:r>
         <w:rPr>
           <w:rFonts w:ascii="Times New Roman" w:eastAsia="黑体" w:hAnsi="Times New Roman" w:cs="Times New Roman"/>
@@ -11539,7 +11588,7 @@
         <w:spacing w:line="240" w:lineRule="auto"/>
         <w:jc w:val="left"/>
       </w:pPr>
-      <w:bookmarkStart w:id="21" w:name="_Toc243671701"/>
+      <w:bookmarkStart w:id="21" w:name="_Toc243673190"/>
       <w:r>
         <w:rPr>
           <w:rFonts w:eastAsia="黑体"/>
@@ -11645,6 +11694,7 @@
           <w:rFonts w:eastAsia="仿宋"/>
           <w:b/>
         </w:rPr>
+        <w:lastRenderedPageBreak/>
         <w:t>表</w:t>
       </w:r>
       <w:r>
@@ -11694,6 +11744,7 @@
           </w:tcPr>
           <w:p>
             <w:pPr>
+              <w:keepNext/>
               <w:spacing w:before="46" w:after="46"/>
               <w:jc w:val="center"/>
             </w:pPr>
@@ -11715,6 +11766,7 @@
           </w:tcPr>
           <w:p>
             <w:pPr>
+              <w:keepNext/>
               <w:spacing w:before="46" w:after="46"/>
               <w:jc w:val="center"/>
             </w:pPr>
@@ -11736,6 +11788,7 @@
           </w:tcPr>
           <w:p>
             <w:pPr>
+              <w:keepNext/>
               <w:spacing w:before="46" w:after="46"/>
               <w:jc w:val="center"/>
             </w:pPr>
@@ -11757,6 +11810,7 @@
           </w:tcPr>
           <w:p>
             <w:pPr>
+              <w:keepNext/>
               <w:spacing w:before="46" w:after="46"/>
               <w:jc w:val="center"/>
             </w:pPr>
@@ -11778,6 +11832,7 @@
           </w:tcPr>
           <w:p>
             <w:pPr>
+              <w:keepNext/>
               <w:spacing w:before="46" w:after="46"/>
               <w:jc w:val="center"/>
             </w:pPr>
@@ -11809,7 +11864,6 @@
               <w:rPr>
                 <w:sz w:val="18"/>
               </w:rPr>
-              <w:lastRenderedPageBreak/>
               <w:t>房间创建</w:t>
             </w:r>
             <w:r>
@@ -12403,7 +12457,7 @@
         <w:spacing w:line="240" w:lineRule="auto"/>
         <w:jc w:val="left"/>
       </w:pPr>
-      <w:bookmarkStart w:id="22" w:name="_Toc243671702"/>
+      <w:bookmarkStart w:id="22" w:name="_Toc243673191"/>
       <w:r>
         <w:rPr>
           <w:rFonts w:eastAsia="黑体"/>
@@ -12446,7 +12500,7 @@
           <w:noProof/>
         </w:rPr>
         <w:drawing>
-          <wp:inline distT="0" distB="0" distL="0" distR="0" wp14:anchorId="40EFAEC4" wp14:editId="46107530">
+          <wp:inline distT="0" distB="0" distL="0" distR="0" wp14:anchorId="0D46359E" wp14:editId="5983AF6F">
             <wp:extent cx="5486400" cy="3546764"/>
             <wp:effectExtent l="0" t="0" r="0" b="0"/>
             <wp:docPr id="4" name="Picture 4"/>
@@ -12527,11 +12581,11 @@
         <w:t>1</w:t>
       </w:r>
       <w:r>
-        <w:t>）操作发起与意图提交：玩家客户端发起移动操作，提交所操作的角色标记标识、目标位置以及发起该操作时所依据的对象基准</w:t>
+        <w:t>）操作发起与意图提交：玩家客户端</w:t>
       </w:r>
       <w:r>
         <w:lastRenderedPageBreak/>
-        <w:t>版本；（</w:t>
+        <w:t>发起移动操作，提交所操作的角色标记标识、目标位置以及发起该操作时所依据的对象基准版本；（</w:t>
       </w:r>
       <w:r>
         <w:t>2</w:t>
@@ -12564,7 +12618,7 @@
         <w:spacing w:line="240" w:lineRule="auto"/>
         <w:jc w:val="left"/>
       </w:pPr>
-      <w:bookmarkStart w:id="23" w:name="_Toc243671703"/>
+      <w:bookmarkStart w:id="23" w:name="_Toc243673192"/>
       <w:r>
         <w:rPr>
           <w:rFonts w:eastAsia="黑体"/>
@@ -12714,7 +12768,7 @@
         <w:spacing w:before="46" w:after="46" w:line="240" w:lineRule="auto"/>
         <w:jc w:val="left"/>
       </w:pPr>
-      <w:bookmarkStart w:id="24" w:name="_Toc243671704"/>
+      <w:bookmarkStart w:id="24" w:name="_Toc243673193"/>
       <w:r>
         <w:rPr>
           <w:rFonts w:eastAsia="黑体"/>
@@ -12737,7 +12791,7 @@
         <w:spacing w:before="46" w:after="46" w:line="240" w:lineRule="auto"/>
         <w:jc w:val="left"/>
       </w:pPr>
-      <w:bookmarkStart w:id="25" w:name="_Toc243671705"/>
+      <w:bookmarkStart w:id="25" w:name="_Toc243673194"/>
       <w:r>
         <w:rPr>
           <w:rFonts w:ascii="Times New Roman" w:eastAsia="黑体" w:hAnsi="Times New Roman" w:cs="Times New Roman"/>
@@ -12820,7 +12874,7 @@
         <w:spacing w:before="46" w:after="46" w:line="240" w:lineRule="auto"/>
         <w:jc w:val="left"/>
       </w:pPr>
-      <w:bookmarkStart w:id="26" w:name="_Toc243671706"/>
+      <w:bookmarkStart w:id="26" w:name="_Toc243673195"/>
       <w:r>
         <w:rPr>
           <w:rFonts w:ascii="Times New Roman" w:eastAsia="黑体" w:hAnsi="Times New Roman" w:cs="Times New Roman"/>
@@ -12843,7 +12897,7 @@
         <w:spacing w:line="240" w:lineRule="auto"/>
         <w:jc w:val="left"/>
       </w:pPr>
-      <w:bookmarkStart w:id="27" w:name="_Toc243671707"/>
+      <w:bookmarkStart w:id="27" w:name="_Toc243673196"/>
       <w:r>
         <w:rPr>
           <w:rFonts w:eastAsia="黑体"/>
@@ -12891,7 +12945,11 @@
         <w:t xml:space="preserve">UUID </w:t>
       </w:r>
       <w:r>
-        <w:t>具备极大的标识空间，支持在分布式节点上去中心化生成，避免了对中心自增发号器单点的强依赖。核心实体标识包括用户标识（</w:t>
+        <w:t>具备极大的标识空间，支持在分布式节点上去中心化生成，避免了对中心自增发号器单点的强</w:t>
+      </w:r>
+      <w:r>
+        <w:lastRenderedPageBreak/>
+        <w:t>依赖。核心实体标识包括用户标识（</w:t>
       </w:r>
       <w:r>
         <w:t>`userId`</w:t>
@@ -12909,11 +12967,7 @@
         <w:t>`tokenId`</w:t>
       </w:r>
       <w:r>
-        <w:t>）</w:t>
-      </w:r>
-      <w:r>
-        <w:lastRenderedPageBreak/>
-        <w:t>与地图资源标识（</w:t>
+        <w:t>）与地图资源标识（</w:t>
       </w:r>
       <w:r>
         <w:t>`mapId`</w:t>
@@ -12949,7 +13003,7 @@
         <w:spacing w:line="240" w:lineRule="auto"/>
         <w:jc w:val="left"/>
       </w:pPr>
-      <w:bookmarkStart w:id="28" w:name="_Toc243671708"/>
+      <w:bookmarkStart w:id="28" w:name="_Toc243673197"/>
       <w:r>
         <w:rPr>
           <w:rFonts w:eastAsia="黑体"/>
@@ -13089,6 +13143,7 @@
           </w:tcPr>
           <w:p>
             <w:pPr>
+              <w:keepNext/>
               <w:spacing w:before="46" w:after="46"/>
               <w:jc w:val="center"/>
             </w:pPr>
@@ -13110,6 +13165,7 @@
           </w:tcPr>
           <w:p>
             <w:pPr>
+              <w:keepNext/>
               <w:spacing w:before="46" w:after="46"/>
               <w:jc w:val="center"/>
             </w:pPr>
@@ -13131,6 +13187,7 @@
           </w:tcPr>
           <w:p>
             <w:pPr>
+              <w:keepNext/>
               <w:spacing w:before="46" w:after="46"/>
               <w:jc w:val="center"/>
             </w:pPr>
@@ -13152,6 +13209,7 @@
           </w:tcPr>
           <w:p>
             <w:pPr>
+              <w:keepNext/>
               <w:spacing w:before="46" w:after="46"/>
               <w:jc w:val="center"/>
             </w:pPr>
@@ -13173,6 +13231,7 @@
           </w:tcPr>
           <w:p>
             <w:pPr>
+              <w:keepNext/>
               <w:spacing w:before="46" w:after="46"/>
               <w:jc w:val="center"/>
             </w:pPr>
@@ -13749,7 +13808,7 @@
         <w:spacing w:line="240" w:lineRule="auto"/>
         <w:jc w:val="left"/>
       </w:pPr>
-      <w:bookmarkStart w:id="29" w:name="_Toc243671709"/>
+      <w:bookmarkStart w:id="29" w:name="_Toc243673198"/>
       <w:r>
         <w:rPr>
           <w:rFonts w:eastAsia="黑体"/>
@@ -13901,7 +13960,11 @@
         <w:t xml:space="preserve"> Chord </w:t>
       </w:r>
       <w:r>
-        <w:t>算法及其基于哈希环与指位表（</w:t>
+        <w:t>算</w:t>
+      </w:r>
+      <w:r>
+        <w:lastRenderedPageBreak/>
+        <w:t>法及其基于哈希环与指位表（</w:t>
       </w:r>
       <w:r>
         <w:t>Finger Table</w:t>
@@ -13929,7 +13992,6 @@
         <w:ind w:firstLineChars="200" w:firstLine="420"/>
       </w:pPr>
       <w:r>
-        <w:lastRenderedPageBreak/>
         <w:t>方案分析：</w:t>
       </w:r>
       <w:r>
@@ -13969,7 +14031,7 @@
         <w:spacing w:before="46" w:after="46" w:line="240" w:lineRule="auto"/>
         <w:jc w:val="left"/>
       </w:pPr>
-      <w:bookmarkStart w:id="30" w:name="_Toc243671710"/>
+      <w:bookmarkStart w:id="30" w:name="_Toc243673199"/>
       <w:r>
         <w:rPr>
           <w:rFonts w:eastAsia="黑体"/>
@@ -13992,7 +14054,7 @@
         <w:spacing w:before="46" w:after="46" w:line="240" w:lineRule="auto"/>
         <w:jc w:val="left"/>
       </w:pPr>
-      <w:bookmarkStart w:id="31" w:name="_Toc243671711"/>
+      <w:bookmarkStart w:id="31" w:name="_Toc243673200"/>
       <w:r>
         <w:rPr>
           <w:rFonts w:ascii="Times New Roman" w:eastAsia="黑体" w:hAnsi="Times New Roman" w:cs="Times New Roman"/>
@@ -14069,7 +14131,7 @@
         <w:spacing w:before="46" w:after="46" w:line="240" w:lineRule="auto"/>
         <w:jc w:val="left"/>
       </w:pPr>
-      <w:bookmarkStart w:id="32" w:name="_Toc243671712"/>
+      <w:bookmarkStart w:id="32" w:name="_Toc243673201"/>
       <w:r>
         <w:rPr>
           <w:rFonts w:ascii="Times New Roman" w:eastAsia="黑体" w:hAnsi="Times New Roman" w:cs="Times New Roman"/>
@@ -14092,7 +14154,7 @@
         <w:spacing w:line="240" w:lineRule="auto"/>
         <w:jc w:val="left"/>
       </w:pPr>
-      <w:bookmarkStart w:id="33" w:name="_Toc243671713"/>
+      <w:bookmarkStart w:id="33" w:name="_Toc243673202"/>
       <w:r>
         <w:rPr>
           <w:rFonts w:eastAsia="黑体"/>
@@ -14179,7 +14241,7 @@
         </w:rPr>
         <w:lastRenderedPageBreak/>
         <w:drawing>
-          <wp:inline distT="0" distB="0" distL="0" distR="0" wp14:anchorId="006C8011" wp14:editId="5D79C68B">
+          <wp:inline distT="0" distB="0" distL="0" distR="0" wp14:anchorId="2BEE28A4" wp14:editId="6A99E3F5">
             <wp:extent cx="5486400" cy="3560323"/>
             <wp:effectExtent l="0" t="0" r="0" b="0"/>
             <wp:docPr id="5" name="Picture 5"/>
@@ -14284,7 +14346,10 @@
         <w:t>4</w:t>
       </w:r>
       <w:r>
-        <w:t>）客户端状态平滑恢复：服务端向冲突方返回拒绝提示及该标记当前的最新权威状态。客户端收到响应后撤销本地预先拖拽的半透明视觉预览，平滑将标记重置回权威位置并更新本地版本显示。该机制有效防止了旧操作对新状态的静默覆盖，保障了状态流转的因果正确性。</w:t>
+        <w:t>）客户端状态平滑恢复：服务端向冲突方返回拒绝提示及该标记当前的最新权威状态。客户端收到响应后撤销本地预先拖拽的半透明视觉预览，平滑将标记重置回权威位置并更新本地版本显示。该机制有效防止了旧操作对新状态的静默覆盖，维护了房间内操作流转的全局全序。需要指出的是，单房间权威分配递增事件序号与基准版本校验，保障了已提交事件在所有在线成员端的统一观察全序；但在缺乏额外因果依赖追踪（如向量时钟或客户端未确认依赖图）的情况下，单房间全序不应</w:t>
+      </w:r>
+      <w:r>
+        <w:t>被直接等同于完备的分布式因果一致性保证。</w:t>
       </w:r>
     </w:p>
     <w:p>
@@ -14293,7 +14358,7 @@
         <w:spacing w:line="240" w:lineRule="auto"/>
         <w:jc w:val="left"/>
       </w:pPr>
-      <w:bookmarkStart w:id="34" w:name="_Toc243671714"/>
+      <w:bookmarkStart w:id="34" w:name="_Toc243673203"/>
       <w:r>
         <w:rPr>
           <w:rFonts w:eastAsia="黑体"/>
@@ -14316,7 +14381,7 @@
         <w:ind w:firstLineChars="200" w:firstLine="420"/>
       </w:pPr>
       <w:r>
-        <w:t>对于掷骰检定与回合流转，系统由服务端负责逻辑仲裁：客户端发送掷骰请求，服务端生成结果并在持久化存储中完成确认，赋予递增序号后向全房间广播。所有在线端依据接收到的事件流顺序记录投骰日志，确保房间成员观察到的投骰历史具备统一的逻辑先后关系。</w:t>
+        <w:t>对于掷骰检定与回合流转，系统由服务端负责逻辑仲裁：客户端发送掷骰请求，服务端生成结果并在持久化存储中完成确认，赋予递增序号后向全房间广播。所有在线端依据接收到的事件流顺序记录投骰日志，确保房间成员观察到的投骰历史具备统一的逻辑全序先后关系。</w:t>
       </w:r>
     </w:p>
     <w:p>
@@ -14325,7 +14390,7 @@
         <w:spacing w:line="240" w:lineRule="auto"/>
         <w:jc w:val="left"/>
       </w:pPr>
-      <w:bookmarkStart w:id="35" w:name="_Toc243671715"/>
+      <w:bookmarkStart w:id="35" w:name="_Toc243673204"/>
       <w:r>
         <w:rPr>
           <w:rFonts w:eastAsia="黑体"/>
@@ -14393,6 +14458,7 @@
           <w:rFonts w:eastAsia="仿宋"/>
           <w:b/>
         </w:rPr>
+        <w:lastRenderedPageBreak/>
         <w:t>表</w:t>
       </w:r>
       <w:r>
@@ -14441,6 +14507,7 @@
           </w:tcPr>
           <w:p>
             <w:pPr>
+              <w:keepNext/>
               <w:spacing w:before="46" w:after="46"/>
               <w:jc w:val="center"/>
             </w:pPr>
@@ -14476,6 +14543,7 @@
           </w:tcPr>
           <w:p>
             <w:pPr>
+              <w:keepNext/>
               <w:spacing w:before="46" w:after="46"/>
               <w:jc w:val="center"/>
             </w:pPr>
@@ -14497,6 +14565,7 @@
           </w:tcPr>
           <w:p>
             <w:pPr>
+              <w:keepNext/>
               <w:spacing w:before="46" w:after="46"/>
               <w:jc w:val="center"/>
             </w:pPr>
@@ -14518,6 +14587,7 @@
           </w:tcPr>
           <w:p>
             <w:pPr>
+              <w:keepNext/>
               <w:spacing w:before="46" w:after="46"/>
               <w:jc w:val="center"/>
             </w:pPr>
@@ -14549,7 +14619,6 @@
               <w:rPr>
                 <w:sz w:val="18"/>
               </w:rPr>
-              <w:lastRenderedPageBreak/>
               <w:t>物理时钟同步</w:t>
             </w:r>
             <w:r>
@@ -14934,7 +15003,7 @@
               <w:rPr>
                 <w:sz w:val="18"/>
               </w:rPr>
-              <w:t>个请求并接收</w:t>
+              <w:t>条请求消息并接收</w:t>
             </w:r>
             <w:r>
               <w:rPr>
@@ -14946,7 +15015,7 @@
               <w:rPr>
                 <w:sz w:val="18"/>
               </w:rPr>
-              <w:t>个回复，共</w:t>
+              <w:t>条应答消息，共</w:t>
             </w:r>
             <w:r>
               <w:rPr>
@@ -15189,13 +15258,13 @@
         <w:t xml:space="preserve"> N-1 </w:t>
       </w:r>
       <w:r>
-        <w:t>个请求并等待</w:t>
+        <w:t>条请求消息并等待接收</w:t>
       </w:r>
       <w:r>
         <w:t xml:space="preserve"> N-1 </w:t>
       </w:r>
       <w:r>
-        <w:t>个回复，消息总数为</w:t>
+        <w:t>条应答消息，进入临界区前的消息总数为</w:t>
       </w:r>
       <w:r>
         <w:t xml:space="preserve"> 2(N-1) </w:t>
@@ -15213,7 +15282,11 @@
         <w:t xml:space="preserve"> 8 </w:t>
       </w:r>
       <w:r>
-        <w:t>人的跑团房间而言，这种权衡能够极大简化逻辑并提升可靠性；全系统的扩展性则通过不同房间的并行处理来获得，二者不能混淆。</w:t>
+        <w:t>人的跑团房间而</w:t>
+      </w:r>
+      <w:r>
+        <w:lastRenderedPageBreak/>
+        <w:t>言，这种权衡能够极大简化逻辑并提升可靠性；全系统的扩展性则通过不同房间的并行处理来获得，二者不能混淆。</w:t>
       </w:r>
     </w:p>
     <w:p>
@@ -15222,13 +15295,12 @@
         <w:spacing w:before="46" w:after="46" w:line="240" w:lineRule="auto"/>
         <w:jc w:val="left"/>
       </w:pPr>
-      <w:bookmarkStart w:id="36" w:name="_Toc243671716"/>
+      <w:bookmarkStart w:id="36" w:name="_Toc243673205"/>
       <w:r>
         <w:rPr>
           <w:rFonts w:eastAsia="黑体"/>
           <w:sz w:val="32"/>
         </w:rPr>
-        <w:lastRenderedPageBreak/>
         <w:t xml:space="preserve">7. </w:t>
       </w:r>
       <w:r>
@@ -15246,7 +15318,7 @@
         <w:spacing w:before="46" w:after="46" w:line="240" w:lineRule="auto"/>
         <w:jc w:val="left"/>
       </w:pPr>
-      <w:bookmarkStart w:id="37" w:name="_Toc243671717"/>
+      <w:bookmarkStart w:id="37" w:name="_Toc243673206"/>
       <w:r>
         <w:rPr>
           <w:rFonts w:ascii="Times New Roman" w:eastAsia="黑体" w:hAnsi="Times New Roman" w:cs="Times New Roman"/>
@@ -15329,7 +15401,7 @@
         <w:spacing w:before="46" w:after="46" w:line="240" w:lineRule="auto"/>
         <w:jc w:val="left"/>
       </w:pPr>
-      <w:bookmarkStart w:id="38" w:name="_Toc243671718"/>
+      <w:bookmarkStart w:id="38" w:name="_Toc243673207"/>
       <w:r>
         <w:rPr>
           <w:rFonts w:ascii="Times New Roman" w:eastAsia="黑体" w:hAnsi="Times New Roman" w:cs="Times New Roman"/>
@@ -15352,7 +15424,7 @@
         <w:spacing w:line="240" w:lineRule="auto"/>
         <w:jc w:val="left"/>
       </w:pPr>
-      <w:bookmarkStart w:id="39" w:name="_Toc243671719"/>
+      <w:bookmarkStart w:id="39" w:name="_Toc243673208"/>
       <w:r>
         <w:rPr>
           <w:rFonts w:eastAsia="黑体"/>
@@ -15481,6 +15553,7 @@
           </w:tcPr>
           <w:p>
             <w:pPr>
+              <w:keepNext/>
               <w:spacing w:before="46" w:after="46"/>
               <w:jc w:val="center"/>
             </w:pPr>
@@ -15502,6 +15575,7 @@
           </w:tcPr>
           <w:p>
             <w:pPr>
+              <w:keepNext/>
               <w:spacing w:before="46" w:after="46"/>
               <w:jc w:val="center"/>
             </w:pPr>
@@ -15523,6 +15597,7 @@
           </w:tcPr>
           <w:p>
             <w:pPr>
+              <w:keepNext/>
               <w:spacing w:before="46" w:after="46"/>
               <w:jc w:val="center"/>
             </w:pPr>
@@ -15558,6 +15633,7 @@
           </w:tcPr>
           <w:p>
             <w:pPr>
+              <w:keepNext/>
               <w:spacing w:before="46" w:after="46"/>
               <w:jc w:val="center"/>
             </w:pPr>
@@ -15579,6 +15655,7 @@
           </w:tcPr>
           <w:p>
             <w:pPr>
+              <w:keepNext/>
               <w:spacing w:before="46" w:after="46"/>
               <w:jc w:val="center"/>
             </w:pPr>
@@ -15992,6 +16069,7 @@
         <w:ind w:firstLineChars="200" w:firstLine="420"/>
       </w:pPr>
       <w:r>
+        <w:lastRenderedPageBreak/>
         <w:t>理论概念对应与严格区分：</w:t>
       </w:r>
     </w:p>
@@ -16013,17 +16091,13 @@
         <w:t>Sequential Consistency</w:t>
       </w:r>
       <w:r>
-        <w:t>）：</w:t>
-      </w:r>
-      <w:r>
-        <w:t xml:space="preserve">Lamport </w:t>
-      </w:r>
-      <w:r>
-        <w:t>将其定义为所有进程的操作执行</w:t>
-      </w:r>
-      <w:r>
-        <w:lastRenderedPageBreak/>
-        <w:t>结果与某种串行执行结果相同，且每个进程自身的操作在该序列中保持其程序顺序</w:t>
+        <w:t>）：分布式系统课件</w:t>
+      </w:r>
+      <w:r>
+        <w:t xml:space="preserve"> Chapter 7 </w:t>
+      </w:r>
+      <w:r>
+        <w:t>与经典教材</w:t>
       </w:r>
       <w:r>
         <w:t xml:space="preserve"> </w:t>
@@ -16033,10 +16107,25 @@
           <w:noProof/>
           <w:vertAlign w:val="superscript"/>
         </w:rPr>
-        <w:t>[1, 3]</w:t>
-      </w:r>
-      <w:r>
-        <w:t>。系统通过单房间协调服务为提交事件分配单调递增序号，客户端按序号回放，从而提供满足顺序一致性的体验。</w:t>
+        <w:t>[1, 2]</w:t>
+      </w:r>
+      <w:r>
+        <w:t xml:space="preserve"> </w:t>
+      </w:r>
+      <w:r>
+        <w:t>将其定义为所有进程的操作执行结果与某种串行执行结果相同，且每个进程自身的操作在该序列中保持其程序顺序（最早由</w:t>
+      </w:r>
+      <w:r>
+        <w:t xml:space="preserve"> Leslie Lamport </w:t>
+      </w:r>
+      <w:r>
+        <w:t>于</w:t>
+      </w:r>
+      <w:r>
+        <w:t xml:space="preserve"> 1979 </w:t>
+      </w:r>
+      <w:r>
+        <w:t>年提出）。系统通过单房间协调服务为提交事件分配单调递增序号，客户端按序号回放，从而在工程上提供满足顺序一致性的体验。</w:t>
       </w:r>
     </w:p>
     <w:p>
@@ -16124,7 +16213,7 @@
         <w:spacing w:line="240" w:lineRule="auto"/>
         <w:jc w:val="left"/>
       </w:pPr>
-      <w:bookmarkStart w:id="40" w:name="_Toc243671720"/>
+      <w:bookmarkStart w:id="40" w:name="_Toc243673209"/>
       <w:r>
         <w:rPr>
           <w:rFonts w:eastAsia="黑体"/>
@@ -16178,8 +16267,9 @@
         <w:rPr>
           <w:noProof/>
         </w:rPr>
+        <w:lastRenderedPageBreak/>
         <w:drawing>
-          <wp:inline distT="0" distB="0" distL="0" distR="0" wp14:anchorId="23C2AF72" wp14:editId="7ED16B65">
+          <wp:inline distT="0" distB="0" distL="0" distR="0" wp14:anchorId="2CCB19AD" wp14:editId="06A4DC5D">
             <wp:extent cx="5486400" cy="3380509"/>
             <wp:effectExtent l="0" t="0" r="0" b="0"/>
             <wp:docPr id="6" name="Picture 6"/>
@@ -16263,11 +16353,7 @@
         <w:t>）零信任客户端原则（</w:t>
       </w:r>
       <w:r>
-        <w:t xml:space="preserve">Zero-Trust </w:t>
-      </w:r>
-      <w:r>
-        <w:lastRenderedPageBreak/>
-        <w:t>Client</w:t>
+        <w:t>Zero-Trust Client</w:t>
       </w:r>
       <w:r>
         <w:t>）：系统假设运行在浏览器端的代码处于不受信任的网络环境，战争迷雾不能仅仅依靠前端界面的视觉遮盖；（</w:t>
@@ -16291,7 +16377,7 @@
         <w:spacing w:line="240" w:lineRule="auto"/>
         <w:jc w:val="left"/>
       </w:pPr>
-      <w:bookmarkStart w:id="41" w:name="_Toc243671721"/>
+      <w:bookmarkStart w:id="41" w:name="_Toc243673210"/>
       <w:r>
         <w:rPr>
           <w:rFonts w:eastAsia="黑体"/>
@@ -16486,7 +16572,11 @@
         <w:t xml:space="preserve">3. </w:t>
       </w:r>
       <w:r>
-        <w:t>复制边界与数据丢失窗口说明：系统倾向于采用成熟存储设施的主备复制方案。然而必须客观声明：当主备节点采用异步复制时，在主节点遭遇意外掉电崩溃的极端故障瞬间，未完全同步至备节点的微小增量存在丢失窗口。系统在当前概要设计阶段不作无条件的</w:t>
+        <w:t>复制边界与数据丢失窗口说明：系统倾向于采用成熟存储设施的主备复制方案。然而必须客观声明：当主备节点采用异步复制时，在主节点遭遇意外掉电崩溃的极端故障瞬间，未完全同步至备节点的微小增量存在丢失窗口。系统在当前概要设计阶段不作</w:t>
+      </w:r>
+      <w:r>
+        <w:lastRenderedPageBreak/>
+        <w:t>无条件的</w:t>
       </w:r>
       <w:r>
         <w:t>‘</w:t>
@@ -16507,7 +16597,7 @@
         <w:spacing w:before="46" w:after="46" w:line="240" w:lineRule="auto"/>
         <w:jc w:val="left"/>
       </w:pPr>
-      <w:bookmarkStart w:id="42" w:name="_Toc243671722"/>
+      <w:bookmarkStart w:id="42" w:name="_Toc243673211"/>
       <w:r>
         <w:rPr>
           <w:rFonts w:eastAsia="黑体"/>
@@ -16530,7 +16620,7 @@
         <w:spacing w:before="46" w:after="46" w:line="240" w:lineRule="auto"/>
         <w:jc w:val="left"/>
       </w:pPr>
-      <w:bookmarkStart w:id="43" w:name="_Toc243671723"/>
+      <w:bookmarkStart w:id="43" w:name="_Toc243673212"/>
       <w:r>
         <w:rPr>
           <w:rFonts w:ascii="Times New Roman" w:eastAsia="黑体" w:hAnsi="Times New Roman" w:cs="Times New Roman"/>
@@ -16637,13 +16727,12 @@
         <w:spacing w:before="46" w:after="46" w:line="240" w:lineRule="auto"/>
         <w:jc w:val="left"/>
       </w:pPr>
-      <w:bookmarkStart w:id="44" w:name="_Toc243671724"/>
+      <w:bookmarkStart w:id="44" w:name="_Toc243673213"/>
       <w:r>
         <w:rPr>
           <w:rFonts w:ascii="Times New Roman" w:eastAsia="黑体" w:hAnsi="Times New Roman" w:cs="Times New Roman"/>
           <w:sz w:val="28"/>
         </w:rPr>
-        <w:lastRenderedPageBreak/>
         <w:t xml:space="preserve">8.2 </w:t>
       </w:r>
       <w:r>
@@ -16661,7 +16750,7 @@
         <w:spacing w:line="240" w:lineRule="auto"/>
         <w:jc w:val="left"/>
       </w:pPr>
-      <w:bookmarkStart w:id="45" w:name="_Toc243671725"/>
+      <w:bookmarkStart w:id="45" w:name="_Toc243673214"/>
       <w:r>
         <w:rPr>
           <w:rFonts w:eastAsia="黑体"/>
@@ -16751,7 +16840,7 @@
         <w:spacing w:line="240" w:lineRule="auto"/>
         <w:jc w:val="left"/>
       </w:pPr>
-      <w:bookmarkStart w:id="46" w:name="_Toc243671726"/>
+      <w:bookmarkStart w:id="46" w:name="_Toc243673215"/>
       <w:r>
         <w:rPr>
           <w:rFonts w:eastAsia="黑体"/>
@@ -16807,8 +16896,9 @@
         <w:rPr>
           <w:noProof/>
         </w:rPr>
+        <w:lastRenderedPageBreak/>
         <w:drawing>
-          <wp:inline distT="0" distB="0" distL="0" distR="0" wp14:anchorId="431210BB" wp14:editId="2718A655">
+          <wp:inline distT="0" distB="0" distL="0" distR="0" wp14:anchorId="7DA69F71" wp14:editId="7C3FB313">
             <wp:extent cx="5486400" cy="3450210"/>
             <wp:effectExtent l="0" t="0" r="0" b="0"/>
             <wp:docPr id="7" name="Picture 7"/>
@@ -16907,11 +16997,7 @@
         <w:t>Delta Sync</w:t>
       </w:r>
       <w:r>
-        <w:t>，轻度落后）：若落后步数处于服务</w:t>
-      </w:r>
-      <w:r>
-        <w:lastRenderedPageBreak/>
-        <w:t>端保留的历史事件窗口内，服务端直接检索落后区间的有序增量事件列表，经当前战争迷雾视野权限过滤后，打包推回给客户端按序回放补齐画面，网络传输开销较低；</w:t>
+        <w:t>，轻度落后）：若落后步数处于服务端保留的历史事件窗口内，服务端直接检索落后区间的有序增量事件列表，经当前战争迷雾视野权限过滤后，打包推回给客户端按序回放补齐画面，网络传输开销较低；</w:t>
       </w:r>
       <w:r>
         <w:t xml:space="preserve">② </w:t>
@@ -16923,19 +17009,19 @@
         <w:t>Snapshot Reset</w:t>
       </w:r>
       <w:r>
-        <w:t>，长时间离线）：若客户端断线时间过长超出历史保留窗口，服务端则调用状态序列化组件生成当前时刻的授权状态基准快照（</w:t>
+        <w:t>，长时间离线）：若客户端断线时间过长超出历史保留窗口，服务端则调用状态序列化组件生成当前时刻的房间授权状态基准快照（</w:t>
       </w:r>
       <w:r>
         <w:t>Baseline Snapshot</w:t>
       </w:r>
       <w:r>
-        <w:t>），其原理参照经典分布式快照（</w:t>
-      </w:r>
-      <w:r>
-        <w:t>Distributed Snapshot</w:t>
-      </w:r>
-      <w:r>
-        <w:t>）状态截面理论</w:t>
+        <w:t>）。需要特别澄清的是，本系统所采用的快照恢复机制，本质上是由集中权威服务导出的房间状态截面与历史重放，并不等同于在对等无中心网络中运行的经典</w:t>
+      </w:r>
+      <w:r>
+        <w:t xml:space="preserve"> Chandy–Lamport </w:t>
+      </w:r>
+      <w:r>
+        <w:t>分布式全局状态快照算法</w:t>
       </w:r>
       <w:r>
         <w:t xml:space="preserve"> </w:t>
@@ -16948,7 +17034,35 @@
         <w:t>[11]</w:t>
       </w:r>
       <w:r>
-        <w:t>。快照包含预置地图标识、当前所有可见标记及其属性，客户端接收后基于基准快照重置本地图形上下文；（</w:t>
+        <w:t>（后者需通过通道标记</w:t>
+      </w:r>
+      <w:r>
+        <w:t xml:space="preserve"> Marker </w:t>
+      </w:r>
+      <w:r>
+        <w:t>机制协调无集中协调者的分布式全局状态截面）；引入文献</w:t>
+      </w:r>
+      <w:r>
+        <w:t xml:space="preserve"> </w:t>
+      </w:r>
+      <w:r>
+        <w:rPr>
+          <w:noProof/>
+          <w:vertAlign w:val="superscript"/>
+        </w:rPr>
+        <w:t>[11]</w:t>
+      </w:r>
+      <w:r>
+        <w:t xml:space="preserve"> </w:t>
+      </w:r>
+      <w:r>
+        <w:t>仅用于建立与分布式系统课程中全局状态截面概念的理论对照与学术讨论，系统并未实现亦不需要去中心化的</w:t>
+      </w:r>
+      <w:r>
+        <w:t xml:space="preserve"> Chandy–Lamport </w:t>
+      </w:r>
+      <w:r>
+        <w:t>算法。快照包含预置地图标识、当前所有可见标记及其属性，客户端接收后基于基准快照重置本地图形上下文；（</w:t>
       </w:r>
       <w:r>
         <w:t>3</w:t>
@@ -16972,7 +17086,7 @@
         <w:t>’</w:t>
       </w:r>
       <w:r>
-        <w:t>作为设计目标用于指导差分恢复策略设计，该指标受网络环境与快照大小制约，未经实测验证。</w:t>
+        <w:t>作为设计目标用于指导差分恢复策略设计，该指标受网络环境与快照大小制约，属于未经测试的设计假设与目标，并非实测性能。</w:t>
       </w:r>
     </w:p>
     <w:p>
@@ -16986,6 +17100,7 @@
           <w:rFonts w:eastAsia="仿宋"/>
           <w:b/>
         </w:rPr>
+        <w:lastRenderedPageBreak/>
         <w:t>表</w:t>
       </w:r>
       <w:r>
@@ -17034,6 +17149,7 @@
           </w:tcPr>
           <w:p>
             <w:pPr>
+              <w:keepNext/>
               <w:spacing w:before="46" w:after="46"/>
               <w:jc w:val="center"/>
             </w:pPr>
@@ -17055,6 +17171,7 @@
           </w:tcPr>
           <w:p>
             <w:pPr>
+              <w:keepNext/>
               <w:spacing w:before="46" w:after="46"/>
               <w:jc w:val="center"/>
             </w:pPr>
@@ -17076,6 +17193,7 @@
           </w:tcPr>
           <w:p>
             <w:pPr>
+              <w:keepNext/>
               <w:spacing w:before="46" w:after="46"/>
               <w:jc w:val="center"/>
             </w:pPr>
@@ -17097,6 +17215,7 @@
           </w:tcPr>
           <w:p>
             <w:pPr>
+              <w:keepNext/>
               <w:spacing w:before="46" w:after="46"/>
               <w:jc w:val="center"/>
             </w:pPr>
@@ -17618,7 +17737,7 @@
         <w:spacing w:line="240" w:lineRule="auto"/>
         <w:jc w:val="left"/>
       </w:pPr>
-      <w:bookmarkStart w:id="47" w:name="_Toc243671727"/>
+      <w:bookmarkStart w:id="47" w:name="_Toc243673216"/>
       <w:r>
         <w:rPr>
           <w:rFonts w:eastAsia="黑体"/>
@@ -17711,7 +17830,7 @@
         <w:spacing w:line="240" w:lineRule="auto"/>
         <w:jc w:val="left"/>
       </w:pPr>
-      <w:bookmarkStart w:id="48" w:name="_Toc243671728"/>
+      <w:bookmarkStart w:id="48" w:name="_Toc243673217"/>
       <w:r>
         <w:rPr>
           <w:rFonts w:eastAsia="黑体"/>
@@ -17760,11 +17879,7 @@
         <w:t>Fault Tolerance</w:t>
       </w:r>
       <w:r>
-        <w:t>）关于容错理论与分布式提交协议的权威</w:t>
-      </w:r>
-      <w:r>
-        <w:lastRenderedPageBreak/>
-        <w:t>论述</w:t>
+        <w:t>）关于容错理论与分布式提交协议的权威论述</w:t>
       </w:r>
       <w:r>
         <w:t xml:space="preserve"> </w:t>
@@ -17873,7 +17988,11 @@
         <w:t xml:space="preserve"> RPC </w:t>
       </w:r>
       <w:r>
-        <w:t>面临节点崩溃或消息丢失时的常见语义：至少一次（</w:t>
+        <w:t>面临</w:t>
+      </w:r>
+      <w:r>
+        <w:lastRenderedPageBreak/>
+        <w:t>节点崩溃或消息丢失时的常见语义：至少一次（</w:t>
       </w:r>
       <w:r>
         <w:t>At-least-once</w:t>
@@ -18066,7 +18185,7 @@
         <w:spacing w:before="46" w:after="46" w:line="240" w:lineRule="auto"/>
         <w:jc w:val="left"/>
       </w:pPr>
-      <w:bookmarkStart w:id="49" w:name="_Toc243671729"/>
+      <w:bookmarkStart w:id="49" w:name="_Toc243673218"/>
       <w:r>
         <w:rPr>
           <w:rFonts w:eastAsia="黑体"/>
@@ -18089,7 +18208,7 @@
         <w:spacing w:before="46" w:after="46" w:line="240" w:lineRule="auto"/>
         <w:jc w:val="left"/>
       </w:pPr>
-      <w:bookmarkStart w:id="50" w:name="_Toc243671730"/>
+      <w:bookmarkStart w:id="50" w:name="_Toc243673219"/>
       <w:r>
         <w:rPr>
           <w:rFonts w:ascii="Times New Roman" w:eastAsia="黑体" w:hAnsi="Times New Roman" w:cs="Times New Roman"/>
@@ -18231,6 +18350,7 @@
           </w:tcPr>
           <w:p>
             <w:pPr>
+              <w:keepNext/>
               <w:spacing w:before="46" w:after="46"/>
               <w:jc w:val="center"/>
             </w:pPr>
@@ -18252,6 +18372,7 @@
           </w:tcPr>
           <w:p>
             <w:pPr>
+              <w:keepNext/>
               <w:spacing w:before="46" w:after="46"/>
               <w:jc w:val="center"/>
             </w:pPr>
@@ -18273,6 +18394,7 @@
           </w:tcPr>
           <w:p>
             <w:pPr>
+              <w:keepNext/>
               <w:spacing w:before="46" w:after="46"/>
               <w:jc w:val="center"/>
             </w:pPr>
@@ -18294,6 +18416,7 @@
           </w:tcPr>
           <w:p>
             <w:pPr>
+              <w:keepNext/>
               <w:spacing w:before="46" w:after="46"/>
               <w:jc w:val="center"/>
             </w:pPr>
@@ -18411,7 +18534,6 @@
               <w:rPr>
                 <w:sz w:val="18"/>
               </w:rPr>
-              <w:lastRenderedPageBreak/>
               <w:t>Chapter 2 Architectures</w:t>
             </w:r>
           </w:p>
@@ -18706,6 +18828,7 @@
               <w:rPr>
                 <w:sz w:val="18"/>
               </w:rPr>
+              <w:lastRenderedPageBreak/>
               <w:t>Chapter 5 Naming</w:t>
             </w:r>
           </w:p>
@@ -19116,7 +19239,7 @@
         <w:spacing w:before="46" w:after="46" w:line="240" w:lineRule="auto"/>
         <w:jc w:val="left"/>
       </w:pPr>
-      <w:bookmarkStart w:id="51" w:name="_Toc243671731"/>
+      <w:bookmarkStart w:id="51" w:name="_Toc243673220"/>
       <w:r>
         <w:rPr>
           <w:rFonts w:ascii="Times New Roman" w:eastAsia="黑体" w:hAnsi="Times New Roman" w:cs="Times New Roman"/>
@@ -19233,7 +19356,7 @@
         <w:spacing w:before="46" w:after="46" w:line="240" w:lineRule="auto"/>
         <w:jc w:val="left"/>
       </w:pPr>
-      <w:bookmarkStart w:id="52" w:name="_Toc243671732"/>
+      <w:bookmarkStart w:id="52" w:name="_Toc243673221"/>
       <w:r>
         <w:rPr>
           <w:rFonts w:ascii="Times New Roman" w:eastAsia="黑体" w:hAnsi="Times New Roman" w:cs="Times New Roman"/>
@@ -19262,95 +19385,98 @@
         <w:t>1</w:t>
       </w:r>
       <w:r>
-        <w:t>）</w:t>
+        <w:t>）性能指标属于未经测试的设计假设与目标：单房间最多</w:t>
+      </w:r>
+      <w:r>
+        <w:t xml:space="preserve"> 8 </w:t>
+      </w:r>
+      <w:r>
+        <w:t>人、初始约</w:t>
+      </w:r>
+      <w:r>
+        <w:t xml:space="preserve"> 100 </w:t>
+      </w:r>
+      <w:r>
+        <w:t>个并发房间、</w:t>
+      </w:r>
+      <w:r>
+        <w:t xml:space="preserve">P95 </w:t>
+      </w:r>
+      <w:r>
+        <w:t>延迟目标</w:t>
+      </w:r>
+      <w:r>
+        <w:t xml:space="preserve"> ≤ 300ms</w:t>
+      </w:r>
+      <w:r>
+        <w:t>（权威库提交至授权客户端）与常规</w:t>
+      </w:r>
+      <w:r>
+        <w:t xml:space="preserve"> API </w:t>
+      </w:r>
+      <w:r>
+        <w:t>处理</w:t>
+      </w:r>
+      <w:r>
+        <w:t xml:space="preserve"> P95 </w:t>
+      </w:r>
+      <w:r>
+        <w:t>延迟</w:t>
+      </w:r>
+      <w:r>
+        <w:t xml:space="preserve"> ≤ 500ms</w:t>
+      </w:r>
+      <w:r>
+        <w:t>，以及网络恢复后普通房间</w:t>
+      </w:r>
+      <w:r>
+        <w:t xml:space="preserve"> 5 </w:t>
+      </w:r>
+      <w:r>
+        <w:t>秒内恢复状态等指标，均为用于辅助系统推演的设计假设或设计目标，不是教师规定的硬性指标，也不是已经实现或经过压力测试验证的性能承诺，实际表现受限于网络环境、硬件配置与并发争用程度；（</w:t>
+      </w:r>
+      <w:r>
+        <w:t>2</w:t>
+      </w:r>
+      <w:r>
+        <w:t>）异步复制下的数据丢失风险：若持久化存储采用主备异步流复制机制，在主节点发生突发硬件掉电或严重故障时，尚未复制到备用节点的数据存在丢失风险，系统不承诺绝对的</w:t>
+      </w:r>
+      <w:r>
+        <w:t>‘</w:t>
+      </w:r>
+      <w:r>
+        <w:t>零数据丢失</w:t>
+      </w:r>
+      <w:r>
+        <w:t>’</w:t>
+      </w:r>
+      <w:r>
+        <w:t>；（</w:t>
+      </w:r>
+      <w:r>
+        <w:t>3</w:t>
+      </w:r>
+      <w:r>
+        <w:t>）服务接管机制尚未经过完整工程实现验证：虽然提出了租约与</w:t>
+      </w:r>
+      <w:r>
+        <w:t xml:space="preserve"> Fencing Token </w:t>
+      </w:r>
+      <w:r>
+        <w:t>的防脑裂思路，但自动故障切换在实</w:t>
       </w:r>
       <w:r>
         <w:lastRenderedPageBreak/>
-        <w:t>性能指标属于未经测试的设计假设与目标：单房间最多</w:t>
-      </w:r>
-      <w:r>
-        <w:t xml:space="preserve"> 8 </w:t>
-      </w:r>
-      <w:r>
-        <w:t>人、初始约</w:t>
-      </w:r>
-      <w:r>
-        <w:t xml:space="preserve"> 100 </w:t>
-      </w:r>
-      <w:r>
-        <w:t>个并发房间、</w:t>
-      </w:r>
-      <w:r>
-        <w:t xml:space="preserve">P95 </w:t>
-      </w:r>
-      <w:r>
-        <w:t>延迟目标</w:t>
-      </w:r>
-      <w:r>
-        <w:t xml:space="preserve"> ≤ 300ms</w:t>
-      </w:r>
-      <w:r>
-        <w:t>（权威库提交至授权客户端）与常规</w:t>
-      </w:r>
-      <w:r>
-        <w:t xml:space="preserve"> API </w:t>
-      </w:r>
-      <w:r>
-        <w:t>处理</w:t>
-      </w:r>
-      <w:r>
-        <w:t xml:space="preserve"> P95 </w:t>
-      </w:r>
-      <w:r>
-        <w:t>延迟</w:t>
-      </w:r>
-      <w:r>
-        <w:t xml:space="preserve"> ≤ 500ms</w:t>
-      </w:r>
-      <w:r>
-        <w:t>，以及网络恢复后普通房间</w:t>
-      </w:r>
-      <w:r>
-        <w:t xml:space="preserve"> 5 </w:t>
-      </w:r>
-      <w:r>
-        <w:t>秒内恢复状态等指标，均为用于辅助系统推演的设计假设或设计目标，不是教师规定的硬性指标，也不是已经实现或经过压力测试验证的性能承诺，实际表现受限于网络环境、硬件配置与并发争用程度；（</w:t>
-      </w:r>
-      <w:r>
-        <w:t>2</w:t>
-      </w:r>
-      <w:r>
-        <w:t>）异步复制下的数据丢失风险：若持久化存储采用主备异步流复制机制，在主节点发生突发硬件掉电或严重故障时，尚未复制到备用节点的数据存在丢失风险，系统不承诺绝对的</w:t>
-      </w:r>
-      <w:r>
-        <w:t>‘</w:t>
-      </w:r>
-      <w:r>
-        <w:t>零数据丢失</w:t>
-      </w:r>
-      <w:r>
-        <w:t>’</w:t>
-      </w:r>
-      <w:r>
-        <w:t>；（</w:t>
-      </w:r>
-      <w:r>
-        <w:t>3</w:t>
-      </w:r>
-      <w:r>
-        <w:t>）服务接管机制尚未经过完整工程实现验证：虽然提出了租约与</w:t>
-      </w:r>
-      <w:r>
-        <w:t xml:space="preserve"> Fencing Token </w:t>
-      </w:r>
-      <w:r>
-        <w:t>的防脑裂思路，但自动故障切换在实际生产中对心跳阈值、时钟漂移和网络分区的容忍度要求极高，本报告仅给出了概要设计方案，尚未完成详细工程实现与极端测试；（</w:t>
+        <w:t>际生产中对心跳阈值、时钟漂移和网络分区的容忍度要求极高，本报告仅给出了概要设计方案，尚未完成详细工程实现与极端测试；（</w:t>
       </w:r>
       <w:r>
         <w:t>4</w:t>
       </w:r>
       <w:r>
-        <w:t>）单房间权威排队与系统水平扩展的权衡：单房间由单一权威节点协调简化了并发控制，但若未来出现超大规模房间或极高频标记更新，该单点可能成为局部吞吐瓶颈，需在后续详细设计中进一步评估水平切分策略。上述局限性为系统后续的工程原型实现、性能基准测试与详细架构设计提供了明确的方向。</w:t>
+        <w:t>）单房间权威排队与系统水平扩展的权衡：单房间由单一权威节点协调简化了并发控制，但若未来出现超大规模房间或极高频标记更新，该单点可能成为局部吞吐瓶颈，需在后续详细设计中进一步评估水平切分策略。上述局限性</w:t>
+      </w:r>
+      <w:r>
+        <w:t>为系统后续的工程原型实现、性能基准测试与详细架构设计提供了明确的方向。</w:t>
       </w:r>
     </w:p>
     <w:p>
@@ -19359,7 +19485,7 @@
         <w:spacing w:before="46" w:after="46" w:line="240" w:lineRule="auto"/>
         <w:jc w:val="left"/>
       </w:pPr>
-      <w:bookmarkStart w:id="53" w:name="_Toc243671733"/>
+      <w:bookmarkStart w:id="53" w:name="_Toc243673222"/>
       <w:r>
         <w:rPr>
           <w:rFonts w:eastAsia="黑体"/>
@@ -19629,7 +19755,7 @@
           <w:szCs w:val="28"/>
         </w:rPr>
       </w:pPr>
-      <w:bookmarkStart w:id="54" w:name="_Toc243671734"/>
+      <w:bookmarkStart w:id="54" w:name="_Toc243673223"/>
       <w:r>
         <w:rPr>
           <w:rFonts w:eastAsia="仿宋" w:hint="eastAsia"/>
@@ -19714,6 +19840,7 @@
       </w:tblGrid>
       <w:tr>
         <w:trPr>
+          <w:cantSplit/>
           <w:trHeight w:val="402"/>
         </w:trPr>
         <w:tc>
@@ -20093,6 +20220,7 @@
       </w:tr>
       <w:tr>
         <w:trPr>
+          <w:cantSplit/>
           <w:trHeight w:val="402"/>
         </w:trPr>
         <w:tc>
@@ -20882,6 +21010,7 @@
       </w:tr>
       <w:tr>
         <w:trPr>
+          <w:cantSplit/>
           <w:trHeight w:val="402"/>
         </w:trPr>
         <w:tc>

</xml_diff>

<commit_message>
fix(verify): enhance table structure and multipage pdf verification, correct cover spacing metric
</commit_message>
<xml_diff>
--- a/output/Distributed_Design_Report_Draft_v2.docx
+++ b/output/Distributed_Design_Report_Draft_v2.docx
@@ -1771,7 +1771,7 @@
           <w:r>
             <w:fldChar w:fldCharType="separate"/>
           </w:r>
-          <w:hyperlink w:anchor="_Toc243673169" w:history="1">
+          <w:hyperlink w:anchor="_Toc243674785" w:history="1">
             <w:r>
               <w:rPr>
                 <w:rStyle w:val="ab"/>
@@ -1817,7 +1817,7 @@
                 <w:noProof/>
                 <w:webHidden/>
               </w:rPr>
-              <w:instrText>PAGEREF _Toc243673169 \h</w:instrText>
+              <w:instrText>PAGEREF _Toc243674785 \h</w:instrText>
             </w:r>
             <w:r>
               <w:rPr>
@@ -1873,7 +1873,7 @@
               <w14:ligatures w14:val="standardContextual"/>
             </w:rPr>
           </w:pPr>
-          <w:hyperlink w:anchor="_Toc243673170" w:history="1">
+          <w:hyperlink w:anchor="_Toc243674786" w:history="1">
             <w:r>
               <w:rPr>
                 <w:rStyle w:val="ab"/>
@@ -1919,7 +1919,7 @@
                 <w:noProof/>
                 <w:webHidden/>
               </w:rPr>
-              <w:instrText>PAGEREF _Toc243673170 \h</w:instrText>
+              <w:instrText>PAGEREF _Toc243674786 \h</w:instrText>
             </w:r>
             <w:r>
               <w:rPr>
@@ -1975,7 +1975,7 @@
               <w14:ligatures w14:val="standardContextual"/>
             </w:rPr>
           </w:pPr>
-          <w:hyperlink w:anchor="_Toc243673171" w:history="1">
+          <w:hyperlink w:anchor="_Toc243674787" w:history="1">
             <w:r>
               <w:rPr>
                 <w:rStyle w:val="ab"/>
@@ -2021,7 +2021,7 @@
                 <w:noProof/>
                 <w:webHidden/>
               </w:rPr>
-              <w:instrText>PAGEREF _Toc243673171 \h</w:instrText>
+              <w:instrText>PAGEREF _Toc243674787 \h</w:instrText>
             </w:r>
             <w:r>
               <w:rPr>
@@ -2077,7 +2077,7 @@
               <w14:ligatures w14:val="standardContextual"/>
             </w:rPr>
           </w:pPr>
-          <w:hyperlink w:anchor="_Toc243673172" w:history="1">
+          <w:hyperlink w:anchor="_Toc243674788" w:history="1">
             <w:r>
               <w:rPr>
                 <w:rStyle w:val="ab"/>
@@ -2123,7 +2123,7 @@
                 <w:noProof/>
                 <w:webHidden/>
               </w:rPr>
-              <w:instrText>PAGEREF _Toc243673172 \h</w:instrText>
+              <w:instrText>PAGEREF _Toc243674788 \h</w:instrText>
             </w:r>
             <w:r>
               <w:rPr>
@@ -2179,7 +2179,7 @@
               <w14:ligatures w14:val="standardContextual"/>
             </w:rPr>
           </w:pPr>
-          <w:hyperlink w:anchor="_Toc243673173" w:history="1">
+          <w:hyperlink w:anchor="_Toc243674789" w:history="1">
             <w:r>
               <w:rPr>
                 <w:rStyle w:val="ab"/>
@@ -2225,7 +2225,7 @@
                 <w:noProof/>
                 <w:webHidden/>
               </w:rPr>
-              <w:instrText>PAGEREF _Toc243673173 \h</w:instrText>
+              <w:instrText>PAGEREF _Toc243674789 \h</w:instrText>
             </w:r>
             <w:r>
               <w:rPr>
@@ -2281,7 +2281,7 @@
               <w14:ligatures w14:val="standardContextual"/>
             </w:rPr>
           </w:pPr>
-          <w:hyperlink w:anchor="_Toc243673174" w:history="1">
+          <w:hyperlink w:anchor="_Toc243674790" w:history="1">
             <w:r>
               <w:rPr>
                 <w:rStyle w:val="ab"/>
@@ -2327,7 +2327,7 @@
                 <w:noProof/>
                 <w:webHidden/>
               </w:rPr>
-              <w:instrText>PAGEREF _Toc243673174 \h</w:instrText>
+              <w:instrText>PAGEREF _Toc243674790 \h</w:instrText>
             </w:r>
             <w:r>
               <w:rPr>
@@ -2383,7 +2383,7 @@
               <w14:ligatures w14:val="standardContextual"/>
             </w:rPr>
           </w:pPr>
-          <w:hyperlink w:anchor="_Toc243673175" w:history="1">
+          <w:hyperlink w:anchor="_Toc243674791" w:history="1">
             <w:r>
               <w:rPr>
                 <w:rStyle w:val="ab"/>
@@ -2429,7 +2429,7 @@
                 <w:noProof/>
                 <w:webHidden/>
               </w:rPr>
-              <w:instrText>PAGEREF _Toc243673175 \h</w:instrText>
+              <w:instrText>PAGEREF _Toc243674791 \h</w:instrText>
             </w:r>
             <w:r>
               <w:rPr>
@@ -2485,7 +2485,7 @@
               <w14:ligatures w14:val="standardContextual"/>
             </w:rPr>
           </w:pPr>
-          <w:hyperlink w:anchor="_Toc243673176" w:history="1">
+          <w:hyperlink w:anchor="_Toc243674792" w:history="1">
             <w:r>
               <w:rPr>
                 <w:rStyle w:val="ab"/>
@@ -2531,7 +2531,7 @@
                 <w:noProof/>
                 <w:webHidden/>
               </w:rPr>
-              <w:instrText>PAGEREF _Toc243673176 \h</w:instrText>
+              <w:instrText>PAGEREF _Toc243674792 \h</w:instrText>
             </w:r>
             <w:r>
               <w:rPr>
@@ -2587,7 +2587,7 @@
               <w14:ligatures w14:val="standardContextual"/>
             </w:rPr>
           </w:pPr>
-          <w:hyperlink w:anchor="_Toc243673177" w:history="1">
+          <w:hyperlink w:anchor="_Toc243674793" w:history="1">
             <w:r>
               <w:rPr>
                 <w:rStyle w:val="ab"/>
@@ -2633,7 +2633,7 @@
                 <w:noProof/>
                 <w:webHidden/>
               </w:rPr>
-              <w:instrText>PAGEREF _Toc243673177 \h</w:instrText>
+              <w:instrText>PAGEREF _Toc243674793 \h</w:instrText>
             </w:r>
             <w:r>
               <w:rPr>
@@ -2689,7 +2689,7 @@
               <w14:ligatures w14:val="standardContextual"/>
             </w:rPr>
           </w:pPr>
-          <w:hyperlink w:anchor="_Toc243673178" w:history="1">
+          <w:hyperlink w:anchor="_Toc243674794" w:history="1">
             <w:r>
               <w:rPr>
                 <w:rStyle w:val="ab"/>
@@ -2751,7 +2751,7 @@
                 <w:noProof/>
                 <w:webHidden/>
               </w:rPr>
-              <w:instrText>PAGEREF _Toc243673178 \h</w:instrText>
+              <w:instrText>PAGEREF _Toc243674794 \h</w:instrText>
             </w:r>
             <w:r>
               <w:rPr>
@@ -2807,7 +2807,7 @@
               <w14:ligatures w14:val="standardContextual"/>
             </w:rPr>
           </w:pPr>
-          <w:hyperlink w:anchor="_Toc243673179" w:history="1">
+          <w:hyperlink w:anchor="_Toc243674795" w:history="1">
             <w:r>
               <w:rPr>
                 <w:rStyle w:val="ab"/>
@@ -2853,7 +2853,7 @@
                 <w:noProof/>
                 <w:webHidden/>
               </w:rPr>
-              <w:instrText>PAGEREF _Toc243673179 \h</w:instrText>
+              <w:instrText>PAGEREF _Toc243674795 \h</w:instrText>
             </w:r>
             <w:r>
               <w:rPr>
@@ -2909,7 +2909,7 @@
               <w14:ligatures w14:val="standardContextual"/>
             </w:rPr>
           </w:pPr>
-          <w:hyperlink w:anchor="_Toc243673180" w:history="1">
+          <w:hyperlink w:anchor="_Toc243674796" w:history="1">
             <w:r>
               <w:rPr>
                 <w:rStyle w:val="ab"/>
@@ -2987,7 +2987,7 @@
                 <w:noProof/>
                 <w:webHidden/>
               </w:rPr>
-              <w:instrText>PAGEREF _Toc243673180 \h</w:instrText>
+              <w:instrText>PAGEREF _Toc243674796 \h</w:instrText>
             </w:r>
             <w:r>
               <w:rPr>
@@ -3043,7 +3043,7 @@
               <w14:ligatures w14:val="standardContextual"/>
             </w:rPr>
           </w:pPr>
-          <w:hyperlink w:anchor="_Toc243673181" w:history="1">
+          <w:hyperlink w:anchor="_Toc243674797" w:history="1">
             <w:r>
               <w:rPr>
                 <w:rStyle w:val="ab"/>
@@ -3089,7 +3089,7 @@
                 <w:noProof/>
                 <w:webHidden/>
               </w:rPr>
-              <w:instrText>PAGEREF _Toc243673181 \h</w:instrText>
+              <w:instrText>PAGEREF _Toc243674797 \h</w:instrText>
             </w:r>
             <w:r>
               <w:rPr>
@@ -3145,7 +3145,7 @@
               <w14:ligatures w14:val="standardContextual"/>
             </w:rPr>
           </w:pPr>
-          <w:hyperlink w:anchor="_Toc243673182" w:history="1">
+          <w:hyperlink w:anchor="_Toc243674798" w:history="1">
             <w:r>
               <w:rPr>
                 <w:rStyle w:val="ab"/>
@@ -3191,7 +3191,7 @@
                 <w:noProof/>
                 <w:webHidden/>
               </w:rPr>
-              <w:instrText>PAGEREF _Toc243673182 \h</w:instrText>
+              <w:instrText>PAGEREF _Toc243674798 \h</w:instrText>
             </w:r>
             <w:r>
               <w:rPr>
@@ -3247,7 +3247,7 @@
               <w14:ligatures w14:val="standardContextual"/>
             </w:rPr>
           </w:pPr>
-          <w:hyperlink w:anchor="_Toc243673183" w:history="1">
+          <w:hyperlink w:anchor="_Toc243674799" w:history="1">
             <w:r>
               <w:rPr>
                 <w:rStyle w:val="ab"/>
@@ -3293,7 +3293,7 @@
                 <w:noProof/>
                 <w:webHidden/>
               </w:rPr>
-              <w:instrText>PAGEREF _Toc243673183 \h</w:instrText>
+              <w:instrText>PAGEREF _Toc243674799 \h</w:instrText>
             </w:r>
             <w:r>
               <w:rPr>
@@ -3349,7 +3349,7 @@
               <w14:ligatures w14:val="standardContextual"/>
             </w:rPr>
           </w:pPr>
-          <w:hyperlink w:anchor="_Toc243673184" w:history="1">
+          <w:hyperlink w:anchor="_Toc243674800" w:history="1">
             <w:r>
               <w:rPr>
                 <w:rStyle w:val="ab"/>
@@ -3395,7 +3395,7 @@
                 <w:noProof/>
                 <w:webHidden/>
               </w:rPr>
-              <w:instrText>PAGEREF _Toc243673184 \h</w:instrText>
+              <w:instrText>PAGEREF _Toc243674800 \h</w:instrText>
             </w:r>
             <w:r>
               <w:rPr>
@@ -3451,7 +3451,7 @@
               <w14:ligatures w14:val="standardContextual"/>
             </w:rPr>
           </w:pPr>
-          <w:hyperlink w:anchor="_Toc243673185" w:history="1">
+          <w:hyperlink w:anchor="_Toc243674801" w:history="1">
             <w:r>
               <w:rPr>
                 <w:rStyle w:val="ab"/>
@@ -3497,7 +3497,7 @@
                 <w:noProof/>
                 <w:webHidden/>
               </w:rPr>
-              <w:instrText>PAGEREF _Toc243673185 \h</w:instrText>
+              <w:instrText>PAGEREF _Toc243674801 \h</w:instrText>
             </w:r>
             <w:r>
               <w:rPr>
@@ -3553,7 +3553,7 @@
               <w14:ligatures w14:val="standardContextual"/>
             </w:rPr>
           </w:pPr>
-          <w:hyperlink w:anchor="_Toc243673186" w:history="1">
+          <w:hyperlink w:anchor="_Toc243674802" w:history="1">
             <w:r>
               <w:rPr>
                 <w:rStyle w:val="ab"/>
@@ -3599,7 +3599,7 @@
                 <w:noProof/>
                 <w:webHidden/>
               </w:rPr>
-              <w:instrText>PAGEREF _Toc243673186 \h</w:instrText>
+              <w:instrText>PAGEREF _Toc243674802 \h</w:instrText>
             </w:r>
             <w:r>
               <w:rPr>
@@ -3655,7 +3655,7 @@
               <w14:ligatures w14:val="standardContextual"/>
             </w:rPr>
           </w:pPr>
-          <w:hyperlink w:anchor="_Toc243673187" w:history="1">
+          <w:hyperlink w:anchor="_Toc243674803" w:history="1">
             <w:r>
               <w:rPr>
                 <w:rStyle w:val="ab"/>
@@ -3701,7 +3701,7 @@
                 <w:noProof/>
                 <w:webHidden/>
               </w:rPr>
-              <w:instrText>PAGEREF _Toc243673187 \h</w:instrText>
+              <w:instrText>PAGEREF _Toc243674803 \h</w:instrText>
             </w:r>
             <w:r>
               <w:rPr>
@@ -3757,7 +3757,7 @@
               <w14:ligatures w14:val="standardContextual"/>
             </w:rPr>
           </w:pPr>
-          <w:hyperlink w:anchor="_Toc243673188" w:history="1">
+          <w:hyperlink w:anchor="_Toc243674804" w:history="1">
             <w:r>
               <w:rPr>
                 <w:rStyle w:val="ab"/>
@@ -3803,7 +3803,7 @@
                 <w:noProof/>
                 <w:webHidden/>
               </w:rPr>
-              <w:instrText>PAGEREF _Toc243673188 \h</w:instrText>
+              <w:instrText>PAGEREF _Toc243674804 \h</w:instrText>
             </w:r>
             <w:r>
               <w:rPr>
@@ -3859,7 +3859,7 @@
               <w14:ligatures w14:val="standardContextual"/>
             </w:rPr>
           </w:pPr>
-          <w:hyperlink w:anchor="_Toc243673189" w:history="1">
+          <w:hyperlink w:anchor="_Toc243674805" w:history="1">
             <w:r>
               <w:rPr>
                 <w:rStyle w:val="ab"/>
@@ -3905,7 +3905,7 @@
                 <w:noProof/>
                 <w:webHidden/>
               </w:rPr>
-              <w:instrText>PAGEREF _Toc243673189 \h</w:instrText>
+              <w:instrText>PAGEREF _Toc243674805 \h</w:instrText>
             </w:r>
             <w:r>
               <w:rPr>
@@ -3961,7 +3961,7 @@
               <w14:ligatures w14:val="standardContextual"/>
             </w:rPr>
           </w:pPr>
-          <w:hyperlink w:anchor="_Toc243673190" w:history="1">
+          <w:hyperlink w:anchor="_Toc243674806" w:history="1">
             <w:r>
               <w:rPr>
                 <w:rStyle w:val="ab"/>
@@ -4023,7 +4023,7 @@
                 <w:noProof/>
                 <w:webHidden/>
               </w:rPr>
-              <w:instrText>PAGEREF _Toc243673190 \h</w:instrText>
+              <w:instrText>PAGEREF _Toc243674806 \h</w:instrText>
             </w:r>
             <w:r>
               <w:rPr>
@@ -4079,7 +4079,7 @@
               <w14:ligatures w14:val="standardContextual"/>
             </w:rPr>
           </w:pPr>
-          <w:hyperlink w:anchor="_Toc243673191" w:history="1">
+          <w:hyperlink w:anchor="_Toc243674807" w:history="1">
             <w:r>
               <w:rPr>
                 <w:rStyle w:val="ab"/>
@@ -4125,7 +4125,7 @@
                 <w:noProof/>
                 <w:webHidden/>
               </w:rPr>
-              <w:instrText>PAGEREF _Toc243673191 \h</w:instrText>
+              <w:instrText>PAGEREF _Toc243674807 \h</w:instrText>
             </w:r>
             <w:r>
               <w:rPr>
@@ -4181,7 +4181,7 @@
               <w14:ligatures w14:val="standardContextual"/>
             </w:rPr>
           </w:pPr>
-          <w:hyperlink w:anchor="_Toc243673192" w:history="1">
+          <w:hyperlink w:anchor="_Toc243674808" w:history="1">
             <w:r>
               <w:rPr>
                 <w:rStyle w:val="ab"/>
@@ -4243,7 +4243,7 @@
                 <w:noProof/>
                 <w:webHidden/>
               </w:rPr>
-              <w:instrText>PAGEREF _Toc243673192 \h</w:instrText>
+              <w:instrText>PAGEREF _Toc243674808 \h</w:instrText>
             </w:r>
             <w:r>
               <w:rPr>
@@ -4299,7 +4299,7 @@
               <w14:ligatures w14:val="standardContextual"/>
             </w:rPr>
           </w:pPr>
-          <w:hyperlink w:anchor="_Toc243673193" w:history="1">
+          <w:hyperlink w:anchor="_Toc243674809" w:history="1">
             <w:r>
               <w:rPr>
                 <w:rStyle w:val="ab"/>
@@ -4345,7 +4345,7 @@
                 <w:noProof/>
                 <w:webHidden/>
               </w:rPr>
-              <w:instrText>PAGEREF _Toc243673193 \h</w:instrText>
+              <w:instrText>PAGEREF _Toc243674809 \h</w:instrText>
             </w:r>
             <w:r>
               <w:rPr>
@@ -4401,7 +4401,7 @@
               <w14:ligatures w14:val="standardContextual"/>
             </w:rPr>
           </w:pPr>
-          <w:hyperlink w:anchor="_Toc243673194" w:history="1">
+          <w:hyperlink w:anchor="_Toc243674810" w:history="1">
             <w:r>
               <w:rPr>
                 <w:rStyle w:val="ab"/>
@@ -4447,7 +4447,7 @@
                 <w:noProof/>
                 <w:webHidden/>
               </w:rPr>
-              <w:instrText>PAGEREF _Toc243673194 \h</w:instrText>
+              <w:instrText>PAGEREF _Toc243674810 \h</w:instrText>
             </w:r>
             <w:r>
               <w:rPr>
@@ -4503,7 +4503,7 @@
               <w14:ligatures w14:val="standardContextual"/>
             </w:rPr>
           </w:pPr>
-          <w:hyperlink w:anchor="_Toc243673195" w:history="1">
+          <w:hyperlink w:anchor="_Toc243674811" w:history="1">
             <w:r>
               <w:rPr>
                 <w:rStyle w:val="ab"/>
@@ -4549,7 +4549,7 @@
                 <w:noProof/>
                 <w:webHidden/>
               </w:rPr>
-              <w:instrText>PAGEREF _Toc243673195 \h</w:instrText>
+              <w:instrText>PAGEREF _Toc243674811 \h</w:instrText>
             </w:r>
             <w:r>
               <w:rPr>
@@ -4605,7 +4605,7 @@
               <w14:ligatures w14:val="standardContextual"/>
             </w:rPr>
           </w:pPr>
-          <w:hyperlink w:anchor="_Toc243673196" w:history="1">
+          <w:hyperlink w:anchor="_Toc243674812" w:history="1">
             <w:r>
               <w:rPr>
                 <w:rStyle w:val="ab"/>
@@ -4651,7 +4651,7 @@
                 <w:noProof/>
                 <w:webHidden/>
               </w:rPr>
-              <w:instrText>PAGEREF _Toc243673196 \h</w:instrText>
+              <w:instrText>PAGEREF _Toc243674812 \h</w:instrText>
             </w:r>
             <w:r>
               <w:rPr>
@@ -4707,7 +4707,7 @@
               <w14:ligatures w14:val="standardContextual"/>
             </w:rPr>
           </w:pPr>
-          <w:hyperlink w:anchor="_Toc243673197" w:history="1">
+          <w:hyperlink w:anchor="_Toc243674813" w:history="1">
             <w:r>
               <w:rPr>
                 <w:rStyle w:val="ab"/>
@@ -4753,7 +4753,7 @@
                 <w:noProof/>
                 <w:webHidden/>
               </w:rPr>
-              <w:instrText>PAGEREF _Toc243673197 \h</w:instrText>
+              <w:instrText>PAGEREF _Toc243674813 \h</w:instrText>
             </w:r>
             <w:r>
               <w:rPr>
@@ -4809,7 +4809,7 @@
               <w14:ligatures w14:val="standardContextual"/>
             </w:rPr>
           </w:pPr>
-          <w:hyperlink w:anchor="_Toc243673198" w:history="1">
+          <w:hyperlink w:anchor="_Toc243674814" w:history="1">
             <w:r>
               <w:rPr>
                 <w:rStyle w:val="ab"/>
@@ -4871,7 +4871,7 @@
                 <w:noProof/>
                 <w:webHidden/>
               </w:rPr>
-              <w:instrText>PAGEREF _Toc243673198 \h</w:instrText>
+              <w:instrText>PAGEREF _Toc243674814 \h</w:instrText>
             </w:r>
             <w:r>
               <w:rPr>
@@ -4927,7 +4927,7 @@
               <w14:ligatures w14:val="standardContextual"/>
             </w:rPr>
           </w:pPr>
-          <w:hyperlink w:anchor="_Toc243673199" w:history="1">
+          <w:hyperlink w:anchor="_Toc243674815" w:history="1">
             <w:r>
               <w:rPr>
                 <w:rStyle w:val="ab"/>
@@ -4973,7 +4973,7 @@
                 <w:noProof/>
                 <w:webHidden/>
               </w:rPr>
-              <w:instrText>PAGEREF _Toc243673199 \h</w:instrText>
+              <w:instrText>PAGEREF _Toc243674815 \h</w:instrText>
             </w:r>
             <w:r>
               <w:rPr>
@@ -5029,7 +5029,7 @@
               <w14:ligatures w14:val="standardContextual"/>
             </w:rPr>
           </w:pPr>
-          <w:hyperlink w:anchor="_Toc243673200" w:history="1">
+          <w:hyperlink w:anchor="_Toc243674816" w:history="1">
             <w:r>
               <w:rPr>
                 <w:rStyle w:val="ab"/>
@@ -5075,7 +5075,7 @@
                 <w:noProof/>
                 <w:webHidden/>
               </w:rPr>
-              <w:instrText>PAGEREF _Toc243673200 \h</w:instrText>
+              <w:instrText>PAGEREF _Toc243674816 \h</w:instrText>
             </w:r>
             <w:r>
               <w:rPr>
@@ -5131,7 +5131,7 @@
               <w14:ligatures w14:val="standardContextual"/>
             </w:rPr>
           </w:pPr>
-          <w:hyperlink w:anchor="_Toc243673201" w:history="1">
+          <w:hyperlink w:anchor="_Toc243674817" w:history="1">
             <w:r>
               <w:rPr>
                 <w:rStyle w:val="ab"/>
@@ -5177,7 +5177,7 @@
                 <w:noProof/>
                 <w:webHidden/>
               </w:rPr>
-              <w:instrText>PAGEREF _Toc243673201 \h</w:instrText>
+              <w:instrText>PAGEREF _Toc243674817 \h</w:instrText>
             </w:r>
             <w:r>
               <w:rPr>
@@ -5233,7 +5233,7 @@
               <w14:ligatures w14:val="standardContextual"/>
             </w:rPr>
           </w:pPr>
-          <w:hyperlink w:anchor="_Toc243673202" w:history="1">
+          <w:hyperlink w:anchor="_Toc243674818" w:history="1">
             <w:r>
               <w:rPr>
                 <w:rStyle w:val="ab"/>
@@ -5279,7 +5279,7 @@
                 <w:noProof/>
                 <w:webHidden/>
               </w:rPr>
-              <w:instrText>PAGEREF _Toc243673202 \h</w:instrText>
+              <w:instrText>PAGEREF _Toc243674818 \h</w:instrText>
             </w:r>
             <w:r>
               <w:rPr>
@@ -5335,7 +5335,7 @@
               <w14:ligatures w14:val="standardContextual"/>
             </w:rPr>
           </w:pPr>
-          <w:hyperlink w:anchor="_Toc243673203" w:history="1">
+          <w:hyperlink w:anchor="_Toc243674819" w:history="1">
             <w:r>
               <w:rPr>
                 <w:rStyle w:val="ab"/>
@@ -5381,7 +5381,7 @@
                 <w:noProof/>
                 <w:webHidden/>
               </w:rPr>
-              <w:instrText>PAGEREF _Toc243673203 \h</w:instrText>
+              <w:instrText>PAGEREF _Toc243674819 \h</w:instrText>
             </w:r>
             <w:r>
               <w:rPr>
@@ -5437,7 +5437,7 @@
               <w14:ligatures w14:val="standardContextual"/>
             </w:rPr>
           </w:pPr>
-          <w:hyperlink w:anchor="_Toc243673204" w:history="1">
+          <w:hyperlink w:anchor="_Toc243674820" w:history="1">
             <w:r>
               <w:rPr>
                 <w:rStyle w:val="ab"/>
@@ -5483,7 +5483,7 @@
                 <w:noProof/>
                 <w:webHidden/>
               </w:rPr>
-              <w:instrText>PAGEREF _Toc243673204 \h</w:instrText>
+              <w:instrText>PAGEREF _Toc243674820 \h</w:instrText>
             </w:r>
             <w:r>
               <w:rPr>
@@ -5539,7 +5539,7 @@
               <w14:ligatures w14:val="standardContextual"/>
             </w:rPr>
           </w:pPr>
-          <w:hyperlink w:anchor="_Toc243673205" w:history="1">
+          <w:hyperlink w:anchor="_Toc243674821" w:history="1">
             <w:r>
               <w:rPr>
                 <w:rStyle w:val="ab"/>
@@ -5585,7 +5585,7 @@
                 <w:noProof/>
                 <w:webHidden/>
               </w:rPr>
-              <w:instrText>PAGEREF _Toc243673205 \h</w:instrText>
+              <w:instrText>PAGEREF _Toc243674821 \h</w:instrText>
             </w:r>
             <w:r>
               <w:rPr>
@@ -5641,7 +5641,7 @@
               <w14:ligatures w14:val="standardContextual"/>
             </w:rPr>
           </w:pPr>
-          <w:hyperlink w:anchor="_Toc243673206" w:history="1">
+          <w:hyperlink w:anchor="_Toc243674822" w:history="1">
             <w:r>
               <w:rPr>
                 <w:rStyle w:val="ab"/>
@@ -5687,7 +5687,7 @@
                 <w:noProof/>
                 <w:webHidden/>
               </w:rPr>
-              <w:instrText>PAGEREF _Toc243673206 \h</w:instrText>
+              <w:instrText>PAGEREF _Toc243674822 \h</w:instrText>
             </w:r>
             <w:r>
               <w:rPr>
@@ -5743,7 +5743,7 @@
               <w14:ligatures w14:val="standardContextual"/>
             </w:rPr>
           </w:pPr>
-          <w:hyperlink w:anchor="_Toc243673207" w:history="1">
+          <w:hyperlink w:anchor="_Toc243674823" w:history="1">
             <w:r>
               <w:rPr>
                 <w:rStyle w:val="ab"/>
@@ -5789,7 +5789,7 @@
                 <w:noProof/>
                 <w:webHidden/>
               </w:rPr>
-              <w:instrText>PAGEREF _Toc243673207 \h</w:instrText>
+              <w:instrText>PAGEREF _Toc243674823 \h</w:instrText>
             </w:r>
             <w:r>
               <w:rPr>
@@ -5845,7 +5845,7 @@
               <w14:ligatures w14:val="standardContextual"/>
             </w:rPr>
           </w:pPr>
-          <w:hyperlink w:anchor="_Toc243673208" w:history="1">
+          <w:hyperlink w:anchor="_Toc243674824" w:history="1">
             <w:r>
               <w:rPr>
                 <w:rStyle w:val="ab"/>
@@ -5891,7 +5891,7 @@
                 <w:noProof/>
                 <w:webHidden/>
               </w:rPr>
-              <w:instrText>PAGEREF _Toc243673208 \h</w:instrText>
+              <w:instrText>PAGEREF _Toc243674824 \h</w:instrText>
             </w:r>
             <w:r>
               <w:rPr>
@@ -5947,7 +5947,7 @@
               <w14:ligatures w14:val="standardContextual"/>
             </w:rPr>
           </w:pPr>
-          <w:hyperlink w:anchor="_Toc243673209" w:history="1">
+          <w:hyperlink w:anchor="_Toc243674825" w:history="1">
             <w:r>
               <w:rPr>
                 <w:rStyle w:val="ab"/>
@@ -5993,7 +5993,7 @@
                 <w:noProof/>
                 <w:webHidden/>
               </w:rPr>
-              <w:instrText>PAGEREF _Toc243673209 \h</w:instrText>
+              <w:instrText>PAGEREF _Toc243674825 \h</w:instrText>
             </w:r>
             <w:r>
               <w:rPr>
@@ -6049,7 +6049,7 @@
               <w14:ligatures w14:val="standardContextual"/>
             </w:rPr>
           </w:pPr>
-          <w:hyperlink w:anchor="_Toc243673210" w:history="1">
+          <w:hyperlink w:anchor="_Toc243674826" w:history="1">
             <w:r>
               <w:rPr>
                 <w:rStyle w:val="ab"/>
@@ -6111,7 +6111,7 @@
                 <w:noProof/>
                 <w:webHidden/>
               </w:rPr>
-              <w:instrText>PAGEREF _Toc243673210 \h</w:instrText>
+              <w:instrText>PAGEREF _Toc243674826 \h</w:instrText>
             </w:r>
             <w:r>
               <w:rPr>
@@ -6167,7 +6167,7 @@
               <w14:ligatures w14:val="standardContextual"/>
             </w:rPr>
           </w:pPr>
-          <w:hyperlink w:anchor="_Toc243673211" w:history="1">
+          <w:hyperlink w:anchor="_Toc243674827" w:history="1">
             <w:r>
               <w:rPr>
                 <w:rStyle w:val="ab"/>
@@ -6213,7 +6213,7 @@
                 <w:noProof/>
                 <w:webHidden/>
               </w:rPr>
-              <w:instrText>PAGEREF _Toc243673211 \h</w:instrText>
+              <w:instrText>PAGEREF _Toc243674827 \h</w:instrText>
             </w:r>
             <w:r>
               <w:rPr>
@@ -6269,7 +6269,7 @@
               <w14:ligatures w14:val="standardContextual"/>
             </w:rPr>
           </w:pPr>
-          <w:hyperlink w:anchor="_Toc243673212" w:history="1">
+          <w:hyperlink w:anchor="_Toc243674828" w:history="1">
             <w:r>
               <w:rPr>
                 <w:rStyle w:val="ab"/>
@@ -6315,7 +6315,7 @@
                 <w:noProof/>
                 <w:webHidden/>
               </w:rPr>
-              <w:instrText>PAGEREF _Toc243673212 \h</w:instrText>
+              <w:instrText>PAGEREF _Toc243674828 \h</w:instrText>
             </w:r>
             <w:r>
               <w:rPr>
@@ -6371,7 +6371,7 @@
               <w14:ligatures w14:val="standardContextual"/>
             </w:rPr>
           </w:pPr>
-          <w:hyperlink w:anchor="_Toc243673213" w:history="1">
+          <w:hyperlink w:anchor="_Toc243674829" w:history="1">
             <w:r>
               <w:rPr>
                 <w:rStyle w:val="ab"/>
@@ -6417,7 +6417,7 @@
                 <w:noProof/>
                 <w:webHidden/>
               </w:rPr>
-              <w:instrText>PAGEREF _Toc243673213 \h</w:instrText>
+              <w:instrText>PAGEREF _Toc243674829 \h</w:instrText>
             </w:r>
             <w:r>
               <w:rPr>
@@ -6473,7 +6473,7 @@
               <w14:ligatures w14:val="standardContextual"/>
             </w:rPr>
           </w:pPr>
-          <w:hyperlink w:anchor="_Toc243673214" w:history="1">
+          <w:hyperlink w:anchor="_Toc243674830" w:history="1">
             <w:r>
               <w:rPr>
                 <w:rStyle w:val="ab"/>
@@ -6519,7 +6519,7 @@
                 <w:noProof/>
                 <w:webHidden/>
               </w:rPr>
-              <w:instrText>PAGEREF _Toc243673214 \h</w:instrText>
+              <w:instrText>PAGEREF _Toc243674830 \h</w:instrText>
             </w:r>
             <w:r>
               <w:rPr>
@@ -6575,7 +6575,7 @@
               <w14:ligatures w14:val="standardContextual"/>
             </w:rPr>
           </w:pPr>
-          <w:hyperlink w:anchor="_Toc243673215" w:history="1">
+          <w:hyperlink w:anchor="_Toc243674831" w:history="1">
             <w:r>
               <w:rPr>
                 <w:rStyle w:val="ab"/>
@@ -6637,7 +6637,7 @@
                 <w:noProof/>
                 <w:webHidden/>
               </w:rPr>
-              <w:instrText>PAGEREF _Toc243673215 \h</w:instrText>
+              <w:instrText>PAGEREF _Toc243674831 \h</w:instrText>
             </w:r>
             <w:r>
               <w:rPr>
@@ -6693,7 +6693,7 @@
               <w14:ligatures w14:val="standardContextual"/>
             </w:rPr>
           </w:pPr>
-          <w:hyperlink w:anchor="_Toc243673216" w:history="1">
+          <w:hyperlink w:anchor="_Toc243674832" w:history="1">
             <w:r>
               <w:rPr>
                 <w:rStyle w:val="ab"/>
@@ -6739,7 +6739,7 @@
                 <w:noProof/>
                 <w:webHidden/>
               </w:rPr>
-              <w:instrText>PAGEREF _Toc243673216 \h</w:instrText>
+              <w:instrText>PAGEREF _Toc243674832 \h</w:instrText>
             </w:r>
             <w:r>
               <w:rPr>
@@ -6795,7 +6795,7 @@
               <w14:ligatures w14:val="standardContextual"/>
             </w:rPr>
           </w:pPr>
-          <w:hyperlink w:anchor="_Toc243673217" w:history="1">
+          <w:hyperlink w:anchor="_Toc243674833" w:history="1">
             <w:r>
               <w:rPr>
                 <w:rStyle w:val="ab"/>
@@ -6857,7 +6857,7 @@
                 <w:noProof/>
                 <w:webHidden/>
               </w:rPr>
-              <w:instrText>PAGEREF _Toc243673217 \h</w:instrText>
+              <w:instrText>PAGEREF _Toc243674833 \h</w:instrText>
             </w:r>
             <w:r>
               <w:rPr>
@@ -6913,7 +6913,7 @@
               <w14:ligatures w14:val="standardContextual"/>
             </w:rPr>
           </w:pPr>
-          <w:hyperlink w:anchor="_Toc243673218" w:history="1">
+          <w:hyperlink w:anchor="_Toc243674834" w:history="1">
             <w:r>
               <w:rPr>
                 <w:rStyle w:val="ab"/>
@@ -6959,7 +6959,7 @@
                 <w:noProof/>
                 <w:webHidden/>
               </w:rPr>
-              <w:instrText>PAGEREF _Toc243673218 \h</w:instrText>
+              <w:instrText>PAGEREF _Toc243674834 \h</w:instrText>
             </w:r>
             <w:r>
               <w:rPr>
@@ -7015,7 +7015,7 @@
               <w14:ligatures w14:val="standardContextual"/>
             </w:rPr>
           </w:pPr>
-          <w:hyperlink w:anchor="_Toc243673219" w:history="1">
+          <w:hyperlink w:anchor="_Toc243674835" w:history="1">
             <w:r>
               <w:rPr>
                 <w:rStyle w:val="ab"/>
@@ -7061,7 +7061,7 @@
                 <w:noProof/>
                 <w:webHidden/>
               </w:rPr>
-              <w:instrText>PAGEREF _Toc243673219 \h</w:instrText>
+              <w:instrText>PAGEREF _Toc243674835 \h</w:instrText>
             </w:r>
             <w:r>
               <w:rPr>
@@ -7117,7 +7117,7 @@
               <w14:ligatures w14:val="standardContextual"/>
             </w:rPr>
           </w:pPr>
-          <w:hyperlink w:anchor="_Toc243673220" w:history="1">
+          <w:hyperlink w:anchor="_Toc243674836" w:history="1">
             <w:r>
               <w:rPr>
                 <w:rStyle w:val="ab"/>
@@ -7163,7 +7163,7 @@
                 <w:noProof/>
                 <w:webHidden/>
               </w:rPr>
-              <w:instrText>PAGEREF _Toc243673220 \h</w:instrText>
+              <w:instrText>PAGEREF _Toc243674836 \h</w:instrText>
             </w:r>
             <w:r>
               <w:rPr>
@@ -7219,7 +7219,7 @@
               <w14:ligatures w14:val="standardContextual"/>
             </w:rPr>
           </w:pPr>
-          <w:hyperlink w:anchor="_Toc243673221" w:history="1">
+          <w:hyperlink w:anchor="_Toc243674837" w:history="1">
             <w:r>
               <w:rPr>
                 <w:rStyle w:val="ab"/>
@@ -7265,7 +7265,7 @@
                 <w:noProof/>
                 <w:webHidden/>
               </w:rPr>
-              <w:instrText>PAGEREF _Toc243673221 \h</w:instrText>
+              <w:instrText>PAGEREF _Toc243674837 \h</w:instrText>
             </w:r>
             <w:r>
               <w:rPr>
@@ -7321,7 +7321,7 @@
               <w14:ligatures w14:val="standardContextual"/>
             </w:rPr>
           </w:pPr>
-          <w:hyperlink w:anchor="_Toc243673222" w:history="1">
+          <w:hyperlink w:anchor="_Toc243674838" w:history="1">
             <w:r>
               <w:rPr>
                 <w:rStyle w:val="ab"/>
@@ -7359,7 +7359,7 @@
                 <w:noProof/>
                 <w:webHidden/>
               </w:rPr>
-              <w:instrText>PAGEREF _Toc243673222 \h</w:instrText>
+              <w:instrText>PAGEREF _Toc243674838 \h</w:instrText>
             </w:r>
             <w:r>
               <w:rPr>
@@ -7415,7 +7415,7 @@
               <w14:ligatures w14:val="standardContextual"/>
             </w:rPr>
           </w:pPr>
-          <w:hyperlink w:anchor="_Toc243673223" w:history="1">
+          <w:hyperlink w:anchor="_Toc243674839" w:history="1">
             <w:r>
               <w:rPr>
                 <w:rStyle w:val="ab"/>
@@ -7478,7 +7478,7 @@
                 <w:noProof/>
                 <w:webHidden/>
               </w:rPr>
-              <w:instrText>PAGEREF _Toc243673223 \h</w:instrText>
+              <w:instrText>PAGEREF _Toc243674839 \h</w:instrText>
             </w:r>
             <w:r>
               <w:rPr>
@@ -7549,7 +7549,7 @@
         <w:spacing w:before="46" w:after="46" w:line="240" w:lineRule="auto"/>
         <w:jc w:val="left"/>
       </w:pPr>
-      <w:bookmarkStart w:id="0" w:name="_Toc243673169"/>
+      <w:bookmarkStart w:id="0" w:name="_Toc243674785"/>
       <w:r>
         <w:rPr>
           <w:rFonts w:eastAsia="黑体"/>
@@ -7573,7 +7573,7 @@
         <w:spacing w:before="46" w:after="46" w:line="240" w:lineRule="auto"/>
         <w:jc w:val="left"/>
       </w:pPr>
-      <w:bookmarkStart w:id="1" w:name="_Toc243673170"/>
+      <w:bookmarkStart w:id="1" w:name="_Toc243674786"/>
       <w:r>
         <w:rPr>
           <w:rFonts w:ascii="Times New Roman" w:eastAsia="黑体" w:hAnsi="Times New Roman" w:cs="Times New Roman"/>
@@ -7706,7 +7706,7 @@
         <w:spacing w:before="46" w:after="46" w:line="240" w:lineRule="auto"/>
         <w:jc w:val="left"/>
       </w:pPr>
-      <w:bookmarkStart w:id="2" w:name="_Toc243673171"/>
+      <w:bookmarkStart w:id="2" w:name="_Toc243674787"/>
       <w:r>
         <w:rPr>
           <w:rFonts w:ascii="Times New Roman" w:eastAsia="黑体" w:hAnsi="Times New Roman" w:cs="Times New Roman"/>
@@ -7854,7 +7854,7 @@
         <w:spacing w:before="46" w:after="46" w:line="240" w:lineRule="auto"/>
         <w:jc w:val="left"/>
       </w:pPr>
-      <w:bookmarkStart w:id="3" w:name="_Toc243673172"/>
+      <w:bookmarkStart w:id="3" w:name="_Toc243674788"/>
       <w:r>
         <w:rPr>
           <w:rFonts w:ascii="Times New Roman" w:eastAsia="黑体" w:hAnsi="Times New Roman" w:cs="Times New Roman"/>
@@ -8568,7 +8568,7 @@
         <w:spacing w:before="46" w:after="46" w:line="240" w:lineRule="auto"/>
         <w:jc w:val="left"/>
       </w:pPr>
-      <w:bookmarkStart w:id="4" w:name="_Toc243673173"/>
+      <w:bookmarkStart w:id="4" w:name="_Toc243674789"/>
       <w:r>
         <w:rPr>
           <w:rFonts w:ascii="Times New Roman" w:eastAsia="黑体" w:hAnsi="Times New Roman" w:cs="Times New Roman"/>
@@ -9310,7 +9310,7 @@
         <w:spacing w:before="46" w:after="46" w:line="240" w:lineRule="auto"/>
         <w:jc w:val="left"/>
       </w:pPr>
-      <w:bookmarkStart w:id="5" w:name="_Toc243673174"/>
+      <w:bookmarkStart w:id="5" w:name="_Toc243674790"/>
       <w:r>
         <w:rPr>
           <w:rFonts w:ascii="Times New Roman" w:eastAsia="黑体" w:hAnsi="Times New Roman" w:cs="Times New Roman"/>
@@ -9452,7 +9452,7 @@
         <w:spacing w:before="46" w:after="46" w:line="240" w:lineRule="auto"/>
         <w:jc w:val="left"/>
       </w:pPr>
-      <w:bookmarkStart w:id="6" w:name="_Toc243673175"/>
+      <w:bookmarkStart w:id="6" w:name="_Toc243674791"/>
       <w:r>
         <w:rPr>
           <w:rFonts w:eastAsia="黑体"/>
@@ -9475,7 +9475,7 @@
         <w:spacing w:before="46" w:after="46" w:line="240" w:lineRule="auto"/>
         <w:jc w:val="left"/>
       </w:pPr>
-      <w:bookmarkStart w:id="7" w:name="_Toc243673176"/>
+      <w:bookmarkStart w:id="7" w:name="_Toc243674792"/>
       <w:r>
         <w:rPr>
           <w:rFonts w:ascii="Times New Roman" w:eastAsia="黑体" w:hAnsi="Times New Roman" w:cs="Times New Roman"/>
@@ -9568,7 +9568,7 @@
         <w:spacing w:before="46" w:after="46" w:line="240" w:lineRule="auto"/>
         <w:jc w:val="left"/>
       </w:pPr>
-      <w:bookmarkStart w:id="8" w:name="_Toc243673177"/>
+      <w:bookmarkStart w:id="8" w:name="_Toc243674793"/>
       <w:r>
         <w:rPr>
           <w:rFonts w:ascii="Times New Roman" w:eastAsia="黑体" w:hAnsi="Times New Roman" w:cs="Times New Roman"/>
@@ -9591,7 +9591,7 @@
         <w:spacing w:line="240" w:lineRule="auto"/>
         <w:jc w:val="left"/>
       </w:pPr>
-      <w:bookmarkStart w:id="9" w:name="_Toc243673178"/>
+      <w:bookmarkStart w:id="9" w:name="_Toc243674794"/>
       <w:r>
         <w:rPr>
           <w:rFonts w:eastAsia="黑体"/>
@@ -9673,7 +9673,7 @@
           <w:noProof/>
         </w:rPr>
         <w:drawing>
-          <wp:inline distT="0" distB="0" distL="0" distR="0" wp14:anchorId="7FAAAAE4" wp14:editId="516AE6BC">
+          <wp:inline distT="0" distB="0" distL="0" distR="0" wp14:anchorId="2BEEE5F7" wp14:editId="06F8F76C">
             <wp:extent cx="5486400" cy="3713018"/>
             <wp:effectExtent l="0" t="0" r="0" b="0"/>
             <wp:docPr id="2" name="Picture 2"/>
@@ -9841,7 +9841,7 @@
         <w:spacing w:line="240" w:lineRule="auto"/>
         <w:jc w:val="left"/>
       </w:pPr>
-      <w:bookmarkStart w:id="10" w:name="_Toc243673179"/>
+      <w:bookmarkStart w:id="10" w:name="_Toc243674795"/>
       <w:r>
         <w:rPr>
           <w:rFonts w:eastAsia="黑体"/>
@@ -9904,7 +9904,7 @@
         <w:spacing w:line="240" w:lineRule="auto"/>
         <w:jc w:val="left"/>
       </w:pPr>
-      <w:bookmarkStart w:id="11" w:name="_Toc243673180"/>
+      <w:bookmarkStart w:id="11" w:name="_Toc243674796"/>
       <w:r>
         <w:rPr>
           <w:rFonts w:eastAsia="黑体"/>
@@ -10575,7 +10575,7 @@
         <w:spacing w:before="46" w:after="46" w:line="240" w:lineRule="auto"/>
         <w:jc w:val="left"/>
       </w:pPr>
-      <w:bookmarkStart w:id="12" w:name="_Toc243673181"/>
+      <w:bookmarkStart w:id="12" w:name="_Toc243674797"/>
       <w:r>
         <w:rPr>
           <w:rFonts w:eastAsia="黑体"/>
@@ -10598,7 +10598,7 @@
         <w:spacing w:before="46" w:after="46" w:line="240" w:lineRule="auto"/>
         <w:jc w:val="left"/>
       </w:pPr>
-      <w:bookmarkStart w:id="13" w:name="_Toc243673182"/>
+      <w:bookmarkStart w:id="13" w:name="_Toc243674798"/>
       <w:r>
         <w:rPr>
           <w:rFonts w:ascii="Times New Roman" w:eastAsia="黑体" w:hAnsi="Times New Roman" w:cs="Times New Roman"/>
@@ -10687,7 +10687,7 @@
         <w:spacing w:before="46" w:after="46" w:line="240" w:lineRule="auto"/>
         <w:jc w:val="left"/>
       </w:pPr>
-      <w:bookmarkStart w:id="14" w:name="_Toc243673183"/>
+      <w:bookmarkStart w:id="14" w:name="_Toc243674799"/>
       <w:r>
         <w:rPr>
           <w:rFonts w:ascii="Times New Roman" w:eastAsia="黑体" w:hAnsi="Times New Roman" w:cs="Times New Roman"/>
@@ -10711,7 +10711,7 @@
         <w:spacing w:line="240" w:lineRule="auto"/>
         <w:jc w:val="left"/>
       </w:pPr>
-      <w:bookmarkStart w:id="15" w:name="_Toc243673184"/>
+      <w:bookmarkStart w:id="15" w:name="_Toc243674800"/>
       <w:r>
         <w:rPr>
           <w:rFonts w:eastAsia="黑体"/>
@@ -11205,7 +11205,7 @@
         <w:spacing w:line="240" w:lineRule="auto"/>
         <w:jc w:val="left"/>
       </w:pPr>
-      <w:bookmarkStart w:id="16" w:name="_Toc243673185"/>
+      <w:bookmarkStart w:id="16" w:name="_Toc243674801"/>
       <w:r>
         <w:rPr>
           <w:rFonts w:eastAsia="黑体"/>
@@ -11254,7 +11254,7 @@
           <w:noProof/>
         </w:rPr>
         <w:drawing>
-          <wp:inline distT="0" distB="0" distL="0" distR="0" wp14:anchorId="0D22A885" wp14:editId="05A7B137">
+          <wp:inline distT="0" distB="0" distL="0" distR="0" wp14:anchorId="183890AD" wp14:editId="4D12F74B">
             <wp:extent cx="5486400" cy="3380509"/>
             <wp:effectExtent l="0" t="0" r="0" b="0"/>
             <wp:docPr id="3" name="Picture 3"/>
@@ -11354,7 +11354,7 @@
         <w:spacing w:line="240" w:lineRule="auto"/>
         <w:jc w:val="left"/>
       </w:pPr>
-      <w:bookmarkStart w:id="17" w:name="_Toc243673186"/>
+      <w:bookmarkStart w:id="17" w:name="_Toc243674802"/>
       <w:r>
         <w:rPr>
           <w:rFonts w:eastAsia="黑体"/>
@@ -11465,7 +11465,7 @@
         <w:spacing w:before="46" w:after="46" w:line="240" w:lineRule="auto"/>
         <w:jc w:val="left"/>
       </w:pPr>
-      <w:bookmarkStart w:id="18" w:name="_Toc243673187"/>
+      <w:bookmarkStart w:id="18" w:name="_Toc243674803"/>
       <w:r>
         <w:rPr>
           <w:rFonts w:eastAsia="黑体"/>
@@ -11488,7 +11488,7 @@
         <w:spacing w:before="46" w:after="46" w:line="240" w:lineRule="auto"/>
         <w:jc w:val="left"/>
       </w:pPr>
-      <w:bookmarkStart w:id="19" w:name="_Toc243673188"/>
+      <w:bookmarkStart w:id="19" w:name="_Toc243674804"/>
       <w:r>
         <w:rPr>
           <w:rFonts w:ascii="Times New Roman" w:eastAsia="黑体" w:hAnsi="Times New Roman" w:cs="Times New Roman"/>
@@ -11565,7 +11565,7 @@
         <w:spacing w:before="46" w:after="46" w:line="240" w:lineRule="auto"/>
         <w:jc w:val="left"/>
       </w:pPr>
-      <w:bookmarkStart w:id="20" w:name="_Toc243673189"/>
+      <w:bookmarkStart w:id="20" w:name="_Toc243674805"/>
       <w:r>
         <w:rPr>
           <w:rFonts w:ascii="Times New Roman" w:eastAsia="黑体" w:hAnsi="Times New Roman" w:cs="Times New Roman"/>
@@ -11588,7 +11588,7 @@
         <w:spacing w:line="240" w:lineRule="auto"/>
         <w:jc w:val="left"/>
       </w:pPr>
-      <w:bookmarkStart w:id="21" w:name="_Toc243673190"/>
+      <w:bookmarkStart w:id="21" w:name="_Toc243674806"/>
       <w:r>
         <w:rPr>
           <w:rFonts w:eastAsia="黑体"/>
@@ -12457,7 +12457,7 @@
         <w:spacing w:line="240" w:lineRule="auto"/>
         <w:jc w:val="left"/>
       </w:pPr>
-      <w:bookmarkStart w:id="22" w:name="_Toc243673191"/>
+      <w:bookmarkStart w:id="22" w:name="_Toc243674807"/>
       <w:r>
         <w:rPr>
           <w:rFonts w:eastAsia="黑体"/>
@@ -12500,7 +12500,7 @@
           <w:noProof/>
         </w:rPr>
         <w:drawing>
-          <wp:inline distT="0" distB="0" distL="0" distR="0" wp14:anchorId="0D46359E" wp14:editId="5983AF6F">
+          <wp:inline distT="0" distB="0" distL="0" distR="0" wp14:anchorId="6BA5C5CB" wp14:editId="51A1FCDF">
             <wp:extent cx="5486400" cy="3546764"/>
             <wp:effectExtent l="0" t="0" r="0" b="0"/>
             <wp:docPr id="4" name="Picture 4"/>
@@ -12618,7 +12618,7 @@
         <w:spacing w:line="240" w:lineRule="auto"/>
         <w:jc w:val="left"/>
       </w:pPr>
-      <w:bookmarkStart w:id="23" w:name="_Toc243673192"/>
+      <w:bookmarkStart w:id="23" w:name="_Toc243674808"/>
       <w:r>
         <w:rPr>
           <w:rFonts w:eastAsia="黑体"/>
@@ -12768,7 +12768,7 @@
         <w:spacing w:before="46" w:after="46" w:line="240" w:lineRule="auto"/>
         <w:jc w:val="left"/>
       </w:pPr>
-      <w:bookmarkStart w:id="24" w:name="_Toc243673193"/>
+      <w:bookmarkStart w:id="24" w:name="_Toc243674809"/>
       <w:r>
         <w:rPr>
           <w:rFonts w:eastAsia="黑体"/>
@@ -12791,7 +12791,7 @@
         <w:spacing w:before="46" w:after="46" w:line="240" w:lineRule="auto"/>
         <w:jc w:val="left"/>
       </w:pPr>
-      <w:bookmarkStart w:id="25" w:name="_Toc243673194"/>
+      <w:bookmarkStart w:id="25" w:name="_Toc243674810"/>
       <w:r>
         <w:rPr>
           <w:rFonts w:ascii="Times New Roman" w:eastAsia="黑体" w:hAnsi="Times New Roman" w:cs="Times New Roman"/>
@@ -12874,7 +12874,7 @@
         <w:spacing w:before="46" w:after="46" w:line="240" w:lineRule="auto"/>
         <w:jc w:val="left"/>
       </w:pPr>
-      <w:bookmarkStart w:id="26" w:name="_Toc243673195"/>
+      <w:bookmarkStart w:id="26" w:name="_Toc243674811"/>
       <w:r>
         <w:rPr>
           <w:rFonts w:ascii="Times New Roman" w:eastAsia="黑体" w:hAnsi="Times New Roman" w:cs="Times New Roman"/>
@@ -12897,7 +12897,7 @@
         <w:spacing w:line="240" w:lineRule="auto"/>
         <w:jc w:val="left"/>
       </w:pPr>
-      <w:bookmarkStart w:id="27" w:name="_Toc243673196"/>
+      <w:bookmarkStart w:id="27" w:name="_Toc243674812"/>
       <w:r>
         <w:rPr>
           <w:rFonts w:eastAsia="黑体"/>
@@ -13003,7 +13003,7 @@
         <w:spacing w:line="240" w:lineRule="auto"/>
         <w:jc w:val="left"/>
       </w:pPr>
-      <w:bookmarkStart w:id="28" w:name="_Toc243673197"/>
+      <w:bookmarkStart w:id="28" w:name="_Toc243674813"/>
       <w:r>
         <w:rPr>
           <w:rFonts w:eastAsia="黑体"/>
@@ -13808,7 +13808,7 @@
         <w:spacing w:line="240" w:lineRule="auto"/>
         <w:jc w:val="left"/>
       </w:pPr>
-      <w:bookmarkStart w:id="29" w:name="_Toc243673198"/>
+      <w:bookmarkStart w:id="29" w:name="_Toc243674814"/>
       <w:r>
         <w:rPr>
           <w:rFonts w:eastAsia="黑体"/>
@@ -14031,7 +14031,7 @@
         <w:spacing w:before="46" w:after="46" w:line="240" w:lineRule="auto"/>
         <w:jc w:val="left"/>
       </w:pPr>
-      <w:bookmarkStart w:id="30" w:name="_Toc243673199"/>
+      <w:bookmarkStart w:id="30" w:name="_Toc243674815"/>
       <w:r>
         <w:rPr>
           <w:rFonts w:eastAsia="黑体"/>
@@ -14054,7 +14054,7 @@
         <w:spacing w:before="46" w:after="46" w:line="240" w:lineRule="auto"/>
         <w:jc w:val="left"/>
       </w:pPr>
-      <w:bookmarkStart w:id="31" w:name="_Toc243673200"/>
+      <w:bookmarkStart w:id="31" w:name="_Toc243674816"/>
       <w:r>
         <w:rPr>
           <w:rFonts w:ascii="Times New Roman" w:eastAsia="黑体" w:hAnsi="Times New Roman" w:cs="Times New Roman"/>
@@ -14131,7 +14131,7 @@
         <w:spacing w:before="46" w:after="46" w:line="240" w:lineRule="auto"/>
         <w:jc w:val="left"/>
       </w:pPr>
-      <w:bookmarkStart w:id="32" w:name="_Toc243673201"/>
+      <w:bookmarkStart w:id="32" w:name="_Toc243674817"/>
       <w:r>
         <w:rPr>
           <w:rFonts w:ascii="Times New Roman" w:eastAsia="黑体" w:hAnsi="Times New Roman" w:cs="Times New Roman"/>
@@ -14154,7 +14154,7 @@
         <w:spacing w:line="240" w:lineRule="auto"/>
         <w:jc w:val="left"/>
       </w:pPr>
-      <w:bookmarkStart w:id="33" w:name="_Toc243673202"/>
+      <w:bookmarkStart w:id="33" w:name="_Toc243674818"/>
       <w:r>
         <w:rPr>
           <w:rFonts w:eastAsia="黑体"/>
@@ -14241,7 +14241,7 @@
         </w:rPr>
         <w:lastRenderedPageBreak/>
         <w:drawing>
-          <wp:inline distT="0" distB="0" distL="0" distR="0" wp14:anchorId="2BEE28A4" wp14:editId="6A99E3F5">
+          <wp:inline distT="0" distB="0" distL="0" distR="0" wp14:anchorId="4E6EE83A" wp14:editId="0FCFE485">
             <wp:extent cx="5486400" cy="3560323"/>
             <wp:effectExtent l="0" t="0" r="0" b="0"/>
             <wp:docPr id="5" name="Picture 5"/>
@@ -14358,7 +14358,7 @@
         <w:spacing w:line="240" w:lineRule="auto"/>
         <w:jc w:val="left"/>
       </w:pPr>
-      <w:bookmarkStart w:id="34" w:name="_Toc243673203"/>
+      <w:bookmarkStart w:id="34" w:name="_Toc243674819"/>
       <w:r>
         <w:rPr>
           <w:rFonts w:eastAsia="黑体"/>
@@ -14390,7 +14390,7 @@
         <w:spacing w:line="240" w:lineRule="auto"/>
         <w:jc w:val="left"/>
       </w:pPr>
-      <w:bookmarkStart w:id="35" w:name="_Toc243673204"/>
+      <w:bookmarkStart w:id="35" w:name="_Toc243674820"/>
       <w:r>
         <w:rPr>
           <w:rFonts w:eastAsia="黑体"/>
@@ -15295,7 +15295,7 @@
         <w:spacing w:before="46" w:after="46" w:line="240" w:lineRule="auto"/>
         <w:jc w:val="left"/>
       </w:pPr>
-      <w:bookmarkStart w:id="36" w:name="_Toc243673205"/>
+      <w:bookmarkStart w:id="36" w:name="_Toc243674821"/>
       <w:r>
         <w:rPr>
           <w:rFonts w:eastAsia="黑体"/>
@@ -15318,7 +15318,7 @@
         <w:spacing w:before="46" w:after="46" w:line="240" w:lineRule="auto"/>
         <w:jc w:val="left"/>
       </w:pPr>
-      <w:bookmarkStart w:id="37" w:name="_Toc243673206"/>
+      <w:bookmarkStart w:id="37" w:name="_Toc243674822"/>
       <w:r>
         <w:rPr>
           <w:rFonts w:ascii="Times New Roman" w:eastAsia="黑体" w:hAnsi="Times New Roman" w:cs="Times New Roman"/>
@@ -15401,7 +15401,7 @@
         <w:spacing w:before="46" w:after="46" w:line="240" w:lineRule="auto"/>
         <w:jc w:val="left"/>
       </w:pPr>
-      <w:bookmarkStart w:id="38" w:name="_Toc243673207"/>
+      <w:bookmarkStart w:id="38" w:name="_Toc243674823"/>
       <w:r>
         <w:rPr>
           <w:rFonts w:ascii="Times New Roman" w:eastAsia="黑体" w:hAnsi="Times New Roman" w:cs="Times New Roman"/>
@@ -15424,7 +15424,7 @@
         <w:spacing w:line="240" w:lineRule="auto"/>
         <w:jc w:val="left"/>
       </w:pPr>
-      <w:bookmarkStart w:id="39" w:name="_Toc243673208"/>
+      <w:bookmarkStart w:id="39" w:name="_Toc243674824"/>
       <w:r>
         <w:rPr>
           <w:rFonts w:eastAsia="黑体"/>
@@ -16213,7 +16213,7 @@
         <w:spacing w:line="240" w:lineRule="auto"/>
         <w:jc w:val="left"/>
       </w:pPr>
-      <w:bookmarkStart w:id="40" w:name="_Toc243673209"/>
+      <w:bookmarkStart w:id="40" w:name="_Toc243674825"/>
       <w:r>
         <w:rPr>
           <w:rFonts w:eastAsia="黑体"/>
@@ -16269,7 +16269,7 @@
         </w:rPr>
         <w:lastRenderedPageBreak/>
         <w:drawing>
-          <wp:inline distT="0" distB="0" distL="0" distR="0" wp14:anchorId="2CCB19AD" wp14:editId="06A4DC5D">
+          <wp:inline distT="0" distB="0" distL="0" distR="0" wp14:anchorId="357E87ED" wp14:editId="52315F1F">
             <wp:extent cx="5486400" cy="3380509"/>
             <wp:effectExtent l="0" t="0" r="0" b="0"/>
             <wp:docPr id="6" name="Picture 6"/>
@@ -16377,7 +16377,7 @@
         <w:spacing w:line="240" w:lineRule="auto"/>
         <w:jc w:val="left"/>
       </w:pPr>
-      <w:bookmarkStart w:id="41" w:name="_Toc243673210"/>
+      <w:bookmarkStart w:id="41" w:name="_Toc243674826"/>
       <w:r>
         <w:rPr>
           <w:rFonts w:eastAsia="黑体"/>
@@ -16597,7 +16597,7 @@
         <w:spacing w:before="46" w:after="46" w:line="240" w:lineRule="auto"/>
         <w:jc w:val="left"/>
       </w:pPr>
-      <w:bookmarkStart w:id="42" w:name="_Toc243673211"/>
+      <w:bookmarkStart w:id="42" w:name="_Toc243674827"/>
       <w:r>
         <w:rPr>
           <w:rFonts w:eastAsia="黑体"/>
@@ -16620,7 +16620,7 @@
         <w:spacing w:before="46" w:after="46" w:line="240" w:lineRule="auto"/>
         <w:jc w:val="left"/>
       </w:pPr>
-      <w:bookmarkStart w:id="43" w:name="_Toc243673212"/>
+      <w:bookmarkStart w:id="43" w:name="_Toc243674828"/>
       <w:r>
         <w:rPr>
           <w:rFonts w:ascii="Times New Roman" w:eastAsia="黑体" w:hAnsi="Times New Roman" w:cs="Times New Roman"/>
@@ -16727,7 +16727,7 @@
         <w:spacing w:before="46" w:after="46" w:line="240" w:lineRule="auto"/>
         <w:jc w:val="left"/>
       </w:pPr>
-      <w:bookmarkStart w:id="44" w:name="_Toc243673213"/>
+      <w:bookmarkStart w:id="44" w:name="_Toc243674829"/>
       <w:r>
         <w:rPr>
           <w:rFonts w:ascii="Times New Roman" w:eastAsia="黑体" w:hAnsi="Times New Roman" w:cs="Times New Roman"/>
@@ -16750,7 +16750,7 @@
         <w:spacing w:line="240" w:lineRule="auto"/>
         <w:jc w:val="left"/>
       </w:pPr>
-      <w:bookmarkStart w:id="45" w:name="_Toc243673214"/>
+      <w:bookmarkStart w:id="45" w:name="_Toc243674830"/>
       <w:r>
         <w:rPr>
           <w:rFonts w:eastAsia="黑体"/>
@@ -16840,7 +16840,7 @@
         <w:spacing w:line="240" w:lineRule="auto"/>
         <w:jc w:val="left"/>
       </w:pPr>
-      <w:bookmarkStart w:id="46" w:name="_Toc243673215"/>
+      <w:bookmarkStart w:id="46" w:name="_Toc243674831"/>
       <w:r>
         <w:rPr>
           <w:rFonts w:eastAsia="黑体"/>
@@ -16898,7 +16898,7 @@
         </w:rPr>
         <w:lastRenderedPageBreak/>
         <w:drawing>
-          <wp:inline distT="0" distB="0" distL="0" distR="0" wp14:anchorId="7DA69F71" wp14:editId="7C3FB313">
+          <wp:inline distT="0" distB="0" distL="0" distR="0" wp14:anchorId="4B1B01CD" wp14:editId="6620F1A2">
             <wp:extent cx="5486400" cy="3450210"/>
             <wp:effectExtent l="0" t="0" r="0" b="0"/>
             <wp:docPr id="7" name="Picture 7"/>
@@ -17737,7 +17737,7 @@
         <w:spacing w:line="240" w:lineRule="auto"/>
         <w:jc w:val="left"/>
       </w:pPr>
-      <w:bookmarkStart w:id="47" w:name="_Toc243673216"/>
+      <w:bookmarkStart w:id="47" w:name="_Toc243674832"/>
       <w:r>
         <w:rPr>
           <w:rFonts w:eastAsia="黑体"/>
@@ -17830,7 +17830,7 @@
         <w:spacing w:line="240" w:lineRule="auto"/>
         <w:jc w:val="left"/>
       </w:pPr>
-      <w:bookmarkStart w:id="48" w:name="_Toc243673217"/>
+      <w:bookmarkStart w:id="48" w:name="_Toc243674833"/>
       <w:r>
         <w:rPr>
           <w:rFonts w:eastAsia="黑体"/>
@@ -18185,7 +18185,7 @@
         <w:spacing w:before="46" w:after="46" w:line="240" w:lineRule="auto"/>
         <w:jc w:val="left"/>
       </w:pPr>
-      <w:bookmarkStart w:id="49" w:name="_Toc243673218"/>
+      <w:bookmarkStart w:id="49" w:name="_Toc243674834"/>
       <w:r>
         <w:rPr>
           <w:rFonts w:eastAsia="黑体"/>
@@ -18208,7 +18208,7 @@
         <w:spacing w:before="46" w:after="46" w:line="240" w:lineRule="auto"/>
         <w:jc w:val="left"/>
       </w:pPr>
-      <w:bookmarkStart w:id="50" w:name="_Toc243673219"/>
+      <w:bookmarkStart w:id="50" w:name="_Toc243674835"/>
       <w:r>
         <w:rPr>
           <w:rFonts w:ascii="Times New Roman" w:eastAsia="黑体" w:hAnsi="Times New Roman" w:cs="Times New Roman"/>
@@ -19239,7 +19239,7 @@
         <w:spacing w:before="46" w:after="46" w:line="240" w:lineRule="auto"/>
         <w:jc w:val="left"/>
       </w:pPr>
-      <w:bookmarkStart w:id="51" w:name="_Toc243673220"/>
+      <w:bookmarkStart w:id="51" w:name="_Toc243674836"/>
       <w:r>
         <w:rPr>
           <w:rFonts w:ascii="Times New Roman" w:eastAsia="黑体" w:hAnsi="Times New Roman" w:cs="Times New Roman"/>
@@ -19356,7 +19356,7 @@
         <w:spacing w:before="46" w:after="46" w:line="240" w:lineRule="auto"/>
         <w:jc w:val="left"/>
       </w:pPr>
-      <w:bookmarkStart w:id="52" w:name="_Toc243673221"/>
+      <w:bookmarkStart w:id="52" w:name="_Toc243674837"/>
       <w:r>
         <w:rPr>
           <w:rFonts w:ascii="Times New Roman" w:eastAsia="黑体" w:hAnsi="Times New Roman" w:cs="Times New Roman"/>
@@ -19485,7 +19485,7 @@
         <w:spacing w:before="46" w:after="46" w:line="240" w:lineRule="auto"/>
         <w:jc w:val="left"/>
       </w:pPr>
-      <w:bookmarkStart w:id="53" w:name="_Toc243673222"/>
+      <w:bookmarkStart w:id="53" w:name="_Toc243674838"/>
       <w:r>
         <w:rPr>
           <w:rFonts w:eastAsia="黑体"/>
@@ -19755,7 +19755,7 @@
           <w:szCs w:val="28"/>
         </w:rPr>
       </w:pPr>
-      <w:bookmarkStart w:id="54" w:name="_Toc243673223"/>
+      <w:bookmarkStart w:id="54" w:name="_Toc243674839"/>
       <w:r>
         <w:rPr>
           <w:rFonts w:eastAsia="仿宋" w:hint="eastAsia"/>

</xml_diff>